<commit_message>
docs(golden-fur): reconcile Architectural-Change-History backlog
Backlog updates captured before session 76 — the staff-concurrency and
Hotel care-instructions items this session implements, plus minor image
reordering.

Co-Authored-By: Claude Sonnet 5 <noreply@anthropic.com>
</commit_message>
<xml_diff>
--- a/Projects/golden-fur/shared/context/Architectural-Change-History.docx
+++ b/Projects/golden-fur/shared/context/Architectural-Change-History.docx
@@ -41,7 +41,7 @@
           <w:pgNumType w:start="1"/>
         </w:sectPr>
       </w:pPr>
-      <w:bookmarkStart w:colFirst="0" w:colLast="0" w:name="_1nmxwwthvmvd" w:id="0"/>
+      <w:bookmarkStart w:colFirst="0" w:colLast="0" w:name="_47a6hokil3u6" w:id="0"/>
       <w:bookmarkEnd w:id="0"/>
       <w:r>
         <w:rPr>
@@ -121,7 +121,7 @@
           <w:pgNumType w:start="1"/>
         </w:sectPr>
       </w:pPr>
-      <w:bookmarkStart w:colFirst="0" w:colLast="0" w:name="_b8zr6glver8w" w:id="1"/>
+      <w:bookmarkStart w:colFirst="0" w:colLast="0" w:name="_8hw3qkujl9gu" w:id="1"/>
       <w:bookmarkEnd w:id="1"/>
       <w:r>
         <w:rPr>
@@ -216,7 +216,7 @@
             <w:sdt>
               <w:sdtPr>
                 <w:alias w:val="Project status"/>
-                <w:id w:val="1645905187"/>
+                <w:id w:val="-1287402599"/>
                 <w:dropDownList w:lastValue="Not Started">
                   <w:listItem w:displayText="Not Started" w:value="Not Started"/>
                   <w:listItem w:displayText="Blocked" w:value="Blocked"/>
@@ -291,7 +291,7 @@
             <w:sdt>
               <w:sdtPr>
                 <w:alias w:val="Assignee"/>
-                <w:id w:val="798309295"/>
+                <w:id w:val="1431134177"/>
                 <w:dropDownList w:lastValue="James">
                   <w:listItem w:displayText="None" w:value="None"/>
                   <w:listItem w:displayText="Alarie" w:value="Alarie"/>
@@ -342,7 +342,7 @@
             <w:sdt>
               <w:sdtPr>
                 <w:alias w:val="Project status"/>
-                <w:id w:val="-1289520134"/>
+                <w:id w:val="1688845691"/>
                 <w:dropDownList w:lastValue="Not Started">
                   <w:listItem w:displayText="Not Started" w:value="Not Started"/>
                   <w:listItem w:displayText="Blocked" w:value="Blocked"/>
@@ -380,7 +380,7 @@
               <w:keepLines w:val="1"/>
               <w:numPr>
                 <w:ilvl w:val="0"/>
-                <w:numId w:val="79"/>
+                <w:numId w:val="78"/>
               </w:numPr>
               <w:spacing w:after="0" w:afterAutospacing="0" w:before="240" w:lineRule="auto"/>
               <w:ind w:left="720" w:hanging="360"/>
@@ -406,7 +406,7 @@
               <w:keepLines w:val="1"/>
               <w:numPr>
                 <w:ilvl w:val="1"/>
-                <w:numId w:val="79"/>
+                <w:numId w:val="78"/>
               </w:numPr>
               <w:spacing w:after="0" w:afterAutospacing="0" w:before="0" w:beforeAutospacing="0" w:lineRule="auto"/>
               <w:ind w:left="1440" w:hanging="360"/>
@@ -432,7 +432,7 @@
               <w:keepLines w:val="1"/>
               <w:numPr>
                 <w:ilvl w:val="1"/>
-                <w:numId w:val="79"/>
+                <w:numId w:val="78"/>
               </w:numPr>
               <w:spacing w:after="0" w:afterAutospacing="0" w:before="0" w:beforeAutospacing="0" w:lineRule="auto"/>
               <w:ind w:left="1440" w:hanging="360"/>
@@ -458,7 +458,7 @@
               <w:keepLines w:val="1"/>
               <w:numPr>
                 <w:ilvl w:val="1"/>
-                <w:numId w:val="79"/>
+                <w:numId w:val="78"/>
               </w:numPr>
               <w:spacing w:after="240" w:before="0" w:beforeAutospacing="0" w:lineRule="auto"/>
               <w:ind w:left="1440" w:hanging="360"/>
@@ -495,7 +495,7 @@
             <w:sdt>
               <w:sdtPr>
                 <w:alias w:val="Assignee"/>
-                <w:id w:val="-696614046"/>
+                <w:id w:val="-1300270756"/>
                 <w:dropDownList w:lastValue="Matthew">
                   <w:listItem w:displayText="None" w:value="None"/>
                   <w:listItem w:displayText="Alarie" w:value="Alarie"/>
@@ -546,7 +546,7 @@
             <w:sdt>
               <w:sdtPr>
                 <w:alias w:val="Project status"/>
-                <w:id w:val="1082501487"/>
+                <w:id w:val="-1095092543"/>
                 <w:dropDownList w:lastValue="Not Started">
                   <w:listItem w:displayText="Not Started" w:value="Not Started"/>
                   <w:listItem w:displayText="Blocked" w:value="Blocked"/>
@@ -584,7 +584,7 @@
               <w:keepLines w:val="1"/>
               <w:numPr>
                 <w:ilvl w:val="0"/>
-                <w:numId w:val="80"/>
+                <w:numId w:val="79"/>
               </w:numPr>
               <w:spacing w:after="0" w:afterAutospacing="0" w:before="240" w:line="240" w:lineRule="auto"/>
               <w:ind w:left="720" w:hanging="360"/>
@@ -610,7 +610,7 @@
               <w:keepLines w:val="1"/>
               <w:numPr>
                 <w:ilvl w:val="1"/>
-                <w:numId w:val="80"/>
+                <w:numId w:val="79"/>
               </w:numPr>
               <w:spacing w:after="0" w:afterAutospacing="0" w:before="0" w:beforeAutospacing="0" w:line="240" w:lineRule="auto"/>
               <w:ind w:left="1440" w:hanging="360"/>
@@ -636,7 +636,7 @@
               <w:keepLines w:val="1"/>
               <w:numPr>
                 <w:ilvl w:val="1"/>
-                <w:numId w:val="80"/>
+                <w:numId w:val="79"/>
               </w:numPr>
               <w:spacing w:after="240" w:before="0" w:beforeAutospacing="0" w:line="240" w:lineRule="auto"/>
               <w:ind w:left="1440" w:hanging="360"/>
@@ -656,12 +656,12 @@
                 <wp:inline distB="114300" distT="114300" distL="114300" distR="114300">
                   <wp:extent cx="2998773" cy="1416743"/>
                   <wp:effectExtent b="0" l="0" r="0" t="0"/>
-                  <wp:docPr id="6" name="image9.png"/>
+                  <wp:docPr id="7" name="image12.png"/>
                   <a:graphic>
                     <a:graphicData uri="http://schemas.openxmlformats.org/drawingml/2006/picture">
                       <pic:pic>
                         <pic:nvPicPr>
-                          <pic:cNvPr id="0" name="image9.png"/>
+                          <pic:cNvPr id="0" name="image12.png"/>
                           <pic:cNvPicPr preferRelativeResize="0"/>
                         </pic:nvPicPr>
                         <pic:blipFill>
@@ -708,7 +708,7 @@
             <w:sdt>
               <w:sdtPr>
                 <w:alias w:val="Assignee"/>
-                <w:id w:val="-562899123"/>
+                <w:id w:val="2032983559"/>
                 <w:dropDownList w:lastValue="James">
                   <w:listItem w:displayText="None" w:value="None"/>
                   <w:listItem w:displayText="Alarie" w:value="Alarie"/>
@@ -759,7 +759,7 @@
             <w:sdt>
               <w:sdtPr>
                 <w:alias w:val="Project status"/>
-                <w:id w:val="342498888"/>
+                <w:id w:val="1566244471"/>
                 <w:dropDownList w:lastValue="Not Started">
                   <w:listItem w:displayText="Not Started" w:value="Not Started"/>
                   <w:listItem w:displayText="Blocked" w:value="Blocked"/>
@@ -834,7 +834,7 @@
             <w:sdt>
               <w:sdtPr>
                 <w:alias w:val="Assignee"/>
-                <w:id w:val="-1629077040"/>
+                <w:id w:val="-186762144"/>
                 <w:dropDownList w:lastValue="James">
                   <w:listItem w:displayText="None" w:value="None"/>
                   <w:listItem w:displayText="Alarie" w:value="Alarie"/>
@@ -885,8 +885,8 @@
             <w:sdt>
               <w:sdtPr>
                 <w:alias w:val="Project status"/>
-                <w:id w:val="-973917131"/>
-                <w:dropDownList w:lastValue="Not Started">
+                <w:id w:val="1293074711"/>
+                <w:dropDownList w:lastValue="In Progress">
                   <w:listItem w:displayText="Not Started" w:value="Not Started"/>
                   <w:listItem w:displayText="Blocked" w:value="Blocked"/>
                   <w:listItem w:displayText="In Progress" w:value="In Progress"/>
@@ -899,12 +899,12 @@
                 <w:r>
                   <w:rPr>
                     <w:rFonts w:ascii="Times" w:cs="Times" w:eastAsia="Times" w:hAnsi="Times"/>
-                    <w:color w:val="3d3d3d"/>
+                    <w:color w:val="473821"/>
                     <w:sz w:val="24"/>
                     <w:szCs w:val="24"/>
-                    <w:shd w:fill="e6e6e6" w:val="clear"/>
+                    <w:shd w:fill="ffe5a0" w:val="clear"/>
                   </w:rPr>
-                  <w:t xml:space="preserve">Not Started</w:t>
+                  <w:t xml:space="preserve">In Progress</w:t>
                 </w:r>
               </w:sdtContent>
             </w:sdt>
@@ -1019,14 +1019,14 @@
               </w:rPr>
               <w:drawing>
                 <wp:inline distB="114300" distT="114300" distL="114300" distR="114300">
-                  <wp:extent cx="4700615" cy="2297576"/>
+                  <wp:extent cx="3592766" cy="1752746"/>
                   <wp:effectExtent b="0" l="0" r="0" t="0"/>
-                  <wp:docPr id="13" name="image12.png"/>
+                  <wp:docPr id="14" name="image14.png"/>
                   <a:graphic>
                     <a:graphicData uri="http://schemas.openxmlformats.org/drawingml/2006/picture">
                       <pic:pic>
                         <pic:nvPicPr>
-                          <pic:cNvPr id="0" name="image12.png"/>
+                          <pic:cNvPr id="0" name="image14.png"/>
                           <pic:cNvPicPr preferRelativeResize="0"/>
                         </pic:nvPicPr>
                         <pic:blipFill>
@@ -1039,7 +1039,7 @@
                         <pic:spPr>
                           <a:xfrm>
                             <a:off x="0" y="0"/>
-                            <a:ext cx="4700615" cy="2297576"/>
+                            <a:ext cx="3592766" cy="1752746"/>
                           </a:xfrm>
                           <a:prstGeom prst="rect"/>
                           <a:ln/>
@@ -1099,7 +1099,7 @@
             <w:sdt>
               <w:sdtPr>
                 <w:alias w:val="Assignee"/>
-                <w:id w:val="1875279714"/>
+                <w:id w:val="2145644319"/>
                 <w:dropDownList w:lastValue="Matthew">
                   <w:listItem w:displayText="None" w:value="None"/>
                   <w:listItem w:displayText="Alarie" w:value="Alarie"/>
@@ -1150,8 +1150,8 @@
             <w:sdt>
               <w:sdtPr>
                 <w:alias w:val="Project status"/>
-                <w:id w:val="-1870312053"/>
-                <w:dropDownList w:lastValue="Not Started">
+                <w:id w:val="-444781305"/>
+                <w:dropDownList w:lastValue="In Progress">
                   <w:listItem w:displayText="Not Started" w:value="Not Started"/>
                   <w:listItem w:displayText="Blocked" w:value="Blocked"/>
                   <w:listItem w:displayText="In Progress" w:value="In Progress"/>
@@ -1164,12 +1164,12 @@
                 <w:r>
                   <w:rPr>
                     <w:rFonts w:ascii="Times" w:cs="Times" w:eastAsia="Times" w:hAnsi="Times"/>
-                    <w:color w:val="3d3d3d"/>
+                    <w:color w:val="473821"/>
                     <w:sz w:val="24"/>
                     <w:szCs w:val="24"/>
-                    <w:shd w:fill="e6e6e6" w:val="clear"/>
+                    <w:shd w:fill="ffe5a0" w:val="clear"/>
                   </w:rPr>
-                  <w:t xml:space="preserve">Not Started</w:t>
+                  <w:t xml:space="preserve">In Progress</w:t>
                 </w:r>
               </w:sdtContent>
             </w:sdt>
@@ -1188,7 +1188,7 @@
               <w:keepLines w:val="1"/>
               <w:numPr>
                 <w:ilvl w:val="0"/>
-                <w:numId w:val="13"/>
+                <w:numId w:val="22"/>
               </w:numPr>
               <w:spacing w:after="0" w:afterAutospacing="0" w:before="240" w:lineRule="auto"/>
               <w:ind w:left="720" w:hanging="360"/>
@@ -1205,7 +1205,7 @@
                 <w:szCs w:val="24"/>
                 <w:rtl w:val="0"/>
               </w:rPr>
-              <w:t xml:space="preserve">Add new option to … in customer account &gt; bookings page:</w:t>
+              <w:t xml:space="preserve">Fix booking &gt; new booking &gt; hotel type service &gt; step 8 care instructions:</w:t>
             </w:r>
           </w:p>
           <w:p>
@@ -1214,7 +1214,7 @@
               <w:keepLines w:val="1"/>
               <w:numPr>
                 <w:ilvl w:val="1"/>
-                <w:numId w:val="13"/>
+                <w:numId w:val="22"/>
               </w:numPr>
               <w:spacing w:after="0" w:afterAutospacing="0" w:before="0" w:beforeAutospacing="0" w:lineRule="auto"/>
               <w:ind w:left="1440" w:hanging="360"/>
@@ -1231,7 +1231,7 @@
                 <w:szCs w:val="24"/>
                 <w:rtl w:val="0"/>
               </w:rPr>
-              <w:t xml:space="preserve">Add View Details option</w:t>
+              <w:t xml:space="preserve">When unchecking same instructions every night, and instructions in other nights are not configured, booking fails</w:t>
             </w:r>
           </w:p>
           <w:p>
@@ -1240,7 +1240,7 @@
               <w:keepLines w:val="1"/>
               <w:numPr>
                 <w:ilvl w:val="1"/>
-                <w:numId w:val="13"/>
+                <w:numId w:val="22"/>
               </w:numPr>
               <w:spacing w:after="0" w:afterAutospacing="0" w:before="0" w:beforeAutospacing="0" w:lineRule="auto"/>
               <w:ind w:left="1440" w:hanging="360"/>
@@ -1257,7 +1257,7 @@
                 <w:szCs w:val="24"/>
                 <w:rtl w:val="0"/>
               </w:rPr>
-              <w:t xml:space="preserve">Should be able to see all details (e.g. branch, pet, date time, assigned staff/cage, price, payments, etc.)</w:t>
+              <w:t xml:space="preserve">Should set the first night instructions the default for other nights (so no need to set)</w:t>
             </w:r>
           </w:p>
           <w:p>
@@ -1266,7 +1266,7 @@
               <w:keepLines w:val="1"/>
               <w:numPr>
                 <w:ilvl w:val="1"/>
-                <w:numId w:val="13"/>
+                <w:numId w:val="22"/>
               </w:numPr>
               <w:spacing w:after="0" w:afterAutospacing="0" w:before="0" w:beforeAutospacing="0" w:lineRule="auto"/>
               <w:ind w:left="1440" w:hanging="360"/>
@@ -1284,14 +1284,14 @@
               </w:rPr>
               <w:drawing>
                 <wp:inline distB="114300" distT="114300" distL="114300" distR="114300">
-                  <wp:extent cx="3805238" cy="1344437"/>
+                  <wp:extent cx="3738812" cy="3714896"/>
                   <wp:effectExtent b="0" l="0" r="0" t="0"/>
-                  <wp:docPr id="3" name="image1.png"/>
+                  <wp:docPr id="16" name="image8.png"/>
                   <a:graphic>
                     <a:graphicData uri="http://schemas.openxmlformats.org/drawingml/2006/picture">
                       <pic:pic>
                         <pic:nvPicPr>
-                          <pic:cNvPr id="0" name="image1.png"/>
+                          <pic:cNvPr id="0" name="image8.png"/>
                           <pic:cNvPicPr preferRelativeResize="0"/>
                         </pic:nvPicPr>
                         <pic:blipFill>
@@ -1304,7 +1304,7 @@
                         <pic:spPr>
                           <a:xfrm>
                             <a:off x="0" y="0"/>
-                            <a:ext cx="3805238" cy="1344437"/>
+                            <a:ext cx="3738812" cy="3714896"/>
                           </a:xfrm>
                           <a:prstGeom prst="rect"/>
                           <a:ln/>
@@ -1327,7 +1327,59 @@
               <w:keepLines w:val="1"/>
               <w:numPr>
                 <w:ilvl w:val="1"/>
-                <w:numId w:val="13"/>
+                <w:numId w:val="22"/>
+              </w:numPr>
+              <w:spacing w:after="0" w:afterAutospacing="0" w:before="0" w:beforeAutospacing="0" w:lineRule="auto"/>
+              <w:ind w:left="1440" w:hanging="360"/>
+              <w:rPr>
+                <w:rFonts w:ascii="Times" w:cs="Times" w:eastAsia="Times" w:hAnsi="Times"/>
+                <w:sz w:val="24"/>
+                <w:szCs w:val="24"/>
+              </w:rPr>
+            </w:pPr>
+            <w:r>
+              <w:rPr>
+                <w:rFonts w:ascii="Times" w:cs="Times" w:eastAsia="Times" w:hAnsi="Times"/>
+                <w:sz w:val="24"/>
+                <w:szCs w:val="24"/>
+                <w:rtl w:val="0"/>
+              </w:rPr>
+              <w:t xml:space="preserve">Changing instructions for a specific night will only overwrite the instructions for that night</w:t>
+            </w:r>
+          </w:p>
+          <w:p>
+            <w:pPr>
+              <w:keepNext w:val="1"/>
+              <w:keepLines w:val="1"/>
+              <w:numPr>
+                <w:ilvl w:val="1"/>
+                <w:numId w:val="22"/>
+              </w:numPr>
+              <w:spacing w:after="0" w:afterAutospacing="0" w:before="0" w:beforeAutospacing="0" w:lineRule="auto"/>
+              <w:ind w:left="1440" w:hanging="360"/>
+              <w:rPr>
+                <w:rFonts w:ascii="Times" w:cs="Times" w:eastAsia="Times" w:hAnsi="Times"/>
+                <w:sz w:val="24"/>
+                <w:szCs w:val="24"/>
+              </w:rPr>
+            </w:pPr>
+            <w:r>
+              <w:rPr>
+                <w:rFonts w:ascii="Times" w:cs="Times" w:eastAsia="Times" w:hAnsi="Times"/>
+                <w:sz w:val="24"/>
+                <w:szCs w:val="24"/>
+                <w:rtl w:val="0"/>
+              </w:rPr>
+              <w:t xml:space="preserve">Or perhaps add a new tab that says default instructions, which will be applied to all nights</w:t>
+            </w:r>
+          </w:p>
+          <w:p>
+            <w:pPr>
+              <w:keepNext w:val="1"/>
+              <w:keepLines w:val="1"/>
+              <w:numPr>
+                <w:ilvl w:val="1"/>
+                <w:numId w:val="22"/>
               </w:numPr>
               <w:spacing w:after="240" w:before="0" w:beforeAutospacing="0" w:lineRule="auto"/>
               <w:ind w:left="1440" w:hanging="360"/>
@@ -1344,7 +1396,7 @@
                 <w:szCs w:val="24"/>
                 <w:rtl w:val="0"/>
               </w:rPr>
-              <w:t xml:space="preserve">Currently only cancel is available (and reschedule if booking hasn’t been confirmed)</w:t>
+              <w:t xml:space="preserve">Then apply overwrite on nights that are edited</w:t>
             </w:r>
           </w:p>
         </w:tc>
@@ -1364,7 +1416,7 @@
             <w:sdt>
               <w:sdtPr>
                 <w:alias w:val="Assignee"/>
-                <w:id w:val="90443376"/>
+                <w:id w:val="-35423677"/>
                 <w:dropDownList w:lastValue="Matthew">
                   <w:listItem w:displayText="None" w:value="None"/>
                   <w:listItem w:displayText="Alarie" w:value="Alarie"/>
@@ -1393,6 +1445,458 @@
           </w:p>
         </w:tc>
       </w:tr>
+      <w:tr>
+        <w:trPr>
+          <w:cantSplit w:val="0"/>
+          <w:trHeight w:val="543" w:hRule="atLeast"/>
+          <w:tblHeader w:val="0"/>
+        </w:trPr>
+        <w:tc>
+          <w:tcPr/>
+          <w:p>
+            <w:pPr>
+              <w:keepNext w:val="1"/>
+              <w:keepLines w:val="1"/>
+              <w:spacing w:line="240" w:lineRule="auto"/>
+              <w:rPr>
+                <w:rFonts w:ascii="Times" w:cs="Times" w:eastAsia="Times" w:hAnsi="Times"/>
+                <w:sz w:val="24"/>
+                <w:szCs w:val="24"/>
+              </w:rPr>
+            </w:pPr>
+            <w:sdt>
+              <w:sdtPr>
+                <w:alias w:val="Project status"/>
+                <w:id w:val="1191719512"/>
+                <w:dropDownList w:lastValue="Merged">
+                  <w:listItem w:displayText="Not Started" w:value="Not Started"/>
+                  <w:listItem w:displayText="Blocked" w:value="Blocked"/>
+                  <w:listItem w:displayText="In Progress" w:value="In Progress"/>
+                  <w:listItem w:displayText="Completed" w:value="Completed"/>
+                  <w:listItem w:displayText="Reviewing" w:value="Reviewing"/>
+                  <w:listItem w:displayText="Merged" w:value="Merged"/>
+                </w:dropDownList>
+              </w:sdtPr>
+              <w:sdtContent>
+                <w:r>
+                  <w:rPr>
+                    <w:rFonts w:ascii="Times" w:cs="Times" w:eastAsia="Times" w:hAnsi="Times"/>
+                    <w:color w:val="5a3286"/>
+                    <w:sz w:val="24"/>
+                    <w:szCs w:val="24"/>
+                    <w:shd w:fill="e6cff2" w:val="clear"/>
+                  </w:rPr>
+                  <w:t xml:space="preserve">Merged</w:t>
+                </w:r>
+              </w:sdtContent>
+            </w:sdt>
+            <w:r>
+              <w:rPr>
+                <w:rtl w:val="0"/>
+              </w:rPr>
+            </w:r>
+          </w:p>
+        </w:tc>
+        <w:tc>
+          <w:tcPr/>
+          <w:p>
+            <w:pPr>
+              <w:keepNext w:val="1"/>
+              <w:keepLines w:val="1"/>
+              <w:numPr>
+                <w:ilvl w:val="0"/>
+                <w:numId w:val="13"/>
+              </w:numPr>
+              <w:spacing w:after="0" w:afterAutospacing="0" w:before="240" w:lineRule="auto"/>
+              <w:ind w:left="720" w:hanging="360"/>
+              <w:rPr>
+                <w:rFonts w:ascii="Times" w:cs="Times" w:eastAsia="Times" w:hAnsi="Times"/>
+                <w:sz w:val="24"/>
+                <w:szCs w:val="24"/>
+              </w:rPr>
+            </w:pPr>
+            <w:r>
+              <w:rPr>
+                <w:rFonts w:ascii="Times" w:cs="Times" w:eastAsia="Times" w:hAnsi="Times"/>
+                <w:sz w:val="24"/>
+                <w:szCs w:val="24"/>
+                <w:rtl w:val="0"/>
+              </w:rPr>
+              <w:t xml:space="preserve">Add new option to … in customer account &gt; bookings page:</w:t>
+            </w:r>
+          </w:p>
+          <w:p>
+            <w:pPr>
+              <w:keepNext w:val="1"/>
+              <w:keepLines w:val="1"/>
+              <w:numPr>
+                <w:ilvl w:val="1"/>
+                <w:numId w:val="13"/>
+              </w:numPr>
+              <w:spacing w:after="0" w:afterAutospacing="0" w:before="0" w:beforeAutospacing="0" w:lineRule="auto"/>
+              <w:ind w:left="1440" w:hanging="360"/>
+              <w:rPr>
+                <w:rFonts w:ascii="Times" w:cs="Times" w:eastAsia="Times" w:hAnsi="Times"/>
+                <w:sz w:val="24"/>
+                <w:szCs w:val="24"/>
+              </w:rPr>
+            </w:pPr>
+            <w:r>
+              <w:rPr>
+                <w:rFonts w:ascii="Times" w:cs="Times" w:eastAsia="Times" w:hAnsi="Times"/>
+                <w:sz w:val="24"/>
+                <w:szCs w:val="24"/>
+                <w:rtl w:val="0"/>
+              </w:rPr>
+              <w:t xml:space="preserve">Add View Details option</w:t>
+            </w:r>
+          </w:p>
+          <w:p>
+            <w:pPr>
+              <w:keepNext w:val="1"/>
+              <w:keepLines w:val="1"/>
+              <w:numPr>
+                <w:ilvl w:val="1"/>
+                <w:numId w:val="13"/>
+              </w:numPr>
+              <w:spacing w:after="0" w:afterAutospacing="0" w:before="0" w:beforeAutospacing="0" w:lineRule="auto"/>
+              <w:ind w:left="1440" w:hanging="360"/>
+              <w:rPr>
+                <w:rFonts w:ascii="Times" w:cs="Times" w:eastAsia="Times" w:hAnsi="Times"/>
+                <w:sz w:val="24"/>
+                <w:szCs w:val="24"/>
+              </w:rPr>
+            </w:pPr>
+            <w:r>
+              <w:rPr>
+                <w:rFonts w:ascii="Times" w:cs="Times" w:eastAsia="Times" w:hAnsi="Times"/>
+                <w:sz w:val="24"/>
+                <w:szCs w:val="24"/>
+                <w:rtl w:val="0"/>
+              </w:rPr>
+              <w:t xml:space="preserve">Should be able to see all details (e.g. branch, pet, date time, assigned staff/cage, price, payments, etc.)</w:t>
+            </w:r>
+          </w:p>
+          <w:p>
+            <w:pPr>
+              <w:keepNext w:val="1"/>
+              <w:keepLines w:val="1"/>
+              <w:numPr>
+                <w:ilvl w:val="1"/>
+                <w:numId w:val="13"/>
+              </w:numPr>
+              <w:spacing w:after="0" w:afterAutospacing="0" w:before="0" w:beforeAutospacing="0" w:lineRule="auto"/>
+              <w:ind w:left="1440" w:hanging="360"/>
+              <w:rPr>
+                <w:rFonts w:ascii="Times" w:cs="Times" w:eastAsia="Times" w:hAnsi="Times"/>
+                <w:sz w:val="24"/>
+                <w:szCs w:val="24"/>
+              </w:rPr>
+            </w:pPr>
+            <w:r>
+              <w:rPr>
+                <w:rFonts w:ascii="Times" w:cs="Times" w:eastAsia="Times" w:hAnsi="Times"/>
+                <w:sz w:val="24"/>
+                <w:szCs w:val="24"/>
+              </w:rPr>
+              <w:drawing>
+                <wp:inline distB="114300" distT="114300" distL="114300" distR="114300">
+                  <wp:extent cx="3805238" cy="1344437"/>
+                  <wp:effectExtent b="0" l="0" r="0" t="0"/>
+                  <wp:docPr id="11" name="image10.png"/>
+                  <a:graphic>
+                    <a:graphicData uri="http://schemas.openxmlformats.org/drawingml/2006/picture">
+                      <pic:pic>
+                        <pic:nvPicPr>
+                          <pic:cNvPr id="0" name="image10.png"/>
+                          <pic:cNvPicPr preferRelativeResize="0"/>
+                        </pic:nvPicPr>
+                        <pic:blipFill>
+                          <a:blip r:embed="rId9"/>
+                          <a:srcRect b="0" l="0" r="0" t="0"/>
+                          <a:stretch>
+                            <a:fillRect/>
+                          </a:stretch>
+                        </pic:blipFill>
+                        <pic:spPr>
+                          <a:xfrm>
+                            <a:off x="0" y="0"/>
+                            <a:ext cx="3805238" cy="1344437"/>
+                          </a:xfrm>
+                          <a:prstGeom prst="rect"/>
+                          <a:ln/>
+                        </pic:spPr>
+                      </pic:pic>
+                    </a:graphicData>
+                  </a:graphic>
+                </wp:inline>
+              </w:drawing>
+            </w:r>
+            <w:r>
+              <w:rPr>
+                <w:rtl w:val="0"/>
+              </w:rPr>
+            </w:r>
+          </w:p>
+          <w:p>
+            <w:pPr>
+              <w:keepNext w:val="1"/>
+              <w:keepLines w:val="1"/>
+              <w:numPr>
+                <w:ilvl w:val="1"/>
+                <w:numId w:val="13"/>
+              </w:numPr>
+              <w:spacing w:after="240" w:before="0" w:beforeAutospacing="0" w:lineRule="auto"/>
+              <w:ind w:left="1440" w:hanging="360"/>
+              <w:rPr>
+                <w:rFonts w:ascii="Times" w:cs="Times" w:eastAsia="Times" w:hAnsi="Times"/>
+                <w:sz w:val="24"/>
+                <w:szCs w:val="24"/>
+              </w:rPr>
+            </w:pPr>
+            <w:r>
+              <w:rPr>
+                <w:rFonts w:ascii="Times" w:cs="Times" w:eastAsia="Times" w:hAnsi="Times"/>
+                <w:sz w:val="24"/>
+                <w:szCs w:val="24"/>
+                <w:rtl w:val="0"/>
+              </w:rPr>
+              <w:t xml:space="preserve">Currently only cancel is available (and reschedule if booking hasn’t been confirmed)</w:t>
+            </w:r>
+          </w:p>
+        </w:tc>
+        <w:tc>
+          <w:tcPr/>
+          <w:p>
+            <w:pPr>
+              <w:keepNext w:val="1"/>
+              <w:keepLines w:val="1"/>
+              <w:spacing w:line="240" w:lineRule="auto"/>
+              <w:rPr>
+                <w:rFonts w:ascii="Times" w:cs="Times" w:eastAsia="Times" w:hAnsi="Times"/>
+                <w:sz w:val="24"/>
+                <w:szCs w:val="24"/>
+              </w:rPr>
+            </w:pPr>
+            <w:sdt>
+              <w:sdtPr>
+                <w:alias w:val="Assignee"/>
+                <w:id w:val="-1432022929"/>
+                <w:dropDownList w:lastValue="Matthew">
+                  <w:listItem w:displayText="None" w:value="None"/>
+                  <w:listItem w:displayText="Alarie" w:value="Alarie"/>
+                  <w:listItem w:displayText="James" w:value="James"/>
+                  <w:listItem w:displayText="Matthew" w:value="Matthew"/>
+                </w:dropDownList>
+              </w:sdtPr>
+              <w:sdtContent>
+                <w:r>
+                  <w:rPr>
+                    <w:rFonts w:ascii="Times" w:cs="Times" w:eastAsia="Times" w:hAnsi="Times"/>
+                    <w:color w:val="11734b"/>
+                    <w:sz w:val="24"/>
+                    <w:szCs w:val="24"/>
+                    <w:shd w:fill="d4edbc" w:val="clear"/>
+                  </w:rPr>
+                  <w:t xml:space="preserve">Matthew</w:t>
+                </w:r>
+              </w:sdtContent>
+            </w:sdt>
+            <w:r>
+              <w:rPr>
+                <w:rtl w:val="0"/>
+              </w:rPr>
+            </w:r>
+          </w:p>
+        </w:tc>
+      </w:tr>
+      <w:tr>
+        <w:trPr>
+          <w:cantSplit w:val="0"/>
+          <w:trHeight w:val="543" w:hRule="atLeast"/>
+          <w:tblHeader w:val="0"/>
+        </w:trPr>
+        <w:tc>
+          <w:tcPr/>
+          <w:p>
+            <w:pPr>
+              <w:keepNext w:val="1"/>
+              <w:keepLines w:val="1"/>
+              <w:spacing w:line="240" w:lineRule="auto"/>
+              <w:rPr>
+                <w:rFonts w:ascii="Times" w:cs="Times" w:eastAsia="Times" w:hAnsi="Times"/>
+                <w:sz w:val="24"/>
+                <w:szCs w:val="24"/>
+              </w:rPr>
+            </w:pPr>
+            <w:sdt>
+              <w:sdtPr>
+                <w:alias w:val="Project status"/>
+                <w:id w:val="-1521931985"/>
+                <w:dropDownList w:lastValue="Merged">
+                  <w:listItem w:displayText="Not Started" w:value="Not Started"/>
+                  <w:listItem w:displayText="Blocked" w:value="Blocked"/>
+                  <w:listItem w:displayText="In Progress" w:value="In Progress"/>
+                  <w:listItem w:displayText="Completed" w:value="Completed"/>
+                  <w:listItem w:displayText="Reviewing" w:value="Reviewing"/>
+                  <w:listItem w:displayText="Merged" w:value="Merged"/>
+                </w:dropDownList>
+              </w:sdtPr>
+              <w:sdtContent>
+                <w:r>
+                  <w:rPr>
+                    <w:rFonts w:ascii="Times" w:cs="Times" w:eastAsia="Times" w:hAnsi="Times"/>
+                    <w:color w:val="5a3286"/>
+                    <w:sz w:val="24"/>
+                    <w:szCs w:val="24"/>
+                    <w:shd w:fill="e6cff2" w:val="clear"/>
+                  </w:rPr>
+                  <w:t xml:space="preserve">Merged</w:t>
+                </w:r>
+              </w:sdtContent>
+            </w:sdt>
+            <w:r>
+              <w:rPr>
+                <w:rtl w:val="0"/>
+              </w:rPr>
+            </w:r>
+          </w:p>
+        </w:tc>
+        <w:tc>
+          <w:tcPr/>
+          <w:p>
+            <w:pPr>
+              <w:keepNext w:val="1"/>
+              <w:keepLines w:val="1"/>
+              <w:numPr>
+                <w:ilvl w:val="0"/>
+                <w:numId w:val="80"/>
+              </w:numPr>
+              <w:spacing w:after="0" w:afterAutospacing="0" w:before="240" w:lineRule="auto"/>
+              <w:ind w:left="720" w:hanging="360"/>
+              <w:rPr>
+                <w:rFonts w:ascii="Times" w:cs="Times" w:eastAsia="Times" w:hAnsi="Times"/>
+                <w:sz w:val="24"/>
+                <w:szCs w:val="24"/>
+              </w:rPr>
+            </w:pPr>
+            <w:r>
+              <w:rPr>
+                <w:rFonts w:ascii="Times" w:cs="Times" w:eastAsia="Times" w:hAnsi="Times"/>
+                <w:sz w:val="24"/>
+                <w:szCs w:val="24"/>
+                <w:rtl w:val="0"/>
+              </w:rPr>
+              <w:t xml:space="preserve">Fix unknown pet owner and unknown pet when viewing bookings as cashier</w:t>
+            </w:r>
+          </w:p>
+          <w:p>
+            <w:pPr>
+              <w:keepNext w:val="1"/>
+              <w:keepLines w:val="1"/>
+              <w:numPr>
+                <w:ilvl w:val="1"/>
+                <w:numId w:val="80"/>
+              </w:numPr>
+              <w:spacing w:after="240" w:before="0" w:beforeAutospacing="0" w:lineRule="auto"/>
+              <w:ind w:left="1440" w:hanging="360"/>
+              <w:rPr>
+                <w:rFonts w:ascii="Times" w:cs="Times" w:eastAsia="Times" w:hAnsi="Times"/>
+                <w:sz w:val="24"/>
+                <w:szCs w:val="24"/>
+              </w:rPr>
+            </w:pPr>
+            <w:r>
+              <w:rPr>
+                <w:rFonts w:ascii="Times" w:cs="Times" w:eastAsia="Times" w:hAnsi="Times"/>
+                <w:sz w:val="24"/>
+                <w:szCs w:val="24"/>
+              </w:rPr>
+              <w:drawing>
+                <wp:inline distB="114300" distT="114300" distL="114300" distR="114300">
+                  <wp:extent cx="3760413" cy="1187499"/>
+                  <wp:effectExtent b="0" l="0" r="0" t="0"/>
+                  <wp:docPr id="5" name="image5.png"/>
+                  <a:graphic>
+                    <a:graphicData uri="http://schemas.openxmlformats.org/drawingml/2006/picture">
+                      <pic:pic>
+                        <pic:nvPicPr>
+                          <pic:cNvPr id="0" name="image5.png"/>
+                          <pic:cNvPicPr preferRelativeResize="0"/>
+                        </pic:nvPicPr>
+                        <pic:blipFill>
+                          <a:blip r:embed="rId10"/>
+                          <a:srcRect b="0" l="0" r="0" t="0"/>
+                          <a:stretch>
+                            <a:fillRect/>
+                          </a:stretch>
+                        </pic:blipFill>
+                        <pic:spPr>
+                          <a:xfrm>
+                            <a:off x="0" y="0"/>
+                            <a:ext cx="3760413" cy="1187499"/>
+                          </a:xfrm>
+                          <a:prstGeom prst="rect"/>
+                          <a:ln/>
+                        </pic:spPr>
+                      </pic:pic>
+                    </a:graphicData>
+                  </a:graphic>
+                </wp:inline>
+              </w:drawing>
+            </w:r>
+            <w:r>
+              <w:rPr>
+                <w:rtl w:val="0"/>
+              </w:rPr>
+            </w:r>
+          </w:p>
+        </w:tc>
+        <w:tc>
+          <w:tcPr/>
+          <w:p>
+            <w:pPr>
+              <w:keepNext w:val="1"/>
+              <w:keepLines w:val="1"/>
+              <w:spacing w:line="240" w:lineRule="auto"/>
+              <w:rPr>
+                <w:rFonts w:ascii="Times" w:cs="Times" w:eastAsia="Times" w:hAnsi="Times"/>
+                <w:sz w:val="24"/>
+                <w:szCs w:val="24"/>
+              </w:rPr>
+            </w:pPr>
+            <w:sdt>
+              <w:sdtPr>
+                <w:alias w:val="Assignee"/>
+                <w:id w:val="-253588358"/>
+                <w:dropDownList w:lastValue="Matthew">
+                  <w:listItem w:displayText="None" w:value="None"/>
+                  <w:listItem w:displayText="Alarie" w:value="Alarie"/>
+                  <w:listItem w:displayText="James" w:value="James"/>
+                  <w:listItem w:displayText="Matthew" w:value="Matthew"/>
+                </w:dropDownList>
+              </w:sdtPr>
+              <w:sdtContent>
+                <w:r>
+                  <w:rPr>
+                    <w:rFonts w:ascii="Times" w:cs="Times" w:eastAsia="Times" w:hAnsi="Times"/>
+                    <w:color w:val="11734b"/>
+                    <w:sz w:val="24"/>
+                    <w:szCs w:val="24"/>
+                    <w:shd w:fill="d4edbc" w:val="clear"/>
+                  </w:rPr>
+                  <w:t xml:space="preserve">Matthew</w:t>
+                </w:r>
+              </w:sdtContent>
+            </w:sdt>
+            <w:r>
+              <w:rPr>
+                <w:rtl w:val="0"/>
+              </w:rPr>
+            </w:r>
+          </w:p>
+        </w:tc>
+      </w:tr>
     </w:tbl>
     <w:p>
       <w:pPr>
@@ -1447,7 +1951,7 @@
           <w:pgNumType w:start="1"/>
         </w:sectPr>
       </w:pPr>
-      <w:bookmarkStart w:colFirst="0" w:colLast="0" w:name="_1qvu9y2yhbg9" w:id="2"/>
+      <w:bookmarkStart w:colFirst="0" w:colLast="0" w:name="_kun5rp65rfpd" w:id="2"/>
       <w:bookmarkEnd w:id="2"/>
       <w:r>
         <w:rPr>
@@ -2119,7 +2623,7 @@
             <w:sdt>
               <w:sdtPr>
                 <w:alias w:val="Assignee"/>
-                <w:id w:val="-643795619"/>
+                <w:id w:val="-1001323271"/>
                 <w:dropDownList w:lastValue="Matthew">
                   <w:listItem w:displayText="None" w:value="None"/>
                   <w:listItem w:displayText="Alarie" w:value="Alarie"/>
@@ -2277,7 +2781,7 @@
             <w:sdt>
               <w:sdtPr>
                 <w:alias w:val="Assignee"/>
-                <w:id w:val="-103118134"/>
+                <w:id w:val="1341096784"/>
                 <w:dropDownList w:lastValue="Matthew">
                   <w:listItem w:displayText="None" w:value="None"/>
                   <w:listItem w:displayText="Alarie" w:value="Alarie"/>
@@ -2366,16 +2870,16 @@
                 <wp:inline distB="114300" distT="114300" distL="114300" distR="114300">
                   <wp:extent cx="3355311" cy="2120187"/>
                   <wp:effectExtent b="0" l="0" r="0" t="0"/>
-                  <wp:docPr id="5" name="image17.png"/>
+                  <wp:docPr id="17" name="image13.png"/>
                   <a:graphic>
                     <a:graphicData uri="http://schemas.openxmlformats.org/drawingml/2006/picture">
                       <pic:pic>
                         <pic:nvPicPr>
-                          <pic:cNvPr id="0" name="image17.png"/>
+                          <pic:cNvPr id="0" name="image13.png"/>
                           <pic:cNvPicPr preferRelativeResize="0"/>
                         </pic:nvPicPr>
                         <pic:blipFill>
-                          <a:blip r:embed="rId9"/>
+                          <a:blip r:embed="rId11"/>
                           <a:srcRect b="0" l="0" r="0" t="0"/>
                           <a:stretch>
                             <a:fillRect/>
@@ -2418,7 +2922,7 @@
             <w:sdt>
               <w:sdtPr>
                 <w:alias w:val="Assignee"/>
-                <w:id w:val="-688613102"/>
+                <w:id w:val="-1502016254"/>
                 <w:dropDownList w:lastValue="Matthew">
                   <w:listItem w:displayText="None" w:value="None"/>
                   <w:listItem w:displayText="Alarie" w:value="Alarie"/>
@@ -2550,7 +3054,7 @@
             <w:sdt>
               <w:sdtPr>
                 <w:alias w:val="Assignee"/>
-                <w:id w:val="336302225"/>
+                <w:id w:val="-889044653"/>
                 <w:dropDownList w:lastValue="Matthew">
                   <w:listItem w:displayText="None" w:value="None"/>
                   <w:listItem w:displayText="Alarie" w:value="Alarie"/>
@@ -2743,16 +3247,16 @@
                 <wp:inline distB="114300" distT="114300" distL="114300" distR="114300">
                   <wp:extent cx="2676582" cy="1445703"/>
                   <wp:effectExtent b="0" l="0" r="0" t="0"/>
-                  <wp:docPr id="9" name="image5.png"/>
+                  <wp:docPr id="10" name="image7.png"/>
                   <a:graphic>
                     <a:graphicData uri="http://schemas.openxmlformats.org/drawingml/2006/picture">
                       <pic:pic>
                         <pic:nvPicPr>
-                          <pic:cNvPr id="0" name="image5.png"/>
+                          <pic:cNvPr id="0" name="image7.png"/>
                           <pic:cNvPicPr preferRelativeResize="0"/>
                         </pic:nvPicPr>
                         <pic:blipFill>
-                          <a:blip r:embed="rId10"/>
+                          <a:blip r:embed="rId12"/>
                           <a:srcRect b="0" l="0" r="0" t="0"/>
                           <a:stretch>
                             <a:fillRect/>
@@ -2830,16 +3334,16 @@
                 <wp:inline distB="114300" distT="114300" distL="114300" distR="114300">
                   <wp:extent cx="3228375" cy="2408571"/>
                   <wp:effectExtent b="0" l="0" r="0" t="0"/>
-                  <wp:docPr id="2" name="image15.png"/>
+                  <wp:docPr id="13" name="image2.png"/>
                   <a:graphic>
                     <a:graphicData uri="http://schemas.openxmlformats.org/drawingml/2006/picture">
                       <pic:pic>
                         <pic:nvPicPr>
-                          <pic:cNvPr id="0" name="image15.png"/>
+                          <pic:cNvPr id="0" name="image2.png"/>
                           <pic:cNvPicPr preferRelativeResize="0"/>
                         </pic:nvPicPr>
                         <pic:blipFill>
-                          <a:blip r:embed="rId11"/>
+                          <a:blip r:embed="rId13"/>
                           <a:srcRect b="0" l="0" r="0" t="0"/>
                           <a:stretch>
                             <a:fillRect/>
@@ -2882,7 +3386,7 @@
             <w:sdt>
               <w:sdtPr>
                 <w:alias w:val="Assignee"/>
-                <w:id w:val="-2107130747"/>
+                <w:id w:val="-1570983188"/>
                 <w:dropDownList w:lastValue="Matthew">
                   <w:listItem w:displayText="None" w:value="None"/>
                   <w:listItem w:displayText="Alarie" w:value="Alarie"/>
@@ -3092,7 +3596,7 @@
             <w:sdt>
               <w:sdtPr>
                 <w:alias w:val="Assignee"/>
-                <w:id w:val="389787420"/>
+                <w:id w:val="1343482475"/>
                 <w:dropDownList w:lastValue="Matthew">
                   <w:listItem w:displayText="None" w:value="None"/>
                   <w:listItem w:displayText="Alarie" w:value="Alarie"/>
@@ -3302,7 +3806,7 @@
             <w:sdt>
               <w:sdtPr>
                 <w:alias w:val="Assignee"/>
-                <w:id w:val="-1464302427"/>
+                <w:id w:val="1251519122"/>
                 <w:dropDownList w:lastValue="Alarie">
                   <w:listItem w:displayText="None" w:value="None"/>
                   <w:listItem w:displayText="Alarie" w:value="Alarie"/>
@@ -3469,16 +3973,16 @@
                 <wp:inline distB="114300" distT="114300" distL="114300" distR="114300">
                   <wp:extent cx="2951586" cy="1507875"/>
                   <wp:effectExtent b="0" l="0" r="0" t="0"/>
-                  <wp:docPr id="8" name="image8.png"/>
+                  <wp:docPr id="15" name="image4.png"/>
                   <a:graphic>
                     <a:graphicData uri="http://schemas.openxmlformats.org/drawingml/2006/picture">
                       <pic:pic>
                         <pic:nvPicPr>
-                          <pic:cNvPr id="0" name="image8.png"/>
+                          <pic:cNvPr id="0" name="image4.png"/>
                           <pic:cNvPicPr preferRelativeResize="0"/>
                         </pic:nvPicPr>
                         <pic:blipFill>
-                          <a:blip r:embed="rId12"/>
+                          <a:blip r:embed="rId14"/>
                           <a:srcRect b="0" l="0" r="0" t="0"/>
                           <a:stretch>
                             <a:fillRect/>
@@ -3530,16 +4034,16 @@
                 <wp:inline distB="114300" distT="114300" distL="114300" distR="114300">
                   <wp:extent cx="3475403" cy="2394500"/>
                   <wp:effectExtent b="0" l="0" r="0" t="0"/>
-                  <wp:docPr id="12" name="image2.png"/>
+                  <wp:docPr id="8" name="image6.png"/>
                   <a:graphic>
                     <a:graphicData uri="http://schemas.openxmlformats.org/drawingml/2006/picture">
                       <pic:pic>
                         <pic:nvPicPr>
-                          <pic:cNvPr id="0" name="image2.png"/>
+                          <pic:cNvPr id="0" name="image6.png"/>
                           <pic:cNvPicPr preferRelativeResize="0"/>
                         </pic:nvPicPr>
                         <pic:blipFill>
-                          <a:blip r:embed="rId13"/>
+                          <a:blip r:embed="rId15"/>
                           <a:srcRect b="0" l="0" r="0" t="0"/>
                           <a:stretch>
                             <a:fillRect/>
@@ -3600,7 +4104,7 @@
             <w:sdt>
               <w:sdtPr>
                 <w:alias w:val="Assignee"/>
-                <w:id w:val="1299792017"/>
+                <w:id w:val="-379609606"/>
                 <w:dropDownList w:lastValue="Alarie">
                   <w:listItem w:displayText="None" w:value="None"/>
                   <w:listItem w:displayText="Alarie" w:value="Alarie"/>
@@ -3715,16 +4219,16 @@
                 <wp:inline distB="114300" distT="114300" distL="114300" distR="114300">
                   <wp:extent cx="3411649" cy="1858705"/>
                   <wp:effectExtent b="0" l="0" r="0" t="0"/>
-                  <wp:docPr id="11" name="image13.png"/>
+                  <wp:docPr id="12" name="image11.png"/>
                   <a:graphic>
                     <a:graphicData uri="http://schemas.openxmlformats.org/drawingml/2006/picture">
                       <pic:pic>
                         <pic:nvPicPr>
-                          <pic:cNvPr id="0" name="image13.png"/>
+                          <pic:cNvPr id="0" name="image11.png"/>
                           <pic:cNvPicPr preferRelativeResize="0"/>
                         </pic:nvPicPr>
                         <pic:blipFill>
-                          <a:blip r:embed="rId14"/>
+                          <a:blip r:embed="rId16"/>
                           <a:srcRect b="0" l="0" r="0" t="0"/>
                           <a:stretch>
                             <a:fillRect/>
@@ -3767,7 +4271,7 @@
             <w:sdt>
               <w:sdtPr>
                 <w:alias w:val="Assignee"/>
-                <w:id w:val="-158385634"/>
+                <w:id w:val="-1725690607"/>
                 <w:dropDownList w:lastValue="James">
                   <w:listItem w:displayText="None" w:value="None"/>
                   <w:listItem w:displayText="Alarie" w:value="Alarie"/>
@@ -3873,7 +4377,7 @@
             <w:sdt>
               <w:sdtPr>
                 <w:alias w:val="Assignee"/>
-                <w:id w:val="1446860379"/>
+                <w:id w:val="-531672205"/>
                 <w:dropDownList w:lastValue="Alarie">
                   <w:listItem w:displayText="None" w:value="None"/>
                   <w:listItem w:displayText="Alarie" w:value="Alarie"/>
@@ -3952,7 +4456,7 @@
             <w:sdt>
               <w:sdtPr>
                 <w:alias w:val="Assignee"/>
-                <w:id w:val="-1580733529"/>
+                <w:id w:val="-1972883330"/>
                 <w:dropDownList w:lastValue="Alarie">
                   <w:listItem w:displayText="None" w:value="None"/>
                   <w:listItem w:displayText="Alarie" w:value="Alarie"/>
@@ -4031,7 +4535,7 @@
             <w:sdt>
               <w:sdtPr>
                 <w:alias w:val="Assignee"/>
-                <w:id w:val="-1624353702"/>
+                <w:id w:val="1494365451"/>
                 <w:dropDownList w:lastValue="Alarie">
                   <w:listItem w:displayText="None" w:value="None"/>
                   <w:listItem w:displayText="Alarie" w:value="Alarie"/>
@@ -4197,16 +4701,16 @@
                 <wp:inline distB="114300" distT="114300" distL="114300" distR="114300">
                   <wp:extent cx="2660984" cy="2592888"/>
                   <wp:effectExtent b="0" l="0" r="0" t="0"/>
-                  <wp:docPr id="15" name="image14.png"/>
+                  <wp:docPr id="3" name="image16.png"/>
                   <a:graphic>
                     <a:graphicData uri="http://schemas.openxmlformats.org/drawingml/2006/picture">
                       <pic:pic>
                         <pic:nvPicPr>
-                          <pic:cNvPr id="0" name="image14.png"/>
+                          <pic:cNvPr id="0" name="image16.png"/>
                           <pic:cNvPicPr preferRelativeResize="0"/>
                         </pic:nvPicPr>
                         <pic:blipFill>
-                          <a:blip r:embed="rId15"/>
+                          <a:blip r:embed="rId17"/>
                           <a:srcRect b="0" l="0" r="0" t="0"/>
                           <a:stretch>
                             <a:fillRect/>
@@ -4362,7 +4866,7 @@
             <w:sdt>
               <w:sdtPr>
                 <w:alias w:val="Assignee"/>
-                <w:id w:val="-125776584"/>
+                <w:id w:val="-1998722989"/>
                 <w:dropDownList w:lastValue="Matthew">
                   <w:listItem w:displayText="None" w:value="None"/>
                   <w:listItem w:displayText="Alarie" w:value="Alarie"/>
@@ -4623,7 +5127,7 @@
             <w:sdt>
               <w:sdtPr>
                 <w:alias w:val="Assignee"/>
-                <w:id w:val="1676081301"/>
+                <w:id w:val="402944035"/>
                 <w:dropDownList w:lastValue="Matthew">
                   <w:listItem w:displayText="None" w:value="None"/>
                   <w:listItem w:displayText="Alarie" w:value="Alarie"/>
@@ -4858,7 +5362,7 @@
             <w:sdt>
               <w:sdtPr>
                 <w:alias w:val="Assignee"/>
-                <w:id w:val="922859396"/>
+                <w:id w:val="1932657975"/>
                 <w:dropDownList w:lastValue="Matthew">
                   <w:listItem w:displayText="None" w:value="None"/>
                   <w:listItem w:displayText="Alarie" w:value="Alarie"/>
@@ -5015,7 +5519,7 @@
             <w:sdt>
               <w:sdtPr>
                 <w:alias w:val="Assignee"/>
-                <w:id w:val="180540843"/>
+                <w:id w:val="-1230538300"/>
                 <w:dropDownList w:lastValue="Matthew">
                   <w:listItem w:displayText="None" w:value="None"/>
                   <w:listItem w:displayText="Alarie" w:value="Alarie"/>
@@ -5224,7 +5728,7 @@
             <w:sdt>
               <w:sdtPr>
                 <w:alias w:val="Assignee"/>
-                <w:id w:val="2075911378"/>
+                <w:id w:val="-914240834"/>
                 <w:dropDownList w:lastValue="Matthew">
                   <w:listItem w:displayText="None" w:value="None"/>
                   <w:listItem w:displayText="Alarie" w:value="Alarie"/>
@@ -5381,7 +5885,7 @@
             <w:sdt>
               <w:sdtPr>
                 <w:alias w:val="Assignee"/>
-                <w:id w:val="83550913"/>
+                <w:id w:val="-1432723581"/>
                 <w:dropDownList w:lastValue="Matthew">
                   <w:listItem w:displayText="None" w:value="None"/>
                   <w:listItem w:displayText="Alarie" w:value="Alarie"/>
@@ -5590,7 +6094,7 @@
             <w:sdt>
               <w:sdtPr>
                 <w:alias w:val="Assignee"/>
-                <w:id w:val="-1188949666"/>
+                <w:id w:val="-1568362594"/>
                 <w:dropDownList w:lastValue="Matthew">
                   <w:listItem w:displayText="None" w:value="None"/>
                   <w:listItem w:displayText="Alarie" w:value="Alarie"/>
@@ -5877,7 +6381,7 @@
             <w:sdt>
               <w:sdtPr>
                 <w:alias w:val="Assignee"/>
-                <w:id w:val="619819047"/>
+                <w:id w:val="1366898657"/>
                 <w:dropDownList w:lastValue="Matthew">
                   <w:listItem w:displayText="None" w:value="None"/>
                   <w:listItem w:displayText="Alarie" w:value="Alarie"/>
@@ -5982,7 +6486,7 @@
             <w:sdt>
               <w:sdtPr>
                 <w:alias w:val="Assignee"/>
-                <w:id w:val="-436438204"/>
+                <w:id w:val="1559525509"/>
                 <w:dropDownList w:lastValue="Matthew">
                   <w:listItem w:displayText="None" w:value="None"/>
                   <w:listItem w:displayText="Alarie" w:value="Alarie"/>
@@ -6191,7 +6695,7 @@
             <w:sdt>
               <w:sdtPr>
                 <w:alias w:val="Assignee"/>
-                <w:id w:val="1951674063"/>
+                <w:id w:val="-1860269190"/>
                 <w:dropDownList w:lastValue="Matthew">
                   <w:listItem w:displayText="None" w:value="None"/>
                   <w:listItem w:displayText="Alarie" w:value="Alarie"/>
@@ -6275,7 +6779,7 @@
             <w:sdt>
               <w:sdtPr>
                 <w:alias w:val="Assignee"/>
-                <w:id w:val="-720736770"/>
+                <w:id w:val="448491306"/>
                 <w:dropDownList w:lastValue="Matthew">
                   <w:listItem w:displayText="None" w:value="None"/>
                   <w:listItem w:displayText="Alarie" w:value="Alarie"/>
@@ -6406,7 +6910,7 @@
             <w:sdt>
               <w:sdtPr>
                 <w:alias w:val="Assignee"/>
-                <w:id w:val="2120103204"/>
+                <w:id w:val="750236959"/>
                 <w:dropDownList w:lastValue="Matthew">
                   <w:listItem w:displayText="None" w:value="None"/>
                   <w:listItem w:displayText="Alarie" w:value="Alarie"/>
@@ -6519,7 +7023,7 @@
           <w:pgNumType w:start="1"/>
         </w:sectPr>
       </w:pPr>
-      <w:bookmarkStart w:colFirst="0" w:colLast="0" w:name="_3k5pv4idqxf1" w:id="4"/>
+      <w:bookmarkStart w:colFirst="0" w:colLast="0" w:name="_virasran7eni" w:id="4"/>
       <w:bookmarkEnd w:id="4"/>
       <w:r>
         <w:rPr>
@@ -6601,7 +7105,7 @@
           <w:pgNumType w:start="1"/>
         </w:sectPr>
       </w:pPr>
-      <w:bookmarkStart w:colFirst="0" w:colLast="0" w:name="_k0c0wg9s9tpm" w:id="5"/>
+      <w:bookmarkStart w:colFirst="0" w:colLast="0" w:name="_pm12j4a78791" w:id="5"/>
       <w:bookmarkEnd w:id="5"/>
       <w:r>
         <w:rPr>
@@ -6841,7 +7345,7 @@
             <w:sdt>
               <w:sdtPr>
                 <w:alias w:val="Configuration 1"/>
-                <w:id w:val="-28083884"/>
+                <w:id w:val="2108113070"/>
                 <w:dropDownList w:lastValue="Medium">
                   <w:listItem w:displayText="Cakewalk" w:value="Cakewalk"/>
                   <w:listItem w:displayText="Easy" w:value="Easy"/>
@@ -7025,7 +7529,7 @@
             <w:sdt>
               <w:sdtPr>
                 <w:alias w:val="Configuration 1"/>
-                <w:id w:val="-771085890"/>
+                <w:id w:val="1334909729"/>
                 <w:dropDownList w:lastValue="Medium">
                   <w:listItem w:displayText="Cakewalk" w:value="Cakewalk"/>
                   <w:listItem w:displayText="Easy" w:value="Easy"/>
@@ -7313,7 +7817,7 @@
             <w:sdt>
               <w:sdtPr>
                 <w:alias w:val="Configuration 1"/>
-                <w:id w:val="-813159757"/>
+                <w:id w:val="-966288273"/>
                 <w:dropDownList w:lastValue="Hard">
                   <w:listItem w:displayText="Cakewalk" w:value="Cakewalk"/>
                   <w:listItem w:displayText="Easy" w:value="Easy"/>
@@ -7471,7 +7975,7 @@
             <w:sdt>
               <w:sdtPr>
                 <w:alias w:val="Configuration 1"/>
-                <w:id w:val="-474277053"/>
+                <w:id w:val="783371057"/>
                 <w:dropDownList w:lastValue="Medium">
                   <w:listItem w:displayText="Cakewalk" w:value="Cakewalk"/>
                   <w:listItem w:displayText="Easy" w:value="Easy"/>
@@ -7515,7 +8019,7 @@
               <w:keepLines w:val="1"/>
               <w:numPr>
                 <w:ilvl w:val="0"/>
-                <w:numId w:val="23"/>
+                <w:numId w:val="72"/>
               </w:numPr>
               <w:spacing w:after="0" w:afterAutospacing="0" w:before="240" w:lineRule="auto"/>
               <w:ind w:left="720" w:hanging="360"/>
@@ -7532,7 +8036,7 @@
                 <w:szCs w:val="24"/>
                 <w:rtl w:val="0"/>
               </w:rPr>
-              <w:t xml:space="preserve">Fix booking &gt; new booking &gt; hotel type service &gt; step 8 care instructions:</w:t>
+              <w:t xml:space="preserve">Fix confirmed hotel type bookings not being read by groomers</w:t>
             </w:r>
           </w:p>
           <w:p>
@@ -7541,7 +8045,7 @@
               <w:keepLines w:val="1"/>
               <w:numPr>
                 <w:ilvl w:val="1"/>
-                <w:numId w:val="23"/>
+                <w:numId w:val="72"/>
               </w:numPr>
               <w:spacing w:after="0" w:afterAutospacing="0" w:before="0" w:beforeAutospacing="0" w:lineRule="auto"/>
               <w:ind w:left="1440" w:hanging="360"/>
@@ -7558,7 +8062,7 @@
                 <w:szCs w:val="24"/>
                 <w:rtl w:val="0"/>
               </w:rPr>
-              <w:t xml:space="preserve">When unchecking same instructions every night, and instructions in other nights are not configured, booking fails</w:t>
+              <w:t xml:space="preserve">Since they’re default in progress, groomers are no longer able to check the pet in</w:t>
             </w:r>
           </w:p>
           <w:p>
@@ -7567,33 +8071,7 @@
               <w:keepLines w:val="1"/>
               <w:numPr>
                 <w:ilvl w:val="1"/>
-                <w:numId w:val="23"/>
-              </w:numPr>
-              <w:spacing w:after="0" w:afterAutospacing="0" w:before="0" w:beforeAutospacing="0" w:lineRule="auto"/>
-              <w:ind w:left="1440" w:hanging="360"/>
-              <w:rPr>
-                <w:rFonts w:ascii="Times" w:cs="Times" w:eastAsia="Times" w:hAnsi="Times"/>
-                <w:sz w:val="24"/>
-                <w:szCs w:val="24"/>
-              </w:rPr>
-            </w:pPr>
-            <w:r>
-              <w:rPr>
-                <w:rFonts w:ascii="Times" w:cs="Times" w:eastAsia="Times" w:hAnsi="Times"/>
-                <w:sz w:val="24"/>
-                <w:szCs w:val="24"/>
-                <w:rtl w:val="0"/>
-              </w:rPr>
-              <w:t xml:space="preserve">Should set the first night instructions the default for other nights (so no need to set)</w:t>
-            </w:r>
-          </w:p>
-          <w:p>
-            <w:pPr>
-              <w:keepNext w:val="1"/>
-              <w:keepLines w:val="1"/>
-              <w:numPr>
-                <w:ilvl w:val="1"/>
-                <w:numId w:val="23"/>
+                <w:numId w:val="72"/>
               </w:numPr>
               <w:spacing w:after="240" w:before="0" w:beforeAutospacing="0" w:lineRule="auto"/>
               <w:ind w:left="1440" w:hanging="360"/>
@@ -7608,44 +8086,9 @@
                 <w:rFonts w:ascii="Times" w:cs="Times" w:eastAsia="Times" w:hAnsi="Times"/>
                 <w:sz w:val="24"/>
                 <w:szCs w:val="24"/>
-              </w:rPr>
-              <w:drawing>
-                <wp:inline distB="114300" distT="114300" distL="114300" distR="114300">
-                  <wp:extent cx="4465222" cy="4436599"/>
-                  <wp:effectExtent b="0" l="0" r="0" t="0"/>
-                  <wp:docPr id="10" name="image3.png"/>
-                  <a:graphic>
-                    <a:graphicData uri="http://schemas.openxmlformats.org/drawingml/2006/picture">
-                      <pic:pic>
-                        <pic:nvPicPr>
-                          <pic:cNvPr id="0" name="image3.png"/>
-                          <pic:cNvPicPr preferRelativeResize="0"/>
-                        </pic:nvPicPr>
-                        <pic:blipFill>
-                          <a:blip r:embed="rId16"/>
-                          <a:srcRect b="0" l="0" r="0" t="0"/>
-                          <a:stretch>
-                            <a:fillRect/>
-                          </a:stretch>
-                        </pic:blipFill>
-                        <pic:spPr>
-                          <a:xfrm>
-                            <a:off x="0" y="0"/>
-                            <a:ext cx="4465222" cy="4436599"/>
-                          </a:xfrm>
-                          <a:prstGeom prst="rect"/>
-                          <a:ln/>
-                        </pic:spPr>
-                      </pic:pic>
-                    </a:graphicData>
-                  </a:graphic>
-                </wp:inline>
-              </w:drawing>
-            </w:r>
-            <w:r>
-              <w:rPr>
-                <w:rtl w:val="0"/>
-              </w:rPr>
+                <w:rtl w:val="0"/>
+              </w:rPr>
+              <w:t xml:space="preserve">Thus the instructions do not show up in Boarding Checklist</w:t>
             </w:r>
           </w:p>
         </w:tc>
@@ -7664,7 +8107,7 @@
             <w:sdt>
               <w:sdtPr>
                 <w:alias w:val="Configuration 1"/>
-                <w:id w:val="-101622498"/>
+                <w:id w:val="733317138"/>
                 <w:dropDownList w:lastValue="Medium">
                   <w:listItem w:displayText="Cakewalk" w:value="Cakewalk"/>
                   <w:listItem w:displayText="Easy" w:value="Easy"/>
@@ -7708,7 +8151,7 @@
               <w:keepLines w:val="1"/>
               <w:numPr>
                 <w:ilvl w:val="0"/>
-                <w:numId w:val="72"/>
+                <w:numId w:val="14"/>
               </w:numPr>
               <w:spacing w:after="0" w:afterAutospacing="0" w:before="240" w:lineRule="auto"/>
               <w:ind w:left="720" w:hanging="360"/>
@@ -7725,7 +8168,7 @@
                 <w:szCs w:val="24"/>
                 <w:rtl w:val="0"/>
               </w:rPr>
-              <w:t xml:space="preserve">Fix confirmed hotel type bookings not being read by groomers</w:t>
+              <w:t xml:space="preserve">Makes changes to credit conversion from cancellation after downpayment</w:t>
             </w:r>
           </w:p>
           <w:p>
@@ -7734,7 +8177,7 @@
               <w:keepLines w:val="1"/>
               <w:numPr>
                 <w:ilvl w:val="1"/>
-                <w:numId w:val="72"/>
+                <w:numId w:val="14"/>
               </w:numPr>
               <w:spacing w:after="0" w:afterAutospacing="0" w:before="0" w:beforeAutospacing="0" w:lineRule="auto"/>
               <w:ind w:left="1440" w:hanging="360"/>
@@ -7751,7 +8194,7 @@
                 <w:szCs w:val="24"/>
                 <w:rtl w:val="0"/>
               </w:rPr>
-              <w:t xml:space="preserve">Since they’re default in progress, groomers are no longer able to check the pet in</w:t>
+              <w:t xml:space="preserve">Make it so that staff can review whether to return downpayment as credits or not</w:t>
             </w:r>
           </w:p>
           <w:p>
@@ -7760,7 +8203,59 @@
               <w:keepLines w:val="1"/>
               <w:numPr>
                 <w:ilvl w:val="1"/>
-                <w:numId w:val="72"/>
+                <w:numId w:val="14"/>
+              </w:numPr>
+              <w:spacing w:after="0" w:afterAutospacing="0" w:before="0" w:beforeAutospacing="0" w:lineRule="auto"/>
+              <w:ind w:left="1440" w:hanging="360"/>
+              <w:rPr>
+                <w:rFonts w:ascii="Times" w:cs="Times" w:eastAsia="Times" w:hAnsi="Times"/>
+                <w:sz w:val="24"/>
+                <w:szCs w:val="24"/>
+              </w:rPr>
+            </w:pPr>
+            <w:r>
+              <w:rPr>
+                <w:rFonts w:ascii="Times" w:cs="Times" w:eastAsia="Times" w:hAnsi="Times"/>
+                <w:sz w:val="24"/>
+                <w:szCs w:val="24"/>
+                <w:rtl w:val="0"/>
+              </w:rPr>
+              <w:t xml:space="preserve">Need manual review of reason of cancellation</w:t>
+            </w:r>
+          </w:p>
+          <w:p>
+            <w:pPr>
+              <w:keepNext w:val="1"/>
+              <w:keepLines w:val="1"/>
+              <w:numPr>
+                <w:ilvl w:val="1"/>
+                <w:numId w:val="14"/>
+              </w:numPr>
+              <w:spacing w:after="0" w:afterAutospacing="0" w:before="0" w:beforeAutospacing="0" w:lineRule="auto"/>
+              <w:ind w:left="1440" w:hanging="360"/>
+              <w:rPr>
+                <w:rFonts w:ascii="Times" w:cs="Times" w:eastAsia="Times" w:hAnsi="Times"/>
+                <w:sz w:val="24"/>
+                <w:szCs w:val="24"/>
+              </w:rPr>
+            </w:pPr>
+            <w:r>
+              <w:rPr>
+                <w:rFonts w:ascii="Times" w:cs="Times" w:eastAsia="Times" w:hAnsi="Times"/>
+                <w:sz w:val="24"/>
+                <w:szCs w:val="24"/>
+                <w:rtl w:val="0"/>
+              </w:rPr>
+              <w:t xml:space="preserve">This is to see if reason is valid</w:t>
+            </w:r>
+          </w:p>
+          <w:p>
+            <w:pPr>
+              <w:keepNext w:val="1"/>
+              <w:keepLines w:val="1"/>
+              <w:numPr>
+                <w:ilvl w:val="1"/>
+                <w:numId w:val="14"/>
               </w:numPr>
               <w:spacing w:after="240" w:before="0" w:beforeAutospacing="0" w:lineRule="auto"/>
               <w:ind w:left="1440" w:hanging="360"/>
@@ -7777,7 +8272,7 @@
                 <w:szCs w:val="24"/>
                 <w:rtl w:val="0"/>
               </w:rPr>
-              <w:t xml:space="preserve">Thus the instructions do not show up in Boarding Checklist</w:t>
+              <w:t xml:space="preserve">Perhaps just add a setting toggle that allows credits on cancel to be either manual or automatic, set per branch</w:t>
             </w:r>
           </w:p>
         </w:tc>
@@ -7796,7 +8291,7 @@
             <w:sdt>
               <w:sdtPr>
                 <w:alias w:val="Configuration 1"/>
-                <w:id w:val="1102433770"/>
+                <w:id w:val="-318749427"/>
                 <w:dropDownList w:lastValue="Medium">
                   <w:listItem w:displayText="Cakewalk" w:value="Cakewalk"/>
                   <w:listItem w:displayText="Easy" w:value="Easy"/>
@@ -7840,7 +8335,7 @@
               <w:keepLines w:val="1"/>
               <w:numPr>
                 <w:ilvl w:val="0"/>
-                <w:numId w:val="14"/>
+                <w:numId w:val="67"/>
               </w:numPr>
               <w:spacing w:after="0" w:afterAutospacing="0" w:before="240" w:lineRule="auto"/>
               <w:ind w:left="720" w:hanging="360"/>
@@ -7857,7 +8352,29 @@
                 <w:szCs w:val="24"/>
                 <w:rtl w:val="0"/>
               </w:rPr>
-              <w:t xml:space="preserve">Makes changes to credit conversion from cancellation after downpayment</w:t>
+              <w:t xml:space="preserve">On </w:t>
+            </w:r>
+            <w:hyperlink r:id="rId18">
+              <w:r>
+                <w:rPr>
+                  <w:rFonts w:ascii="Times" w:cs="Times" w:eastAsia="Times" w:hAnsi="Times"/>
+                  <w:color w:val="1155cc"/>
+                  <w:sz w:val="24"/>
+                  <w:szCs w:val="24"/>
+                  <w:u w:val="single"/>
+                  <w:rtl w:val="0"/>
+                </w:rPr>
+                <w:t xml:space="preserve">http://localhost:5173/staff/hotel/queue</w:t>
+              </w:r>
+            </w:hyperlink>
+            <w:r>
+              <w:rPr>
+                <w:rFonts w:ascii="Times" w:cs="Times" w:eastAsia="Times" w:hAnsi="Times"/>
+                <w:sz w:val="24"/>
+                <w:szCs w:val="24"/>
+                <w:rtl w:val="0"/>
+              </w:rPr>
+              <w:t xml:space="preserve">:</w:t>
             </w:r>
           </w:p>
           <w:p>
@@ -7866,7 +8383,7 @@
               <w:keepLines w:val="1"/>
               <w:numPr>
                 <w:ilvl w:val="1"/>
-                <w:numId w:val="14"/>
+                <w:numId w:val="67"/>
               </w:numPr>
               <w:spacing w:after="0" w:afterAutospacing="0" w:before="0" w:beforeAutospacing="0" w:lineRule="auto"/>
               <w:ind w:left="1440" w:hanging="360"/>
@@ -7883,7 +8400,25 @@
                 <w:szCs w:val="24"/>
                 <w:rtl w:val="0"/>
               </w:rPr>
-              <w:t xml:space="preserve">Make it so that staff can review whether to return downpayment as credits or not</w:t>
+              <w:t xml:space="preserve">Clicking on check in on hotel queue should immediately check in the pet, does not open </w:t>
+            </w:r>
+            <w:hyperlink r:id="rId19">
+              <w:r>
+                <w:rPr>
+                  <w:rFonts w:ascii="Times" w:cs="Times" w:eastAsia="Times" w:hAnsi="Times"/>
+                  <w:color w:val="1155cc"/>
+                  <w:sz w:val="24"/>
+                  <w:szCs w:val="24"/>
+                  <w:u w:val="single"/>
+                  <w:rtl w:val="0"/>
+                </w:rPr>
+                <w:t xml:space="preserve">http://localhost:5173/staff/hotel/queue/check-in/e0aff74e-44e8-48a6-9007-008a7603a1a4</w:t>
+              </w:r>
+            </w:hyperlink>
+            <w:r>
+              <w:rPr>
+                <w:rtl w:val="0"/>
+              </w:rPr>
             </w:r>
           </w:p>
           <w:p>
@@ -7892,7 +8427,7 @@
               <w:keepLines w:val="1"/>
               <w:numPr>
                 <w:ilvl w:val="1"/>
-                <w:numId w:val="14"/>
+                <w:numId w:val="67"/>
               </w:numPr>
               <w:spacing w:after="0" w:afterAutospacing="0" w:before="0" w:beforeAutospacing="0" w:lineRule="auto"/>
               <w:ind w:left="1440" w:hanging="360"/>
@@ -7909,7 +8444,29 @@
                 <w:szCs w:val="24"/>
                 <w:rtl w:val="0"/>
               </w:rPr>
-              <w:t xml:space="preserve">Need manual review of reason of cancellation</w:t>
+              <w:t xml:space="preserve">Move </w:t>
+            </w:r>
+            <w:hyperlink r:id="rId20">
+              <w:r>
+                <w:rPr>
+                  <w:rFonts w:ascii="Times" w:cs="Times" w:eastAsia="Times" w:hAnsi="Times"/>
+                  <w:color w:val="1155cc"/>
+                  <w:sz w:val="24"/>
+                  <w:szCs w:val="24"/>
+                  <w:u w:val="single"/>
+                  <w:rtl w:val="0"/>
+                </w:rPr>
+                <w:t xml:space="preserve">http://localhost:5173/staff/hotel/queue/check-in/e0aff74e-44e8-48a6-9007-008a7603a1a4</w:t>
+              </w:r>
+            </w:hyperlink>
+            <w:r>
+              <w:rPr>
+                <w:rFonts w:ascii="Times" w:cs="Times" w:eastAsia="Times" w:hAnsi="Times"/>
+                <w:sz w:val="24"/>
+                <w:szCs w:val="24"/>
+                <w:rtl w:val="0"/>
+              </w:rPr>
+              <w:t xml:space="preserve"> to the … button &gt; View booking details with an edit option at the bottom</w:t>
             </w:r>
           </w:p>
           <w:p>
@@ -7918,7 +8475,7 @@
               <w:keepLines w:val="1"/>
               <w:numPr>
                 <w:ilvl w:val="1"/>
-                <w:numId w:val="14"/>
+                <w:numId w:val="67"/>
               </w:numPr>
               <w:spacing w:after="0" w:afterAutospacing="0" w:before="0" w:beforeAutospacing="0" w:lineRule="auto"/>
               <w:ind w:left="1440" w:hanging="360"/>
@@ -7935,7 +8492,7 @@
                 <w:szCs w:val="24"/>
                 <w:rtl w:val="0"/>
               </w:rPr>
-              <w:t xml:space="preserve">This is to see if reason is valid</w:t>
+              <w:t xml:space="preserve">Do not open this page with go to checkout and check in another pet options after checking it, just return to the queue and show a modal if success or fail</w:t>
             </w:r>
           </w:p>
           <w:p>
@@ -7943,25 +8500,60 @@
               <w:keepNext w:val="1"/>
               <w:keepLines w:val="1"/>
               <w:numPr>
-                <w:ilvl w:val="1"/>
-                <w:numId w:val="14"/>
+                <w:ilvl w:val="2"/>
+                <w:numId w:val="67"/>
               </w:numPr>
               <w:spacing w:after="240" w:before="0" w:beforeAutospacing="0" w:lineRule="auto"/>
-              <w:ind w:left="1440" w:hanging="360"/>
-              <w:rPr>
-                <w:rFonts w:ascii="Times" w:cs="Times" w:eastAsia="Times" w:hAnsi="Times"/>
-                <w:sz w:val="24"/>
-                <w:szCs w:val="24"/>
-              </w:rPr>
-            </w:pPr>
-            <w:r>
-              <w:rPr>
-                <w:rFonts w:ascii="Times" w:cs="Times" w:eastAsia="Times" w:hAnsi="Times"/>
-                <w:sz w:val="24"/>
-                <w:szCs w:val="24"/>
-                <w:rtl w:val="0"/>
-              </w:rPr>
-              <w:t xml:space="preserve">Perhaps just add a setting toggle that allows credits on cancel to be either manual or automatic, set per branch</w:t>
+              <w:ind w:left="2160" w:hanging="360"/>
+              <w:rPr>
+                <w:rFonts w:ascii="Times" w:cs="Times" w:eastAsia="Times" w:hAnsi="Times"/>
+                <w:sz w:val="24"/>
+                <w:szCs w:val="24"/>
+              </w:rPr>
+            </w:pPr>
+            <w:r>
+              <w:rPr>
+                <w:rFonts w:ascii="Times" w:cs="Times" w:eastAsia="Times" w:hAnsi="Times"/>
+                <w:sz w:val="24"/>
+                <w:szCs w:val="24"/>
+              </w:rPr>
+              <w:drawing>
+                <wp:inline distB="114300" distT="114300" distL="114300" distR="114300">
+                  <wp:extent cx="3713979" cy="1994277"/>
+                  <wp:effectExtent b="0" l="0" r="0" t="0"/>
+                  <wp:docPr id="9" name="image15.png"/>
+                  <a:graphic>
+                    <a:graphicData uri="http://schemas.openxmlformats.org/drawingml/2006/picture">
+                      <pic:pic>
+                        <pic:nvPicPr>
+                          <pic:cNvPr id="0" name="image15.png"/>
+                          <pic:cNvPicPr preferRelativeResize="0"/>
+                        </pic:nvPicPr>
+                        <pic:blipFill>
+                          <a:blip r:embed="rId21"/>
+                          <a:srcRect b="0" l="0" r="0" t="0"/>
+                          <a:stretch>
+                            <a:fillRect/>
+                          </a:stretch>
+                        </pic:blipFill>
+                        <pic:spPr>
+                          <a:xfrm>
+                            <a:off x="0" y="0"/>
+                            <a:ext cx="3713979" cy="1994277"/>
+                          </a:xfrm>
+                          <a:prstGeom prst="rect"/>
+                          <a:ln/>
+                        </pic:spPr>
+                      </pic:pic>
+                    </a:graphicData>
+                  </a:graphic>
+                </wp:inline>
+              </w:drawing>
+            </w:r>
+            <w:r>
+              <w:rPr>
+                <w:rtl w:val="0"/>
+              </w:rPr>
             </w:r>
           </w:p>
         </w:tc>
@@ -7980,7 +8572,7 @@
             <w:sdt>
               <w:sdtPr>
                 <w:alias w:val="Configuration 1"/>
-                <w:id w:val="563486274"/>
+                <w:id w:val="171933797"/>
                 <w:dropDownList w:lastValue="Medium">
                   <w:listItem w:displayText="Cakewalk" w:value="Cakewalk"/>
                   <w:listItem w:displayText="Easy" w:value="Easy"/>
@@ -8043,7 +8635,7 @@
               </w:rPr>
               <w:t xml:space="preserve">On </w:t>
             </w:r>
-            <w:hyperlink r:id="rId17">
+            <w:hyperlink r:id="rId22">
               <w:r>
                 <w:rPr>
                   <w:rFonts w:ascii="Times" w:cs="Times" w:eastAsia="Times" w:hAnsi="Times"/>
@@ -8053,7 +8645,7 @@
                   <w:u w:val="single"/>
                   <w:rtl w:val="0"/>
                 </w:rPr>
-                <w:t xml:space="preserve">http://localhost:5173/staff/hotel/queue</w:t>
+                <w:t xml:space="preserve">http://localhost:5173/staff/daycare/queue</w:t>
               </w:r>
             </w:hyperlink>
             <w:r>
@@ -8089,9 +8681,113 @@
                 <w:szCs w:val="24"/>
                 <w:rtl w:val="0"/>
               </w:rPr>
-              <w:t xml:space="preserve">Clicking on check in on hotel queue should immediately check in the pet, does not open </w:t>
-            </w:r>
-            <w:hyperlink r:id="rId18">
+              <w:t xml:space="preserve">Remove checkin checkout subpages</w:t>
+            </w:r>
+          </w:p>
+          <w:p>
+            <w:pPr>
+              <w:keepNext w:val="1"/>
+              <w:keepLines w:val="1"/>
+              <w:numPr>
+                <w:ilvl w:val="1"/>
+                <w:numId w:val="67"/>
+              </w:numPr>
+              <w:spacing w:after="0" w:afterAutospacing="0" w:before="0" w:beforeAutospacing="0" w:lineRule="auto"/>
+              <w:ind w:left="1440" w:hanging="360"/>
+              <w:rPr>
+                <w:rFonts w:ascii="Times" w:cs="Times" w:eastAsia="Times" w:hAnsi="Times"/>
+                <w:sz w:val="24"/>
+                <w:szCs w:val="24"/>
+              </w:rPr>
+            </w:pPr>
+            <w:r>
+              <w:rPr>
+                <w:rFonts w:ascii="Times" w:cs="Times" w:eastAsia="Times" w:hAnsi="Times"/>
+                <w:sz w:val="24"/>
+                <w:szCs w:val="24"/>
+                <w:rtl w:val="0"/>
+              </w:rPr>
+              <w:t xml:space="preserve">Just add a status field to hotel queue items (e.g. pending, checked in, checked out, or follow the standard pending, in progress, completed, cancelled, no show like bookings queue)</w:t>
+            </w:r>
+          </w:p>
+          <w:p>
+            <w:pPr>
+              <w:keepNext w:val="1"/>
+              <w:keepLines w:val="1"/>
+              <w:numPr>
+                <w:ilvl w:val="1"/>
+                <w:numId w:val="67"/>
+              </w:numPr>
+              <w:spacing w:after="0" w:afterAutospacing="0" w:before="0" w:beforeAutospacing="0" w:lineRule="auto"/>
+              <w:ind w:left="1440" w:hanging="360"/>
+              <w:rPr>
+                <w:rFonts w:ascii="Times" w:cs="Times" w:eastAsia="Times" w:hAnsi="Times"/>
+                <w:sz w:val="24"/>
+                <w:szCs w:val="24"/>
+              </w:rPr>
+            </w:pPr>
+            <w:r>
+              <w:rPr>
+                <w:rFonts w:ascii="Times" w:cs="Times" w:eastAsia="Times" w:hAnsi="Times"/>
+                <w:sz w:val="24"/>
+                <w:szCs w:val="24"/>
+                <w:rtl w:val="0"/>
+              </w:rPr>
+              <w:t xml:space="preserve">Remove checkin/checkout buttons on each list item</w:t>
+            </w:r>
+          </w:p>
+          <w:p>
+            <w:pPr>
+              <w:keepNext w:val="1"/>
+              <w:keepLines w:val="1"/>
+              <w:numPr>
+                <w:ilvl w:val="1"/>
+                <w:numId w:val="67"/>
+              </w:numPr>
+              <w:spacing w:after="0" w:afterAutospacing="0" w:before="0" w:beforeAutospacing="0" w:lineRule="auto"/>
+              <w:ind w:left="1440" w:hanging="360"/>
+              <w:rPr>
+                <w:rFonts w:ascii="Times" w:cs="Times" w:eastAsia="Times" w:hAnsi="Times"/>
+                <w:sz w:val="24"/>
+                <w:szCs w:val="24"/>
+              </w:rPr>
+            </w:pPr>
+            <w:r>
+              <w:rPr>
+                <w:rFonts w:ascii="Times" w:cs="Times" w:eastAsia="Times" w:hAnsi="Times"/>
+                <w:sz w:val="24"/>
+                <w:szCs w:val="24"/>
+                <w:rtl w:val="0"/>
+              </w:rPr>
+              <w:t xml:space="preserve">Make it so that clicking on a pending list item opens the … view details to finalize hotel booking details</w:t>
+            </w:r>
+          </w:p>
+          <w:p>
+            <w:pPr>
+              <w:keepNext w:val="1"/>
+              <w:keepLines w:val="1"/>
+              <w:numPr>
+                <w:ilvl w:val="1"/>
+                <w:numId w:val="67"/>
+              </w:numPr>
+              <w:spacing w:after="0" w:afterAutospacing="0" w:before="0" w:beforeAutospacing="0" w:lineRule="auto"/>
+              <w:ind w:left="1440" w:hanging="360"/>
+              <w:rPr>
+                <w:rFonts w:ascii="Times" w:cs="Times" w:eastAsia="Times" w:hAnsi="Times"/>
+                <w:sz w:val="24"/>
+                <w:szCs w:val="24"/>
+              </w:rPr>
+            </w:pPr>
+            <w:r>
+              <w:rPr>
+                <w:rFonts w:ascii="Times" w:cs="Times" w:eastAsia="Times" w:hAnsi="Times"/>
+                <w:sz w:val="24"/>
+                <w:szCs w:val="24"/>
+                <w:rtl w:val="0"/>
+              </w:rPr>
+              <w:t xml:space="preserve">Clicking on a checked in pet opens a custom </w:t>
+            </w:r>
+            <w:hyperlink r:id="rId23">
               <w:r>
                 <w:rPr>
                   <w:rFonts w:ascii="Times" w:cs="Times" w:eastAsia="Times" w:hAnsi="Times"/>
@@ -8101,13 +8797,17 @@
                   <w:u w:val="single"/>
                   <w:rtl w:val="0"/>
                 </w:rPr>
-                <w:t xml:space="preserve">http://localhost:5173/staff/hotel/queue/check-in/e0aff74e-44e8-48a6-9007-008a7603a1a4</w:t>
+                <w:t xml:space="preserve">http://localhost:5173/staff/hotel/care-log</w:t>
               </w:r>
             </w:hyperlink>
             <w:r>
               <w:rPr>
-                <w:rtl w:val="0"/>
-              </w:rPr>
+                <w:rFonts w:ascii="Times" w:cs="Times" w:eastAsia="Times" w:hAnsi="Times"/>
+                <w:sz w:val="24"/>
+                <w:szCs w:val="24"/>
+                <w:rtl w:val="0"/>
+              </w:rPr>
+              <w:t xml:space="preserve"> page that only has the tasks filtered only for that pet</w:t>
             </w:r>
           </w:p>
           <w:p>
@@ -8133,29 +8833,7 @@
                 <w:szCs w:val="24"/>
                 <w:rtl w:val="0"/>
               </w:rPr>
-              <w:t xml:space="preserve">Move </w:t>
-            </w:r>
-            <w:hyperlink r:id="rId19">
-              <w:r>
-                <w:rPr>
-                  <w:rFonts w:ascii="Times" w:cs="Times" w:eastAsia="Times" w:hAnsi="Times"/>
-                  <w:color w:val="1155cc"/>
-                  <w:sz w:val="24"/>
-                  <w:szCs w:val="24"/>
-                  <w:u w:val="single"/>
-                  <w:rtl w:val="0"/>
-                </w:rPr>
-                <w:t xml:space="preserve">http://localhost:5173/staff/hotel/queue/check-in/e0aff74e-44e8-48a6-9007-008a7603a1a4</w:t>
-              </w:r>
-            </w:hyperlink>
-            <w:r>
-              <w:rPr>
-                <w:rFonts w:ascii="Times" w:cs="Times" w:eastAsia="Times" w:hAnsi="Times"/>
-                <w:sz w:val="24"/>
-                <w:szCs w:val="24"/>
-                <w:rtl w:val="0"/>
-              </w:rPr>
-              <w:t xml:space="preserve"> to the … button &gt; View booking details with an edit option at the bottom</w:t>
+              <w:t xml:space="preserve">Clicking on checked out pet does nothing</w:t>
             </w:r>
           </w:p>
           <w:p>
@@ -8166,34 +8844,8 @@
                 <w:ilvl w:val="1"/>
                 <w:numId w:val="67"/>
               </w:numPr>
-              <w:spacing w:after="0" w:afterAutospacing="0" w:before="0" w:beforeAutospacing="0" w:lineRule="auto"/>
+              <w:spacing w:after="240" w:before="0" w:beforeAutospacing="0" w:lineRule="auto"/>
               <w:ind w:left="1440" w:hanging="360"/>
-              <w:rPr>
-                <w:rFonts w:ascii="Times" w:cs="Times" w:eastAsia="Times" w:hAnsi="Times"/>
-                <w:sz w:val="24"/>
-                <w:szCs w:val="24"/>
-              </w:rPr>
-            </w:pPr>
-            <w:r>
-              <w:rPr>
-                <w:rFonts w:ascii="Times" w:cs="Times" w:eastAsia="Times" w:hAnsi="Times"/>
-                <w:sz w:val="24"/>
-                <w:szCs w:val="24"/>
-                <w:rtl w:val="0"/>
-              </w:rPr>
-              <w:t xml:space="preserve">Do not open this page with go to checkout and check in another pet options after checking it, just return to the queue and show a modal if success or fail</w:t>
-            </w:r>
-          </w:p>
-          <w:p>
-            <w:pPr>
-              <w:keepNext w:val="1"/>
-              <w:keepLines w:val="1"/>
-              <w:numPr>
-                <w:ilvl w:val="2"/>
-                <w:numId w:val="67"/>
-              </w:numPr>
-              <w:spacing w:after="240" w:before="0" w:beforeAutospacing="0" w:lineRule="auto"/>
-              <w:ind w:left="2160" w:hanging="360"/>
               <w:rPr>
                 <w:rFonts w:ascii="Times" w:cs="Times" w:eastAsia="Times" w:hAnsi="Times"/>
                 <w:sz w:val="24"/>
@@ -8208,18 +8860,18 @@
               </w:rPr>
               <w:drawing>
                 <wp:inline distB="114300" distT="114300" distL="114300" distR="114300">
-                  <wp:extent cx="3713979" cy="1994277"/>
+                  <wp:extent cx="4510753" cy="2431328"/>
                   <wp:effectExtent b="0" l="0" r="0" t="0"/>
-                  <wp:docPr id="14" name="image16.png"/>
+                  <wp:docPr id="4" name="image1.png"/>
                   <a:graphic>
                     <a:graphicData uri="http://schemas.openxmlformats.org/drawingml/2006/picture">
                       <pic:pic>
                         <pic:nvPicPr>
-                          <pic:cNvPr id="0" name="image16.png"/>
+                          <pic:cNvPr id="0" name="image1.png"/>
                           <pic:cNvPicPr preferRelativeResize="0"/>
                         </pic:nvPicPr>
                         <pic:blipFill>
-                          <a:blip r:embed="rId20"/>
+                          <a:blip r:embed="rId24"/>
                           <a:srcRect b="0" l="0" r="0" t="0"/>
                           <a:stretch>
                             <a:fillRect/>
@@ -8228,7 +8880,7 @@
                         <pic:spPr>
                           <a:xfrm>
                             <a:off x="0" y="0"/>
-                            <a:ext cx="3713979" cy="1994277"/>
+                            <a:ext cx="4510753" cy="2431328"/>
                           </a:xfrm>
                           <a:prstGeom prst="rect"/>
                           <a:ln/>
@@ -8245,6 +8897,24 @@
               </w:rPr>
             </w:r>
           </w:p>
+          <w:p>
+            <w:pPr>
+              <w:keepNext w:val="1"/>
+              <w:keepLines w:val="1"/>
+              <w:spacing w:after="240" w:before="240" w:lineRule="auto"/>
+              <w:ind w:left="720" w:hanging="360"/>
+              <w:rPr>
+                <w:rFonts w:ascii="Times" w:cs="Times" w:eastAsia="Times" w:hAnsi="Times"/>
+                <w:sz w:val="24"/>
+                <w:szCs w:val="24"/>
+              </w:rPr>
+            </w:pPr>
+            <w:r>
+              <w:rPr>
+                <w:rtl w:val="0"/>
+              </w:rPr>
+            </w:r>
+          </w:p>
         </w:tc>
         <w:tc>
           <w:tcPr/>
@@ -8261,7 +8931,7 @@
             <w:sdt>
               <w:sdtPr>
                 <w:alias w:val="Configuration 1"/>
-                <w:id w:val="-1757590214"/>
+                <w:id w:val="-1475200707"/>
                 <w:dropDownList w:lastValue="Medium">
                   <w:listItem w:displayText="Cakewalk" w:value="Cakewalk"/>
                   <w:listItem w:displayText="Easy" w:value="Easy"/>
@@ -8307,289 +8977,6 @@
                 <w:ilvl w:val="0"/>
                 <w:numId w:val="67"/>
               </w:numPr>
-              <w:spacing w:after="0" w:afterAutospacing="0" w:before="240" w:lineRule="auto"/>
-              <w:ind w:left="720" w:hanging="360"/>
-              <w:rPr>
-                <w:rFonts w:ascii="Times" w:cs="Times" w:eastAsia="Times" w:hAnsi="Times"/>
-                <w:sz w:val="24"/>
-                <w:szCs w:val="24"/>
-              </w:rPr>
-            </w:pPr>
-            <w:r>
-              <w:rPr>
-                <w:rFonts w:ascii="Times" w:cs="Times" w:eastAsia="Times" w:hAnsi="Times"/>
-                <w:sz w:val="24"/>
-                <w:szCs w:val="24"/>
-                <w:rtl w:val="0"/>
-              </w:rPr>
-              <w:t xml:space="preserve">On </w:t>
-            </w:r>
-            <w:hyperlink r:id="rId21">
-              <w:r>
-                <w:rPr>
-                  <w:rFonts w:ascii="Times" w:cs="Times" w:eastAsia="Times" w:hAnsi="Times"/>
-                  <w:color w:val="1155cc"/>
-                  <w:sz w:val="24"/>
-                  <w:szCs w:val="24"/>
-                  <w:u w:val="single"/>
-                  <w:rtl w:val="0"/>
-                </w:rPr>
-                <w:t xml:space="preserve">http://localhost:5173/staff/daycare/queue</w:t>
-              </w:r>
-            </w:hyperlink>
-            <w:r>
-              <w:rPr>
-                <w:rFonts w:ascii="Times" w:cs="Times" w:eastAsia="Times" w:hAnsi="Times"/>
-                <w:sz w:val="24"/>
-                <w:szCs w:val="24"/>
-                <w:rtl w:val="0"/>
-              </w:rPr>
-              <w:t xml:space="preserve">:</w:t>
-            </w:r>
-          </w:p>
-          <w:p>
-            <w:pPr>
-              <w:keepNext w:val="1"/>
-              <w:keepLines w:val="1"/>
-              <w:numPr>
-                <w:ilvl w:val="1"/>
-                <w:numId w:val="67"/>
-              </w:numPr>
-              <w:spacing w:after="0" w:afterAutospacing="0" w:before="0" w:beforeAutospacing="0" w:lineRule="auto"/>
-              <w:ind w:left="1440" w:hanging="360"/>
-              <w:rPr>
-                <w:rFonts w:ascii="Times" w:cs="Times" w:eastAsia="Times" w:hAnsi="Times"/>
-                <w:sz w:val="24"/>
-                <w:szCs w:val="24"/>
-              </w:rPr>
-            </w:pPr>
-            <w:r>
-              <w:rPr>
-                <w:rFonts w:ascii="Times" w:cs="Times" w:eastAsia="Times" w:hAnsi="Times"/>
-                <w:sz w:val="24"/>
-                <w:szCs w:val="24"/>
-                <w:rtl w:val="0"/>
-              </w:rPr>
-              <w:t xml:space="preserve">Remove checkin checkout subpages</w:t>
-            </w:r>
-          </w:p>
-          <w:p>
-            <w:pPr>
-              <w:keepNext w:val="1"/>
-              <w:keepLines w:val="1"/>
-              <w:numPr>
-                <w:ilvl w:val="1"/>
-                <w:numId w:val="67"/>
-              </w:numPr>
-              <w:spacing w:after="0" w:afterAutospacing="0" w:before="0" w:beforeAutospacing="0" w:lineRule="auto"/>
-              <w:ind w:left="1440" w:hanging="360"/>
-              <w:rPr>
-                <w:rFonts w:ascii="Times" w:cs="Times" w:eastAsia="Times" w:hAnsi="Times"/>
-                <w:sz w:val="24"/>
-                <w:szCs w:val="24"/>
-              </w:rPr>
-            </w:pPr>
-            <w:r>
-              <w:rPr>
-                <w:rFonts w:ascii="Times" w:cs="Times" w:eastAsia="Times" w:hAnsi="Times"/>
-                <w:sz w:val="24"/>
-                <w:szCs w:val="24"/>
-                <w:rtl w:val="0"/>
-              </w:rPr>
-              <w:t xml:space="preserve">Just add a status field to hotel queue items (e.g. pending, checked in, checked out, or follow the standard pending, in progress, completed, cancelled, no show like bookings queue)</w:t>
-            </w:r>
-          </w:p>
-          <w:p>
-            <w:pPr>
-              <w:keepNext w:val="1"/>
-              <w:keepLines w:val="1"/>
-              <w:numPr>
-                <w:ilvl w:val="1"/>
-                <w:numId w:val="67"/>
-              </w:numPr>
-              <w:spacing w:after="0" w:afterAutospacing="0" w:before="0" w:beforeAutospacing="0" w:lineRule="auto"/>
-              <w:ind w:left="1440" w:hanging="360"/>
-              <w:rPr>
-                <w:rFonts w:ascii="Times" w:cs="Times" w:eastAsia="Times" w:hAnsi="Times"/>
-                <w:sz w:val="24"/>
-                <w:szCs w:val="24"/>
-              </w:rPr>
-            </w:pPr>
-            <w:r>
-              <w:rPr>
-                <w:rFonts w:ascii="Times" w:cs="Times" w:eastAsia="Times" w:hAnsi="Times"/>
-                <w:sz w:val="24"/>
-                <w:szCs w:val="24"/>
-                <w:rtl w:val="0"/>
-              </w:rPr>
-              <w:t xml:space="preserve">Remove checkin/checkout buttons on each list item</w:t>
-            </w:r>
-          </w:p>
-          <w:p>
-            <w:pPr>
-              <w:keepNext w:val="1"/>
-              <w:keepLines w:val="1"/>
-              <w:numPr>
-                <w:ilvl w:val="1"/>
-                <w:numId w:val="67"/>
-              </w:numPr>
-              <w:spacing w:after="0" w:afterAutospacing="0" w:before="0" w:beforeAutospacing="0" w:lineRule="auto"/>
-              <w:ind w:left="1440" w:hanging="360"/>
-              <w:rPr>
-                <w:rFonts w:ascii="Times" w:cs="Times" w:eastAsia="Times" w:hAnsi="Times"/>
-                <w:sz w:val="24"/>
-                <w:szCs w:val="24"/>
-              </w:rPr>
-            </w:pPr>
-            <w:r>
-              <w:rPr>
-                <w:rFonts w:ascii="Times" w:cs="Times" w:eastAsia="Times" w:hAnsi="Times"/>
-                <w:sz w:val="24"/>
-                <w:szCs w:val="24"/>
-                <w:rtl w:val="0"/>
-              </w:rPr>
-              <w:t xml:space="preserve">Make it so that clicking on a pending list item opens the … view details to finalize hotel booking details</w:t>
-            </w:r>
-          </w:p>
-          <w:p>
-            <w:pPr>
-              <w:keepNext w:val="1"/>
-              <w:keepLines w:val="1"/>
-              <w:numPr>
-                <w:ilvl w:val="1"/>
-                <w:numId w:val="67"/>
-              </w:numPr>
-              <w:spacing w:after="0" w:afterAutospacing="0" w:before="0" w:beforeAutospacing="0" w:lineRule="auto"/>
-              <w:ind w:left="1440" w:hanging="360"/>
-              <w:rPr>
-                <w:rFonts w:ascii="Times" w:cs="Times" w:eastAsia="Times" w:hAnsi="Times"/>
-                <w:sz w:val="24"/>
-                <w:szCs w:val="24"/>
-              </w:rPr>
-            </w:pPr>
-            <w:r>
-              <w:rPr>
-                <w:rFonts w:ascii="Times" w:cs="Times" w:eastAsia="Times" w:hAnsi="Times"/>
-                <w:sz w:val="24"/>
-                <w:szCs w:val="24"/>
-                <w:rtl w:val="0"/>
-              </w:rPr>
-              <w:t xml:space="preserve">Clicking on a checked in pet opens a custom </w:t>
-            </w:r>
-            <w:hyperlink r:id="rId22">
-              <w:r>
-                <w:rPr>
-                  <w:rFonts w:ascii="Times" w:cs="Times" w:eastAsia="Times" w:hAnsi="Times"/>
-                  <w:color w:val="1155cc"/>
-                  <w:sz w:val="24"/>
-                  <w:szCs w:val="24"/>
-                  <w:u w:val="single"/>
-                  <w:rtl w:val="0"/>
-                </w:rPr>
-                <w:t xml:space="preserve">http://localhost:5173/staff/hotel/care-log</w:t>
-              </w:r>
-            </w:hyperlink>
-            <w:r>
-              <w:rPr>
-                <w:rFonts w:ascii="Times" w:cs="Times" w:eastAsia="Times" w:hAnsi="Times"/>
-                <w:sz w:val="24"/>
-                <w:szCs w:val="24"/>
-                <w:rtl w:val="0"/>
-              </w:rPr>
-              <w:t xml:space="preserve"> page that only has the tasks filtered only for that pet</w:t>
-            </w:r>
-          </w:p>
-          <w:p>
-            <w:pPr>
-              <w:keepNext w:val="1"/>
-              <w:keepLines w:val="1"/>
-              <w:numPr>
-                <w:ilvl w:val="1"/>
-                <w:numId w:val="67"/>
-              </w:numPr>
-              <w:spacing w:after="0" w:afterAutospacing="0" w:before="0" w:beforeAutospacing="0" w:lineRule="auto"/>
-              <w:ind w:left="1440" w:hanging="360"/>
-              <w:rPr>
-                <w:rFonts w:ascii="Times" w:cs="Times" w:eastAsia="Times" w:hAnsi="Times"/>
-                <w:sz w:val="24"/>
-                <w:szCs w:val="24"/>
-              </w:rPr>
-            </w:pPr>
-            <w:r>
-              <w:rPr>
-                <w:rFonts w:ascii="Times" w:cs="Times" w:eastAsia="Times" w:hAnsi="Times"/>
-                <w:sz w:val="24"/>
-                <w:szCs w:val="24"/>
-                <w:rtl w:val="0"/>
-              </w:rPr>
-              <w:t xml:space="preserve">Clicking on checked out pet does nothing</w:t>
-            </w:r>
-          </w:p>
-          <w:p>
-            <w:pPr>
-              <w:keepNext w:val="1"/>
-              <w:keepLines w:val="1"/>
-              <w:numPr>
-                <w:ilvl w:val="1"/>
-                <w:numId w:val="67"/>
-              </w:numPr>
-              <w:spacing w:after="240" w:before="0" w:beforeAutospacing="0" w:lineRule="auto"/>
-              <w:ind w:left="1440" w:hanging="360"/>
-              <w:rPr>
-                <w:rFonts w:ascii="Times" w:cs="Times" w:eastAsia="Times" w:hAnsi="Times"/>
-                <w:sz w:val="24"/>
-                <w:szCs w:val="24"/>
-              </w:rPr>
-            </w:pPr>
-            <w:r>
-              <w:rPr>
-                <w:rFonts w:ascii="Times" w:cs="Times" w:eastAsia="Times" w:hAnsi="Times"/>
-                <w:sz w:val="24"/>
-                <w:szCs w:val="24"/>
-              </w:rPr>
-              <w:drawing>
-                <wp:inline distB="114300" distT="114300" distL="114300" distR="114300">
-                  <wp:extent cx="4510753" cy="2431328"/>
-                  <wp:effectExtent b="0" l="0" r="0" t="0"/>
-                  <wp:docPr id="4" name="image4.png"/>
-                  <a:graphic>
-                    <a:graphicData uri="http://schemas.openxmlformats.org/drawingml/2006/picture">
-                      <pic:pic>
-                        <pic:nvPicPr>
-                          <pic:cNvPr id="0" name="image4.png"/>
-                          <pic:cNvPicPr preferRelativeResize="0"/>
-                        </pic:nvPicPr>
-                        <pic:blipFill>
-                          <a:blip r:embed="rId23"/>
-                          <a:srcRect b="0" l="0" r="0" t="0"/>
-                          <a:stretch>
-                            <a:fillRect/>
-                          </a:stretch>
-                        </pic:blipFill>
-                        <pic:spPr>
-                          <a:xfrm>
-                            <a:off x="0" y="0"/>
-                            <a:ext cx="4510753" cy="2431328"/>
-                          </a:xfrm>
-                          <a:prstGeom prst="rect"/>
-                          <a:ln/>
-                        </pic:spPr>
-                      </pic:pic>
-                    </a:graphicData>
-                  </a:graphic>
-                </wp:inline>
-              </w:drawing>
-            </w:r>
-            <w:r>
-              <w:rPr>
-                <w:rtl w:val="0"/>
-              </w:rPr>
-            </w:r>
-          </w:p>
-          <w:p>
-            <w:pPr>
-              <w:keepNext w:val="1"/>
-              <w:keepLines w:val="1"/>
               <w:spacing w:after="240" w:before="240" w:lineRule="auto"/>
               <w:ind w:left="720" w:hanging="360"/>
               <w:rPr>
@@ -8600,8 +8987,12 @@
             </w:pPr>
             <w:r>
               <w:rPr>
-                <w:rtl w:val="0"/>
-              </w:rPr>
+                <w:rFonts w:ascii="Times" w:cs="Times" w:eastAsia="Times" w:hAnsi="Times"/>
+                <w:sz w:val="24"/>
+                <w:szCs w:val="24"/>
+                <w:rtl w:val="0"/>
+              </w:rPr>
+              <w:t xml:space="preserve">Determine what dependencies or number or files that will be touched when we overhaul booking queue status field to unconfirmed &gt; confirmed &gt; completed/cancelled/no-show</w:t>
             </w:r>
           </w:p>
         </w:tc>
@@ -8620,87 +9011,7 @@
             <w:sdt>
               <w:sdtPr>
                 <w:alias w:val="Configuration 1"/>
-                <w:id w:val="1874593884"/>
-                <w:dropDownList w:lastValue="Medium">
-                  <w:listItem w:displayText="Cakewalk" w:value="Cakewalk"/>
-                  <w:listItem w:displayText="Easy" w:value="Easy"/>
-                  <w:listItem w:displayText="Medium" w:value="Medium"/>
-                  <w:listItem w:displayText="Hard" w:value="Hard"/>
-                  <w:listItem w:displayText="Unknown" w:value="Unknown"/>
-                </w:dropDownList>
-              </w:sdtPr>
-              <w:sdtContent>
-                <w:r>
-                  <w:rPr>
-                    <w:rFonts w:ascii="Times" w:cs="Times" w:eastAsia="Times" w:hAnsi="Times"/>
-                    <w:color w:val="473821"/>
-                    <w:sz w:val="24"/>
-                    <w:szCs w:val="24"/>
-                    <w:shd w:fill="ffe5a0" w:val="clear"/>
-                  </w:rPr>
-                  <w:t xml:space="preserve">Medium</w:t>
-                </w:r>
-              </w:sdtContent>
-            </w:sdt>
-            <w:r>
-              <w:rPr>
-                <w:rtl w:val="0"/>
-              </w:rPr>
-            </w:r>
-          </w:p>
-        </w:tc>
-      </w:tr>
-      <w:tr>
-        <w:trPr>
-          <w:cantSplit w:val="0"/>
-          <w:trHeight w:val="543" w:hRule="atLeast"/>
-          <w:tblHeader w:val="0"/>
-        </w:trPr>
-        <w:tc>
-          <w:tcPr/>
-          <w:p>
-            <w:pPr>
-              <w:keepNext w:val="1"/>
-              <w:keepLines w:val="1"/>
-              <w:numPr>
-                <w:ilvl w:val="0"/>
-                <w:numId w:val="67"/>
-              </w:numPr>
-              <w:spacing w:after="240" w:before="240" w:lineRule="auto"/>
-              <w:ind w:left="720" w:hanging="360"/>
-              <w:rPr>
-                <w:rFonts w:ascii="Times" w:cs="Times" w:eastAsia="Times" w:hAnsi="Times"/>
-                <w:sz w:val="24"/>
-                <w:szCs w:val="24"/>
-              </w:rPr>
-            </w:pPr>
-            <w:r>
-              <w:rPr>
-                <w:rFonts w:ascii="Times" w:cs="Times" w:eastAsia="Times" w:hAnsi="Times"/>
-                <w:sz w:val="24"/>
-                <w:szCs w:val="24"/>
-                <w:rtl w:val="0"/>
-              </w:rPr>
-              <w:t xml:space="preserve">Determine what dependencies or number or files that will be touched when we overhaul booking queue status field to unconfirmed &gt; confirmed &gt; completed/cancelled/no-show</w:t>
-            </w:r>
-          </w:p>
-        </w:tc>
-        <w:tc>
-          <w:tcPr/>
-          <w:p>
-            <w:pPr>
-              <w:widowControl w:val="0"/>
-              <w:spacing w:line="240" w:lineRule="auto"/>
-              <w:rPr>
-                <w:rFonts w:ascii="Times" w:cs="Times" w:eastAsia="Times" w:hAnsi="Times"/>
-                <w:sz w:val="24"/>
-                <w:szCs w:val="24"/>
-              </w:rPr>
-            </w:pPr>
-            <w:sdt>
-              <w:sdtPr>
-                <w:alias w:val="Configuration 1"/>
-                <w:id w:val="-1685209309"/>
+                <w:id w:val="1980453924"/>
                 <w:dropDownList w:lastValue="Unknown">
                   <w:listItem w:displayText="Cakewalk" w:value="Cakewalk"/>
                   <w:listItem w:displayText="Easy" w:value="Easy"/>
@@ -8780,7 +9091,7 @@
             <w:sdt>
               <w:sdtPr>
                 <w:alias w:val="Configuration 1"/>
-                <w:id w:val="757117053"/>
+                <w:id w:val="-1707845510"/>
                 <w:dropDownList w:lastValue="Unknown">
                   <w:listItem w:displayText="Cakewalk" w:value="Cakewalk"/>
                   <w:listItem w:displayText="Easy" w:value="Easy"/>
@@ -8864,7 +9175,7 @@
           <w:pgNumType w:start="1"/>
         </w:sectPr>
       </w:pPr>
-      <w:bookmarkStart w:colFirst="0" w:colLast="0" w:name="_zheuum9muhxm" w:id="6"/>
+      <w:bookmarkStart w:colFirst="0" w:colLast="0" w:name="_6gqnragitzq7" w:id="6"/>
       <w:bookmarkEnd w:id="6"/>
       <w:r>
         <w:rPr>
@@ -10381,7 +10692,7 @@
           <w:pgNumType w:start="1"/>
         </w:sectPr>
       </w:pPr>
-      <w:bookmarkStart w:colFirst="0" w:colLast="0" w:name="_lkjktg1ess2v" w:id="7"/>
+      <w:bookmarkStart w:colFirst="0" w:colLast="0" w:name="_7o22spm9qpr" w:id="7"/>
       <w:bookmarkEnd w:id="7"/>
       <w:r>
         <w:rPr>
@@ -10632,7 +10943,7 @@
       <w:pPr>
         <w:numPr>
           <w:ilvl w:val="0"/>
-          <w:numId w:val="22"/>
+          <w:numId w:val="23"/>
         </w:numPr>
         <w:spacing w:after="0" w:afterAutospacing="0" w:before="240" w:lineRule="auto"/>
         <w:ind w:left="720" w:hanging="360"/>
@@ -10676,7 +10987,7 @@
       <w:pPr>
         <w:numPr>
           <w:ilvl w:val="0"/>
-          <w:numId w:val="22"/>
+          <w:numId w:val="23"/>
         </w:numPr>
         <w:spacing w:after="0" w:afterAutospacing="0" w:before="0" w:beforeAutospacing="0" w:lineRule="auto"/>
         <w:ind w:left="720" w:hanging="360"/>
@@ -10692,7 +11003,7 @@
       <w:pPr>
         <w:numPr>
           <w:ilvl w:val="0"/>
-          <w:numId w:val="22"/>
+          <w:numId w:val="23"/>
         </w:numPr>
         <w:spacing w:after="240" w:before="0" w:beforeAutospacing="0" w:lineRule="auto"/>
         <w:ind w:left="720" w:hanging="360"/>
@@ -10736,7 +11047,7 @@
       <w:pPr>
         <w:numPr>
           <w:ilvl w:val="0"/>
-          <w:numId w:val="76"/>
+          <w:numId w:val="75"/>
         </w:numPr>
         <w:spacing w:after="0" w:afterAutospacing="0" w:before="240" w:lineRule="auto"/>
         <w:ind w:left="720" w:hanging="360"/>
@@ -10752,7 +11063,7 @@
       <w:pPr>
         <w:numPr>
           <w:ilvl w:val="0"/>
-          <w:numId w:val="76"/>
+          <w:numId w:val="75"/>
         </w:numPr>
         <w:spacing w:after="0" w:afterAutospacing="0" w:before="0" w:beforeAutospacing="0" w:lineRule="auto"/>
         <w:ind w:left="720" w:hanging="360"/>
@@ -10782,7 +11093,7 @@
       <w:pPr>
         <w:numPr>
           <w:ilvl w:val="0"/>
-          <w:numId w:val="76"/>
+          <w:numId w:val="75"/>
         </w:numPr>
         <w:spacing w:after="0" w:afterAutospacing="0" w:before="0" w:beforeAutospacing="0" w:lineRule="auto"/>
         <w:ind w:left="720" w:hanging="360"/>
@@ -10798,7 +11109,7 @@
       <w:pPr>
         <w:numPr>
           <w:ilvl w:val="1"/>
-          <w:numId w:val="76"/>
+          <w:numId w:val="75"/>
         </w:numPr>
         <w:spacing w:after="0" w:afterAutospacing="0" w:before="0" w:beforeAutospacing="0" w:lineRule="auto"/>
         <w:ind w:left="1440" w:hanging="360"/>
@@ -10822,7 +11133,7 @@
       <w:pPr>
         <w:numPr>
           <w:ilvl w:val="1"/>
-          <w:numId w:val="76"/>
+          <w:numId w:val="75"/>
         </w:numPr>
         <w:spacing w:after="0" w:afterAutospacing="0" w:before="0" w:beforeAutospacing="0" w:lineRule="auto"/>
         <w:ind w:left="1440" w:hanging="360"/>
@@ -10846,7 +11157,7 @@
       <w:pPr>
         <w:numPr>
           <w:ilvl w:val="1"/>
-          <w:numId w:val="76"/>
+          <w:numId w:val="75"/>
         </w:numPr>
         <w:spacing w:after="0" w:afterAutospacing="0" w:before="0" w:beforeAutospacing="0" w:lineRule="auto"/>
         <w:ind w:left="1440" w:hanging="360"/>
@@ -10870,7 +11181,7 @@
       <w:pPr>
         <w:numPr>
           <w:ilvl w:val="0"/>
-          <w:numId w:val="76"/>
+          <w:numId w:val="75"/>
         </w:numPr>
         <w:spacing w:after="240" w:before="0" w:beforeAutospacing="0" w:lineRule="auto"/>
         <w:ind w:left="720" w:hanging="360"/>
@@ -12319,7 +12630,7 @@
           <w:pgNumType w:start="1"/>
         </w:sectPr>
       </w:pPr>
-      <w:bookmarkStart w:colFirst="0" w:colLast="0" w:name="_vxjfde9h9jn2" w:id="20"/>
+      <w:bookmarkStart w:colFirst="0" w:colLast="0" w:name="_cc6lriipooqp" w:id="20"/>
       <w:bookmarkEnd w:id="20"/>
       <w:r>
         <w:rPr>
@@ -13609,7 +13920,7 @@
           <w:szCs w:val="32"/>
         </w:rPr>
       </w:pPr>
-      <w:bookmarkStart w:colFirst="0" w:colLast="0" w:name="_nl6t30qvl70l" w:id="21"/>
+      <w:bookmarkStart w:colFirst="0" w:colLast="0" w:name="_d3etffhqjipl" w:id="21"/>
       <w:bookmarkEnd w:id="21"/>
       <w:r>
         <w:rPr>
@@ -14317,7 +14628,7 @@
       <w:pPr>
         <w:numPr>
           <w:ilvl w:val="0"/>
-          <w:numId w:val="77"/>
+          <w:numId w:val="76"/>
         </w:numPr>
         <w:spacing w:after="0" w:afterAutospacing="0" w:line="240" w:lineRule="auto"/>
         <w:ind w:left="720" w:hanging="360"/>
@@ -14338,7 +14649,7 @@
       <w:pPr>
         <w:numPr>
           <w:ilvl w:val="0"/>
-          <w:numId w:val="77"/>
+          <w:numId w:val="76"/>
         </w:numPr>
         <w:spacing w:after="60" w:line="240" w:lineRule="auto"/>
         <w:ind w:left="720" w:hanging="360"/>
@@ -14503,7 +14814,7 @@
           <w:pgNumType w:start="1"/>
         </w:sectPr>
       </w:pPr>
-      <w:bookmarkStart w:colFirst="0" w:colLast="0" w:name="_e0e2duhec7yv" w:id="22"/>
+      <w:bookmarkStart w:colFirst="0" w:colLast="0" w:name="_58rpdq6lhs5x" w:id="22"/>
       <w:bookmarkEnd w:id="22"/>
       <w:r>
         <w:rPr>
@@ -14743,7 +15054,7 @@
             <w:sdt>
               <w:sdtPr>
                 <w:alias w:val="Configuration 1"/>
-                <w:id w:val="-738327521"/>
+                <w:id w:val="-383004340"/>
                 <w:dropDownList w:lastValue="Cakewalk">
                   <w:listItem w:displayText="Cakewalk" w:value="Cakewalk"/>
                   <w:listItem w:displayText="Easy" w:value="Easy"/>
@@ -14875,7 +15186,7 @@
             <w:sdt>
               <w:sdtPr>
                 <w:alias w:val="Configuration 1"/>
-                <w:id w:val="627429432"/>
+                <w:id w:val="1183860009"/>
                 <w:dropDownList w:lastValue="Medium">
                   <w:listItem w:displayText="Cakewalk" w:value="Cakewalk"/>
                   <w:listItem w:displayText="Easy" w:value="Easy"/>
@@ -14981,7 +15292,7 @@
             <w:sdt>
               <w:sdtPr>
                 <w:alias w:val="Configuration 1"/>
-                <w:id w:val="-1476283587"/>
+                <w:id w:val="1832414106"/>
                 <w:dropDownList w:lastValue="Medium">
                   <w:listItem w:displayText="Cakewalk" w:value="Cakewalk"/>
                   <w:listItem w:displayText="Easy" w:value="Easy"/>
@@ -15061,7 +15372,7 @@
             <w:sdt>
               <w:sdtPr>
                 <w:alias w:val="Configuration 1"/>
-                <w:id w:val="-1412921309"/>
+                <w:id w:val="257311350"/>
                 <w:dropDownList w:lastValue="Medium">
                   <w:listItem w:displayText="Cakewalk" w:value="Cakewalk"/>
                   <w:listItem w:displayText="Easy" w:value="Easy"/>
@@ -15219,7 +15530,7 @@
             <w:sdt>
               <w:sdtPr>
                 <w:alias w:val="Configuration 1"/>
-                <w:id w:val="318644586"/>
+                <w:id w:val="1526857226"/>
                 <w:dropDownList w:lastValue="Easy">
                   <w:listItem w:displayText="Cakewalk" w:value="Cakewalk"/>
                   <w:listItem w:displayText="Easy" w:value="Easy"/>
@@ -15351,7 +15662,7 @@
             <w:sdt>
               <w:sdtPr>
                 <w:alias w:val="Configuration 1"/>
-                <w:id w:val="-1087261323"/>
+                <w:id w:val="-1088929967"/>
                 <w:dropDownList w:lastValue="Medium">
                   <w:listItem w:displayText="Cakewalk" w:value="Cakewalk"/>
                   <w:listItem w:displayText="Easy" w:value="Easy"/>
@@ -15665,7 +15976,7 @@
             <w:sdt>
               <w:sdtPr>
                 <w:alias w:val="Configuration 1"/>
-                <w:id w:val="1024078393"/>
+                <w:id w:val="691331413"/>
                 <w:dropDownList w:lastValue="Hard">
                   <w:listItem w:displayText="Cakewalk" w:value="Cakewalk"/>
                   <w:listItem w:displayText="Easy" w:value="Easy"/>
@@ -15771,7 +16082,7 @@
             <w:sdt>
               <w:sdtPr>
                 <w:alias w:val="Configuration 1"/>
-                <w:id w:val="1137829439"/>
+                <w:id w:val="-698832579"/>
                 <w:dropDownList w:lastValue="Unknown">
                   <w:listItem w:displayText="Cakewalk" w:value="Cakewalk"/>
                   <w:listItem w:displayText="Easy" w:value="Easy"/>
@@ -15939,16 +16250,16 @@
                 <wp:inline distB="114300" distT="114300" distL="114300" distR="114300">
                   <wp:extent cx="4533179" cy="3087501"/>
                   <wp:effectExtent b="0" l="0" r="0" t="0"/>
-                  <wp:docPr id="7" name="image11.png"/>
+                  <wp:docPr id="6" name="image17.png"/>
                   <a:graphic>
                     <a:graphicData uri="http://schemas.openxmlformats.org/drawingml/2006/picture">
                       <pic:pic>
                         <pic:nvPicPr>
-                          <pic:cNvPr id="0" name="image11.png"/>
+                          <pic:cNvPr id="0" name="image17.png"/>
                           <pic:cNvPicPr preferRelativeResize="0"/>
                         </pic:nvPicPr>
                         <pic:blipFill>
-                          <a:blip r:embed="rId24"/>
+                          <a:blip r:embed="rId25"/>
                           <a:srcRect b="0" l="0" r="0" t="0"/>
                           <a:stretch>
                             <a:fillRect/>
@@ -15990,7 +16301,7 @@
             <w:sdt>
               <w:sdtPr>
                 <w:alias w:val="Configuration 1"/>
-                <w:id w:val="1416752487"/>
+                <w:id w:val="-1529560594"/>
                 <w:dropDownList w:lastValue="Medium">
                   <w:listItem w:displayText="Cakewalk" w:value="Cakewalk"/>
                   <w:listItem w:displayText="Easy" w:value="Easy"/>
@@ -16096,7 +16407,7 @@
             <w:sdt>
               <w:sdtPr>
                 <w:alias w:val="Configuration 1"/>
-                <w:id w:val="-1291542890"/>
+                <w:id w:val="-1907366939"/>
                 <w:dropDownList w:lastValue="Easy">
                   <w:listItem w:displayText="Cakewalk" w:value="Cakewalk"/>
                   <w:listItem w:displayText="Easy" w:value="Easy"/>
@@ -16140,7 +16451,7 @@
               <w:keepLines w:val="1"/>
               <w:numPr>
                 <w:ilvl w:val="0"/>
-                <w:numId w:val="75"/>
+                <w:numId w:val="77"/>
               </w:numPr>
               <w:spacing w:after="0" w:afterAutospacing="0" w:before="240" w:lineRule="auto"/>
               <w:ind w:left="720" w:hanging="360"/>
@@ -16157,7 +16468,7 @@
                 <w:szCs w:val="24"/>
                 <w:rtl w:val="0"/>
               </w:rPr>
-              <w:t xml:space="preserve">Fix unknown pet owner and unknown pet when viewing bookings as cashier</w:t>
+              <w:t xml:space="preserve">Add new promo step in booking process</w:t>
             </w:r>
           </w:p>
           <w:p>
@@ -16166,7 +16477,7 @@
               <w:keepLines w:val="1"/>
               <w:numPr>
                 <w:ilvl w:val="1"/>
-                <w:numId w:val="75"/>
+                <w:numId w:val="77"/>
               </w:numPr>
               <w:spacing w:after="240" w:before="0" w:beforeAutospacing="0" w:lineRule="auto"/>
               <w:ind w:left="1440" w:hanging="360"/>
@@ -16181,44 +16492,9 @@
                 <w:rFonts w:ascii="Times" w:cs="Times" w:eastAsia="Times" w:hAnsi="Times"/>
                 <w:sz w:val="24"/>
                 <w:szCs w:val="24"/>
-              </w:rPr>
-              <w:drawing>
-                <wp:inline distB="114300" distT="114300" distL="114300" distR="114300">
-                  <wp:extent cx="3978645" cy="1256079"/>
-                  <wp:effectExtent b="0" l="0" r="0" t="0"/>
-                  <wp:docPr id="16" name="image10.png"/>
-                  <a:graphic>
-                    <a:graphicData uri="http://schemas.openxmlformats.org/drawingml/2006/picture">
-                      <pic:pic>
-                        <pic:nvPicPr>
-                          <pic:cNvPr id="0" name="image10.png"/>
-                          <pic:cNvPicPr preferRelativeResize="0"/>
-                        </pic:nvPicPr>
-                        <pic:blipFill>
-                          <a:blip r:embed="rId25"/>
-                          <a:srcRect b="0" l="0" r="0" t="0"/>
-                          <a:stretch>
-                            <a:fillRect/>
-                          </a:stretch>
-                        </pic:blipFill>
-                        <pic:spPr>
-                          <a:xfrm>
-                            <a:off x="0" y="0"/>
-                            <a:ext cx="3978645" cy="1256079"/>
-                          </a:xfrm>
-                          <a:prstGeom prst="rect"/>
-                          <a:ln/>
-                        </pic:spPr>
-                      </pic:pic>
-                    </a:graphicData>
-                  </a:graphic>
-                </wp:inline>
-              </w:drawing>
-            </w:r>
-            <w:r>
-              <w:rPr>
-                <w:rtl w:val="0"/>
-              </w:rPr>
+                <w:rtl w:val="0"/>
+              </w:rPr>
+              <w:t xml:space="preserve">Receptionist/customer can choose their promos their before payment review step</w:t>
             </w:r>
           </w:p>
         </w:tc>
@@ -16237,7 +16513,7 @@
             <w:sdt>
               <w:sdtPr>
                 <w:alias w:val="Configuration 1"/>
-                <w:id w:val="643001300"/>
+                <w:id w:val="371179094"/>
                 <w:dropDownList w:lastValue="Easy">
                   <w:listItem w:displayText="Cakewalk" w:value="Cakewalk"/>
                   <w:listItem w:displayText="Easy" w:value="Easy"/>
@@ -16281,112 +16557,6 @@
               <w:keepLines w:val="1"/>
               <w:numPr>
                 <w:ilvl w:val="0"/>
-                <w:numId w:val="78"/>
-              </w:numPr>
-              <w:spacing w:after="0" w:afterAutospacing="0" w:before="240" w:lineRule="auto"/>
-              <w:ind w:left="720" w:hanging="360"/>
-              <w:rPr>
-                <w:rFonts w:ascii="Times" w:cs="Times" w:eastAsia="Times" w:hAnsi="Times"/>
-                <w:sz w:val="24"/>
-                <w:szCs w:val="24"/>
-              </w:rPr>
-            </w:pPr>
-            <w:r>
-              <w:rPr>
-                <w:rFonts w:ascii="Times" w:cs="Times" w:eastAsia="Times" w:hAnsi="Times"/>
-                <w:sz w:val="24"/>
-                <w:szCs w:val="24"/>
-                <w:rtl w:val="0"/>
-              </w:rPr>
-              <w:t xml:space="preserve">Add new promo step in booking process</w:t>
-            </w:r>
-          </w:p>
-          <w:p>
-            <w:pPr>
-              <w:keepNext w:val="1"/>
-              <w:keepLines w:val="1"/>
-              <w:numPr>
-                <w:ilvl w:val="1"/>
-                <w:numId w:val="78"/>
-              </w:numPr>
-              <w:spacing w:after="240" w:before="0" w:beforeAutospacing="0" w:lineRule="auto"/>
-              <w:ind w:left="1440" w:hanging="360"/>
-              <w:rPr>
-                <w:rFonts w:ascii="Times" w:cs="Times" w:eastAsia="Times" w:hAnsi="Times"/>
-                <w:sz w:val="24"/>
-                <w:szCs w:val="24"/>
-              </w:rPr>
-            </w:pPr>
-            <w:r>
-              <w:rPr>
-                <w:rFonts w:ascii="Times" w:cs="Times" w:eastAsia="Times" w:hAnsi="Times"/>
-                <w:sz w:val="24"/>
-                <w:szCs w:val="24"/>
-                <w:rtl w:val="0"/>
-              </w:rPr>
-              <w:t xml:space="preserve">Receptionist/customer can choose their promos their before payment review step</w:t>
-            </w:r>
-          </w:p>
-        </w:tc>
-        <w:tc>
-          <w:tcPr/>
-          <w:p>
-            <w:pPr>
-              <w:widowControl w:val="0"/>
-              <w:spacing w:line="240" w:lineRule="auto"/>
-              <w:rPr>
-                <w:rFonts w:ascii="Times" w:cs="Times" w:eastAsia="Times" w:hAnsi="Times"/>
-                <w:sz w:val="24"/>
-                <w:szCs w:val="24"/>
-              </w:rPr>
-            </w:pPr>
-            <w:sdt>
-              <w:sdtPr>
-                <w:alias w:val="Configuration 1"/>
-                <w:id w:val="-1749818009"/>
-                <w:dropDownList w:lastValue="Easy">
-                  <w:listItem w:displayText="Cakewalk" w:value="Cakewalk"/>
-                  <w:listItem w:displayText="Easy" w:value="Easy"/>
-                  <w:listItem w:displayText="Medium" w:value="Medium"/>
-                  <w:listItem w:displayText="Hard" w:value="Hard"/>
-                  <w:listItem w:displayText="Unknown" w:value="Unknown"/>
-                </w:dropDownList>
-              </w:sdtPr>
-              <w:sdtContent>
-                <w:r>
-                  <w:rPr>
-                    <w:rFonts w:ascii="Times" w:cs="Times" w:eastAsia="Times" w:hAnsi="Times"/>
-                    <w:color w:val="11734b"/>
-                    <w:sz w:val="24"/>
-                    <w:szCs w:val="24"/>
-                    <w:shd w:fill="d4edbc" w:val="clear"/>
-                  </w:rPr>
-                  <w:t xml:space="preserve">Easy</w:t>
-                </w:r>
-              </w:sdtContent>
-            </w:sdt>
-            <w:r>
-              <w:rPr>
-                <w:rtl w:val="0"/>
-              </w:rPr>
-            </w:r>
-          </w:p>
-        </w:tc>
-      </w:tr>
-      <w:tr>
-        <w:trPr>
-          <w:cantSplit w:val="0"/>
-          <w:trHeight w:val="543" w:hRule="atLeast"/>
-          <w:tblHeader w:val="0"/>
-        </w:trPr>
-        <w:tc>
-          <w:tcPr/>
-          <w:p>
-            <w:pPr>
-              <w:keepNext w:val="1"/>
-              <w:keepLines w:val="1"/>
-              <w:numPr>
-                <w:ilvl w:val="0"/>
                 <w:numId w:val="89"/>
               </w:numPr>
               <w:spacing w:after="0" w:afterAutospacing="0" w:before="240" w:lineRule="auto"/>
@@ -16475,7 +16645,7 @@
             <w:sdt>
               <w:sdtPr>
                 <w:alias w:val="Configuration 1"/>
-                <w:id w:val="-11322429"/>
+                <w:id w:val="639008898"/>
                 <w:dropDownList w:lastValue="Medium">
                   <w:listItem w:displayText="Cakewalk" w:value="Cakewalk"/>
                   <w:listItem w:displayText="Easy" w:value="Easy"/>
@@ -16633,7 +16803,7 @@
             <w:sdt>
               <w:sdtPr>
                 <w:alias w:val="Configuration 1"/>
-                <w:id w:val="-1964376767"/>
+                <w:id w:val="1536122302"/>
                 <w:dropDownList w:lastValue="Hard">
                   <w:listItem w:displayText="Cakewalk" w:value="Cakewalk"/>
                   <w:listItem w:displayText="Easy" w:value="Easy"/>
@@ -16749,12 +16919,12 @@
                 <wp:inline distB="114300" distT="114300" distL="114300" distR="114300">
                   <wp:extent cx="4480460" cy="2416428"/>
                   <wp:effectExtent b="0" l="0" r="0" t="0"/>
-                  <wp:docPr id="17" name="image7.png"/>
+                  <wp:docPr id="1" name="image3.png"/>
                   <a:graphic>
                     <a:graphicData uri="http://schemas.openxmlformats.org/drawingml/2006/picture">
                       <pic:pic>
                         <pic:nvPicPr>
-                          <pic:cNvPr id="0" name="image7.png"/>
+                          <pic:cNvPr id="0" name="image3.png"/>
                           <pic:cNvPicPr preferRelativeResize="0"/>
                         </pic:nvPicPr>
                         <pic:blipFill>
@@ -16800,7 +16970,7 @@
             <w:sdt>
               <w:sdtPr>
                 <w:alias w:val="Configuration 1"/>
-                <w:id w:val="-704183880"/>
+                <w:id w:val="1477521895"/>
                 <w:dropDownList w:lastValue="Easy">
                   <w:listItem w:displayText="Cakewalk" w:value="Cakewalk"/>
                   <w:listItem w:displayText="Easy" w:value="Easy"/>
@@ -16958,7 +17128,7 @@
             <w:sdt>
               <w:sdtPr>
                 <w:alias w:val="Configuration 1"/>
-                <w:id w:val="1536709595"/>
+                <w:id w:val="1013433740"/>
                 <w:dropDownList w:lastValue="Easy">
                   <w:listItem w:displayText="Cakewalk" w:value="Cakewalk"/>
                   <w:listItem w:displayText="Easy" w:value="Easy"/>
@@ -17090,7 +17260,7 @@
             <w:sdt>
               <w:sdtPr>
                 <w:alias w:val="Configuration 1"/>
-                <w:id w:val="894606419"/>
+                <w:id w:val="1025081232"/>
                 <w:dropDownList w:lastValue="Cakewalk">
                   <w:listItem w:displayText="Cakewalk" w:value="Cakewalk"/>
                   <w:listItem w:displayText="Easy" w:value="Easy"/>
@@ -17222,7 +17392,7 @@
             <w:sdt>
               <w:sdtPr>
                 <w:alias w:val="Configuration 1"/>
-                <w:id w:val="-1256889105"/>
+                <w:id w:val="211664645"/>
                 <w:dropDownList w:lastValue="Easy">
                   <w:listItem w:displayText="Cakewalk" w:value="Cakewalk"/>
                   <w:listItem w:displayText="Easy" w:value="Easy"/>
@@ -17354,7 +17524,7 @@
             <w:sdt>
               <w:sdtPr>
                 <w:alias w:val="Configuration 1"/>
-                <w:id w:val="1492331787"/>
+                <w:id w:val="-1760797865"/>
                 <w:dropDownList w:lastValue="Cakewalk">
                   <w:listItem w:displayText="Cakewalk" w:value="Cakewalk"/>
                   <w:listItem w:displayText="Easy" w:value="Easy"/>
@@ -17512,7 +17682,7 @@
             <w:sdt>
               <w:sdtPr>
                 <w:alias w:val="Configuration 1"/>
-                <w:id w:val="1471004755"/>
+                <w:id w:val="-684281709"/>
                 <w:dropDownList w:lastValue="Cakewalk">
                   <w:listItem w:displayText="Cakewalk" w:value="Cakewalk"/>
                   <w:listItem w:displayText="Easy" w:value="Easy"/>
@@ -17602,12 +17772,12 @@
                 <wp:inline distB="114300" distT="114300" distL="114300" distR="114300">
                   <wp:extent cx="3786188" cy="1765996"/>
                   <wp:effectExtent b="0" l="0" r="0" t="0"/>
-                  <wp:docPr id="1" name="image6.png"/>
+                  <wp:docPr id="2" name="image9.png"/>
                   <a:graphic>
                     <a:graphicData uri="http://schemas.openxmlformats.org/drawingml/2006/picture">
                       <pic:pic>
                         <pic:nvPicPr>
-                          <pic:cNvPr id="0" name="image6.png"/>
+                          <pic:cNvPr id="0" name="image9.png"/>
                           <pic:cNvPicPr preferRelativeResize="0"/>
                         </pic:nvPicPr>
                         <pic:blipFill>
@@ -17679,7 +17849,7 @@
             <w:sdt>
               <w:sdtPr>
                 <w:alias w:val="Configuration 1"/>
-                <w:id w:val="-439373649"/>
+                <w:id w:val="494765856"/>
                 <w:dropDownList w:lastValue="Easy">
                   <w:listItem w:displayText="Cakewalk" w:value="Cakewalk"/>
                   <w:listItem w:displayText="Easy" w:value="Easy"/>
@@ -17889,7 +18059,7 @@
             <w:sdt>
               <w:sdtPr>
                 <w:alias w:val="Configuration 1"/>
-                <w:id w:val="559547164"/>
+                <w:id w:val="2023810627"/>
                 <w:dropDownList w:lastValue="Hard">
                   <w:listItem w:displayText="Cakewalk" w:value="Cakewalk"/>
                   <w:listItem w:displayText="Easy" w:value="Easy"/>
@@ -17969,7 +18139,7 @@
             <w:sdt>
               <w:sdtPr>
                 <w:alias w:val="Configuration 1"/>
-                <w:id w:val="-497018147"/>
+                <w:id w:val="2072745302"/>
                 <w:dropDownList w:lastValue="Hard">
                   <w:listItem w:displayText="Cakewalk" w:value="Cakewalk"/>
                   <w:listItem w:displayText="Easy" w:value="Easy"/>
@@ -18127,7 +18297,7 @@
             <w:sdt>
               <w:sdtPr>
                 <w:alias w:val="Configuration 1"/>
-                <w:id w:val="553210992"/>
+                <w:id w:val="-1586851023"/>
                 <w:dropDownList w:lastValue="Medium">
                   <w:listItem w:displayText="Cakewalk" w:value="Cakewalk"/>
                   <w:listItem w:displayText="Easy" w:value="Easy"/>
@@ -18285,7 +18455,7 @@
             <w:sdt>
               <w:sdtPr>
                 <w:alias w:val="Configuration 1"/>
-                <w:id w:val="1762664516"/>
+                <w:id w:val="-108420327"/>
                 <w:dropDownList w:lastValue="Easy">
                   <w:listItem w:displayText="Cakewalk" w:value="Cakewalk"/>
                   <w:listItem w:displayText="Easy" w:value="Easy"/>
@@ -18443,7 +18613,7 @@
             <w:sdt>
               <w:sdtPr>
                 <w:alias w:val="Configuration 1"/>
-                <w:id w:val="-1574930257"/>
+                <w:id w:val="1701654909"/>
                 <w:dropDownList w:lastValue="Medium">
                   <w:listItem w:displayText="Cakewalk" w:value="Cakewalk"/>
                   <w:listItem w:displayText="Easy" w:value="Easy"/>
@@ -18523,7 +18693,7 @@
             <w:sdt>
               <w:sdtPr>
                 <w:alias w:val="Configuration 1"/>
-                <w:id w:val="-1216718154"/>
+                <w:id w:val="285963314"/>
                 <w:dropDownList w:lastValue="Easy">
                   <w:listItem w:displayText="Cakewalk" w:value="Cakewalk"/>
                   <w:listItem w:displayText="Easy" w:value="Easy"/>
@@ -18603,7 +18773,7 @@
             <w:sdt>
               <w:sdtPr>
                 <w:alias w:val="Configuration 1"/>
-                <w:id w:val="-1945943472"/>
+                <w:id w:val="-1846235920"/>
                 <w:dropDownList w:lastValue="Cakewalk">
                   <w:listItem w:displayText="Cakewalk" w:value="Cakewalk"/>
                   <w:listItem w:displayText="Easy" w:value="Easy"/>
@@ -18683,7 +18853,7 @@
             <w:sdt>
               <w:sdtPr>
                 <w:alias w:val="Configuration 1"/>
-                <w:id w:val="190243342"/>
+                <w:id w:val="1482661051"/>
                 <w:dropDownList w:lastValue="Unknown">
                   <w:listItem w:displayText="Cakewalk" w:value="Cakewalk"/>
                   <w:listItem w:displayText="Easy" w:value="Easy"/>
@@ -18761,7 +18931,7 @@
             <w:sdt>
               <w:sdtPr>
                 <w:alias w:val="Configuration 1"/>
-                <w:id w:val="-1912192233"/>
+                <w:id w:val="-2071180589"/>
                 <w:dropDownList w:lastValue="Medium">
                   <w:listItem w:displayText="Cakewalk" w:value="Cakewalk"/>
                   <w:listItem w:displayText="Easy" w:value="Easy"/>
@@ -18839,7 +19009,7 @@
             <w:sdt>
               <w:sdtPr>
                 <w:alias w:val="Configuration 1"/>
-                <w:id w:val="-1867298572"/>
+                <w:id w:val="-390746144"/>
                 <w:dropDownList w:lastValue="Hard">
                   <w:listItem w:displayText="Cakewalk" w:value="Cakewalk"/>
                   <w:listItem w:displayText="Easy" w:value="Easy"/>
@@ -18997,7 +19167,7 @@
             <w:sdt>
               <w:sdtPr>
                 <w:alias w:val="Configuration 1"/>
-                <w:id w:val="-884085209"/>
+                <w:id w:val="-1667333702"/>
                 <w:dropDownList w:lastValue="Easy">
                   <w:listItem w:displayText="Cakewalk" w:value="Cakewalk"/>
                   <w:listItem w:displayText="Easy" w:value="Easy"/>
@@ -27323,7 +27493,7 @@
     <w:lvl w:ilvl="1">
       <w:start w:val="1"/>
       <w:numFmt w:val="bullet"/>
-      <w:lvlText w:val="○"/>
+      <w:lvlText w:val="●"/>
       <w:lvlJc w:val="left"/>
       <w:pPr>
         <w:ind w:left="1440" w:hanging="360"/>
@@ -27335,7 +27505,7 @@
     <w:lvl w:ilvl="2">
       <w:start w:val="1"/>
       <w:numFmt w:val="bullet"/>
-      <w:lvlText w:val="■"/>
+      <w:lvlText w:val="●"/>
       <w:lvlJc w:val="left"/>
       <w:pPr>
         <w:ind w:left="2160" w:hanging="360"/>
@@ -27359,7 +27529,7 @@
     <w:lvl w:ilvl="4">
       <w:start w:val="1"/>
       <w:numFmt w:val="bullet"/>
-      <w:lvlText w:val="○"/>
+      <w:lvlText w:val="●"/>
       <w:lvlJc w:val="left"/>
       <w:pPr>
         <w:ind w:left="3600" w:hanging="360"/>
@@ -27371,7 +27541,7 @@
     <w:lvl w:ilvl="5">
       <w:start w:val="1"/>
       <w:numFmt w:val="bullet"/>
-      <w:lvlText w:val="■"/>
+      <w:lvlText w:val="●"/>
       <w:lvlJc w:val="left"/>
       <w:pPr>
         <w:ind w:left="4320" w:hanging="360"/>
@@ -27395,7 +27565,7 @@
     <w:lvl w:ilvl="7">
       <w:start w:val="1"/>
       <w:numFmt w:val="bullet"/>
-      <w:lvlText w:val="○"/>
+      <w:lvlText w:val="●"/>
       <w:lvlJc w:val="left"/>
       <w:pPr>
         <w:ind w:left="5760" w:hanging="360"/>
@@ -27407,7 +27577,7 @@
     <w:lvl w:ilvl="8">
       <w:start w:val="1"/>
       <w:numFmt w:val="bullet"/>
-      <w:lvlText w:val="■"/>
+      <w:lvlText w:val="●"/>
       <w:lvlJc w:val="left"/>
       <w:pPr>
         <w:ind w:left="6480" w:hanging="360"/>
@@ -27433,7 +27603,7 @@
     <w:lvl w:ilvl="1">
       <w:start w:val="1"/>
       <w:numFmt w:val="bullet"/>
-      <w:lvlText w:val="●"/>
+      <w:lvlText w:val="○"/>
       <w:lvlJc w:val="left"/>
       <w:pPr>
         <w:ind w:left="1440" w:hanging="360"/>
@@ -27445,7 +27615,7 @@
     <w:lvl w:ilvl="2">
       <w:start w:val="1"/>
       <w:numFmt w:val="bullet"/>
-      <w:lvlText w:val="●"/>
+      <w:lvlText w:val="■"/>
       <w:lvlJc w:val="left"/>
       <w:pPr>
         <w:ind w:left="2160" w:hanging="360"/>
@@ -27469,7 +27639,7 @@
     <w:lvl w:ilvl="4">
       <w:start w:val="1"/>
       <w:numFmt w:val="bullet"/>
-      <w:lvlText w:val="●"/>
+      <w:lvlText w:val="○"/>
       <w:lvlJc w:val="left"/>
       <w:pPr>
         <w:ind w:left="3600" w:hanging="360"/>
@@ -27481,7 +27651,7 @@
     <w:lvl w:ilvl="5">
       <w:start w:val="1"/>
       <w:numFmt w:val="bullet"/>
-      <w:lvlText w:val="●"/>
+      <w:lvlText w:val="■"/>
       <w:lvlJc w:val="left"/>
       <w:pPr>
         <w:ind w:left="4320" w:hanging="360"/>
@@ -27505,7 +27675,7 @@
     <w:lvl w:ilvl="7">
       <w:start w:val="1"/>
       <w:numFmt w:val="bullet"/>
-      <w:lvlText w:val="●"/>
+      <w:lvlText w:val="○"/>
       <w:lvlJc w:val="left"/>
       <w:pPr>
         <w:ind w:left="5760" w:hanging="360"/>
@@ -27517,7 +27687,7 @@
     <w:lvl w:ilvl="8">
       <w:start w:val="1"/>
       <w:numFmt w:val="bullet"/>
-      <w:lvlText w:val="●"/>
+      <w:lvlText w:val="■"/>
       <w:lvlJc w:val="left"/>
       <w:pPr>
         <w:ind w:left="6480" w:hanging="360"/>

</xml_diff>

<commit_message>
docs(golden-fur): mark "Change Resend to Brevo" done in the change history
Co-Authored-By: Claude Sonnet 5 <noreply@anthropic.com>
</commit_message>
<xml_diff>
--- a/Projects/golden-fur/shared/context/Architectural-Change-History.docx
+++ b/Projects/golden-fur/shared/context/Architectural-Change-History.docx
@@ -41,7 +41,7 @@
           <w:pgNumType w:start="1"/>
         </w:sectPr>
       </w:pPr>
-      <w:bookmarkStart w:colFirst="0" w:colLast="0" w:name="_47a6hokil3u6" w:id="0"/>
+      <w:bookmarkStart w:colFirst="0" w:colLast="0" w:name="_qpj3rrp63qw6" w:id="0"/>
       <w:bookmarkEnd w:id="0"/>
       <w:r>
         <w:rPr>
@@ -121,7 +121,7 @@
           <w:pgNumType w:start="1"/>
         </w:sectPr>
       </w:pPr>
-      <w:bookmarkStart w:colFirst="0" w:colLast="0" w:name="_8hw3qkujl9gu" w:id="1"/>
+      <w:bookmarkStart w:colFirst="0" w:colLast="0" w:name="_7de1gjy0taq6" w:id="1"/>
       <w:bookmarkEnd w:id="1"/>
       <w:r>
         <w:rPr>
@@ -216,7 +216,7 @@
             <w:sdt>
               <w:sdtPr>
                 <w:alias w:val="Project status"/>
-                <w:id w:val="-1287402599"/>
+                <w:id w:val="-812193524"/>
                 <w:dropDownList w:lastValue="Not Started">
                   <w:listItem w:displayText="Not Started" w:value="Not Started"/>
                   <w:listItem w:displayText="Blocked" w:value="Blocked"/>
@@ -254,7 +254,7 @@
               <w:keepLines w:val="1"/>
               <w:numPr>
                 <w:ilvl w:val="0"/>
-                <w:numId w:val="92"/>
+                <w:numId w:val="94"/>
               </w:numPr>
               <w:spacing w:after="240" w:before="240" w:lineRule="auto"/>
               <w:ind w:left="720" w:hanging="360"/>
@@ -291,7 +291,7 @@
             <w:sdt>
               <w:sdtPr>
                 <w:alias w:val="Assignee"/>
-                <w:id w:val="1431134177"/>
+                <w:id w:val="-1582859486"/>
                 <w:dropDownList w:lastValue="James">
                   <w:listItem w:displayText="None" w:value="None"/>
                   <w:listItem w:displayText="Alarie" w:value="Alarie"/>
@@ -342,7 +342,7 @@
             <w:sdt>
               <w:sdtPr>
                 <w:alias w:val="Project status"/>
-                <w:id w:val="1688845691"/>
+                <w:id w:val="-1942476656"/>
                 <w:dropDownList w:lastValue="Not Started">
                   <w:listItem w:displayText="Not Started" w:value="Not Started"/>
                   <w:listItem w:displayText="Blocked" w:value="Blocked"/>
@@ -380,9 +380,9 @@
               <w:keepLines w:val="1"/>
               <w:numPr>
                 <w:ilvl w:val="0"/>
-                <w:numId w:val="78"/>
+                <w:numId w:val="81"/>
               </w:numPr>
-              <w:spacing w:after="0" w:afterAutospacing="0" w:before="240" w:lineRule="auto"/>
+              <w:spacing w:after="0" w:afterAutospacing="0" w:before="240" w:line="240" w:lineRule="auto"/>
               <w:ind w:left="720" w:hanging="360"/>
               <w:rPr>
                 <w:rFonts w:ascii="Times" w:cs="Times" w:eastAsia="Times" w:hAnsi="Times"/>
@@ -397,7 +397,7 @@
                 <w:szCs w:val="24"/>
                 <w:rtl w:val="0"/>
               </w:rPr>
-              <w:t xml:space="preserve">Change Resend to Brevo in code</w:t>
+              <w:t xml:space="preserve">At customer account &gt; My Transactions:</w:t>
             </w:r>
           </w:p>
           <w:p>
@@ -406,9 +406,9 @@
               <w:keepLines w:val="1"/>
               <w:numPr>
                 <w:ilvl w:val="1"/>
-                <w:numId w:val="78"/>
+                <w:numId w:val="81"/>
               </w:numPr>
-              <w:spacing w:after="0" w:afterAutospacing="0" w:before="0" w:beforeAutospacing="0" w:lineRule="auto"/>
+              <w:spacing w:after="0" w:afterAutospacing="0" w:before="0" w:beforeAutospacing="0" w:line="240" w:lineRule="auto"/>
               <w:ind w:left="1440" w:hanging="360"/>
               <w:rPr>
                 <w:rFonts w:ascii="Times" w:cs="Times" w:eastAsia="Times" w:hAnsi="Times"/>
@@ -423,7 +423,7 @@
                 <w:szCs w:val="24"/>
                 <w:rtl w:val="0"/>
               </w:rPr>
-              <w:t xml:space="preserve">Free email</w:t>
+              <w:t xml:space="preserve">Clicking on a row opens up the booking details for that transactions</w:t>
             </w:r>
           </w:p>
           <w:p>
@@ -432,9 +432,9 @@
               <w:keepLines w:val="1"/>
               <w:numPr>
                 <w:ilvl w:val="1"/>
-                <w:numId w:val="78"/>
+                <w:numId w:val="81"/>
               </w:numPr>
-              <w:spacing w:after="0" w:afterAutospacing="0" w:before="0" w:beforeAutospacing="0" w:lineRule="auto"/>
+              <w:spacing w:after="240" w:before="0" w:beforeAutospacing="0" w:line="240" w:lineRule="auto"/>
               <w:ind w:left="1440" w:hanging="360"/>
               <w:rPr>
                 <w:rFonts w:ascii="Times" w:cs="Times" w:eastAsia="Times" w:hAnsi="Times"/>
@@ -447,35 +447,44 @@
                 <w:rFonts w:ascii="Times" w:cs="Times" w:eastAsia="Times" w:hAnsi="Times"/>
                 <w:sz w:val="24"/>
                 <w:szCs w:val="24"/>
-                <w:rtl w:val="0"/>
-              </w:rPr>
-              <w:t xml:space="preserve">No need for domain</w:t>
-            </w:r>
-          </w:p>
-          <w:p>
-            <w:pPr>
-              <w:keepNext w:val="1"/>
-              <w:keepLines w:val="1"/>
-              <w:numPr>
-                <w:ilvl w:val="1"/>
-                <w:numId w:val="78"/>
-              </w:numPr>
-              <w:spacing w:after="240" w:before="0" w:beforeAutospacing="0" w:lineRule="auto"/>
-              <w:ind w:left="1440" w:hanging="360"/>
-              <w:rPr>
-                <w:rFonts w:ascii="Times" w:cs="Times" w:eastAsia="Times" w:hAnsi="Times"/>
-                <w:sz w:val="24"/>
-                <w:szCs w:val="24"/>
-              </w:rPr>
-            </w:pPr>
-            <w:r>
-              <w:rPr>
-                <w:rFonts w:ascii="Times" w:cs="Times" w:eastAsia="Times" w:hAnsi="Times"/>
-                <w:sz w:val="24"/>
-                <w:szCs w:val="24"/>
-                <w:rtl w:val="0"/>
-              </w:rPr>
-              <w:t xml:space="preserve">create document in claude on how to setup step by step</w:t>
+              </w:rPr>
+              <w:drawing>
+                <wp:inline distB="114300" distT="114300" distL="114300" distR="114300">
+                  <wp:extent cx="2998773" cy="1416743"/>
+                  <wp:effectExtent b="0" l="0" r="0" t="0"/>
+                  <wp:docPr id="7" name="image8.png"/>
+                  <a:graphic>
+                    <a:graphicData uri="http://schemas.openxmlformats.org/drawingml/2006/picture">
+                      <pic:pic>
+                        <pic:nvPicPr>
+                          <pic:cNvPr id="0" name="image8.png"/>
+                          <pic:cNvPicPr preferRelativeResize="0"/>
+                        </pic:nvPicPr>
+                        <pic:blipFill>
+                          <a:blip r:embed="rId6"/>
+                          <a:srcRect b="0" l="0" r="0" t="0"/>
+                          <a:stretch>
+                            <a:fillRect/>
+                          </a:stretch>
+                        </pic:blipFill>
+                        <pic:spPr>
+                          <a:xfrm>
+                            <a:off x="0" y="0"/>
+                            <a:ext cx="2998773" cy="1416743"/>
+                          </a:xfrm>
+                          <a:prstGeom prst="rect"/>
+                          <a:ln/>
+                        </pic:spPr>
+                      </pic:pic>
+                    </a:graphicData>
+                  </a:graphic>
+                </wp:inline>
+              </w:drawing>
+            </w:r>
+            <w:r>
+              <w:rPr>
+                <w:rtl w:val="0"/>
+              </w:rPr>
             </w:r>
           </w:p>
         </w:tc>
@@ -495,8 +504,8 @@
             <w:sdt>
               <w:sdtPr>
                 <w:alias w:val="Assignee"/>
-                <w:id w:val="-1300270756"/>
-                <w:dropDownList w:lastValue="Matthew">
+                <w:id w:val="1939737838"/>
+                <w:dropDownList w:lastValue="James">
                   <w:listItem w:displayText="None" w:value="None"/>
                   <w:listItem w:displayText="Alarie" w:value="Alarie"/>
                   <w:listItem w:displayText="James" w:value="James"/>
@@ -507,12 +516,12 @@
                 <w:r>
                   <w:rPr>
                     <w:rFonts w:ascii="Times" w:cs="Times" w:eastAsia="Times" w:hAnsi="Times"/>
-                    <w:color w:val="11734b"/>
+                    <w:color w:val="473821"/>
                     <w:sz w:val="24"/>
                     <w:szCs w:val="24"/>
-                    <w:shd w:fill="d4edbc" w:val="clear"/>
+                    <w:shd w:fill="ffe5a0" w:val="clear"/>
                   </w:rPr>
-                  <w:t xml:space="preserve">Matthew</w:t>
+                  <w:t xml:space="preserve">James</w:t>
                 </w:r>
               </w:sdtContent>
             </w:sdt>
@@ -546,7 +555,7 @@
             <w:sdt>
               <w:sdtPr>
                 <w:alias w:val="Project status"/>
-                <w:id w:val="-1095092543"/>
+                <w:id w:val="-132848497"/>
                 <w:dropDownList w:lastValue="Not Started">
                   <w:listItem w:displayText="Not Started" w:value="Not Started"/>
                   <w:listItem w:displayText="Blocked" w:value="Blocked"/>
@@ -584,9 +593,9 @@
               <w:keepLines w:val="1"/>
               <w:numPr>
                 <w:ilvl w:val="0"/>
-                <w:numId w:val="79"/>
+                <w:numId w:val="49"/>
               </w:numPr>
-              <w:spacing w:after="0" w:afterAutospacing="0" w:before="240" w:line="240" w:lineRule="auto"/>
+              <w:spacing w:after="60" w:line="240" w:lineRule="auto"/>
               <w:ind w:left="720" w:hanging="360"/>
               <w:rPr>
                 <w:rFonts w:ascii="Times" w:cs="Times" w:eastAsia="Times" w:hAnsi="Times"/>
@@ -601,94 +610,7 @@
                 <w:szCs w:val="24"/>
                 <w:rtl w:val="0"/>
               </w:rPr>
-              <w:t xml:space="preserve">At customer account &gt; My Transactions:</w:t>
-            </w:r>
-          </w:p>
-          <w:p>
-            <w:pPr>
-              <w:keepNext w:val="1"/>
-              <w:keepLines w:val="1"/>
-              <w:numPr>
-                <w:ilvl w:val="1"/>
-                <w:numId w:val="79"/>
-              </w:numPr>
-              <w:spacing w:after="0" w:afterAutospacing="0" w:before="0" w:beforeAutospacing="0" w:line="240" w:lineRule="auto"/>
-              <w:ind w:left="1440" w:hanging="360"/>
-              <w:rPr>
-                <w:rFonts w:ascii="Times" w:cs="Times" w:eastAsia="Times" w:hAnsi="Times"/>
-                <w:sz w:val="24"/>
-                <w:szCs w:val="24"/>
-              </w:rPr>
-            </w:pPr>
-            <w:r>
-              <w:rPr>
-                <w:rFonts w:ascii="Times" w:cs="Times" w:eastAsia="Times" w:hAnsi="Times"/>
-                <w:sz w:val="24"/>
-                <w:szCs w:val="24"/>
-                <w:rtl w:val="0"/>
-              </w:rPr>
-              <w:t xml:space="preserve">Clicking on a row opens up the booking details for that transactions</w:t>
-            </w:r>
-          </w:p>
-          <w:p>
-            <w:pPr>
-              <w:keepNext w:val="1"/>
-              <w:keepLines w:val="1"/>
-              <w:numPr>
-                <w:ilvl w:val="1"/>
-                <w:numId w:val="79"/>
-              </w:numPr>
-              <w:spacing w:after="240" w:before="0" w:beforeAutospacing="0" w:line="240" w:lineRule="auto"/>
-              <w:ind w:left="1440" w:hanging="360"/>
-              <w:rPr>
-                <w:rFonts w:ascii="Times" w:cs="Times" w:eastAsia="Times" w:hAnsi="Times"/>
-                <w:sz w:val="24"/>
-                <w:szCs w:val="24"/>
-              </w:rPr>
-            </w:pPr>
-            <w:r>
-              <w:rPr>
-                <w:rFonts w:ascii="Times" w:cs="Times" w:eastAsia="Times" w:hAnsi="Times"/>
-                <w:sz w:val="24"/>
-                <w:szCs w:val="24"/>
-              </w:rPr>
-              <w:drawing>
-                <wp:inline distB="114300" distT="114300" distL="114300" distR="114300">
-                  <wp:extent cx="2998773" cy="1416743"/>
-                  <wp:effectExtent b="0" l="0" r="0" t="0"/>
-                  <wp:docPr id="7" name="image12.png"/>
-                  <a:graphic>
-                    <a:graphicData uri="http://schemas.openxmlformats.org/drawingml/2006/picture">
-                      <pic:pic>
-                        <pic:nvPicPr>
-                          <pic:cNvPr id="0" name="image12.png"/>
-                          <pic:cNvPicPr preferRelativeResize="0"/>
-                        </pic:nvPicPr>
-                        <pic:blipFill>
-                          <a:blip r:embed="rId6"/>
-                          <a:srcRect b="0" l="0" r="0" t="0"/>
-                          <a:stretch>
-                            <a:fillRect/>
-                          </a:stretch>
-                        </pic:blipFill>
-                        <pic:spPr>
-                          <a:xfrm>
-                            <a:off x="0" y="0"/>
-                            <a:ext cx="2998773" cy="1416743"/>
-                          </a:xfrm>
-                          <a:prstGeom prst="rect"/>
-                          <a:ln/>
-                        </pic:spPr>
-                      </pic:pic>
-                    </a:graphicData>
-                  </a:graphic>
-                </wp:inline>
-              </w:drawing>
-            </w:r>
-            <w:r>
-              <w:rPr>
-                <w:rtl w:val="0"/>
-              </w:rPr>
+              <w:t xml:space="preserve">Disable date options earlier than the booking's current effective date in the reschedule date picker.</w:t>
             </w:r>
           </w:p>
         </w:tc>
@@ -708,7 +630,7 @@
             <w:sdt>
               <w:sdtPr>
                 <w:alias w:val="Assignee"/>
-                <w:id w:val="2032983559"/>
+                <w:id w:val="367866621"/>
                 <w:dropDownList w:lastValue="James">
                   <w:listItem w:displayText="None" w:value="None"/>
                   <w:listItem w:displayText="Alarie" w:value="Alarie"/>
@@ -759,133 +681,7 @@
             <w:sdt>
               <w:sdtPr>
                 <w:alias w:val="Project status"/>
-                <w:id w:val="1566244471"/>
-                <w:dropDownList w:lastValue="Not Started">
-                  <w:listItem w:displayText="Not Started" w:value="Not Started"/>
-                  <w:listItem w:displayText="Blocked" w:value="Blocked"/>
-                  <w:listItem w:displayText="In Progress" w:value="In Progress"/>
-                  <w:listItem w:displayText="Completed" w:value="Completed"/>
-                  <w:listItem w:displayText="Reviewing" w:value="Reviewing"/>
-                  <w:listItem w:displayText="Merged" w:value="Merged"/>
-                </w:dropDownList>
-              </w:sdtPr>
-              <w:sdtContent>
-                <w:r>
-                  <w:rPr>
-                    <w:rFonts w:ascii="Times" w:cs="Times" w:eastAsia="Times" w:hAnsi="Times"/>
-                    <w:color w:val="3d3d3d"/>
-                    <w:sz w:val="24"/>
-                    <w:szCs w:val="24"/>
-                    <w:shd w:fill="e6e6e6" w:val="clear"/>
-                  </w:rPr>
-                  <w:t xml:space="preserve">Not Started</w:t>
-                </w:r>
-              </w:sdtContent>
-            </w:sdt>
-            <w:r>
-              <w:rPr>
-                <w:rtl w:val="0"/>
-              </w:rPr>
-            </w:r>
-          </w:p>
-        </w:tc>
-        <w:tc>
-          <w:tcPr/>
-          <w:p>
-            <w:pPr>
-              <w:keepNext w:val="1"/>
-              <w:keepLines w:val="1"/>
-              <w:numPr>
-                <w:ilvl w:val="0"/>
-                <w:numId w:val="49"/>
-              </w:numPr>
-              <w:spacing w:after="60" w:line="240" w:lineRule="auto"/>
-              <w:ind w:left="720" w:hanging="360"/>
-              <w:rPr>
-                <w:rFonts w:ascii="Times" w:cs="Times" w:eastAsia="Times" w:hAnsi="Times"/>
-                <w:sz w:val="24"/>
-                <w:szCs w:val="24"/>
-              </w:rPr>
-            </w:pPr>
-            <w:r>
-              <w:rPr>
-                <w:rFonts w:ascii="Times" w:cs="Times" w:eastAsia="Times" w:hAnsi="Times"/>
-                <w:sz w:val="24"/>
-                <w:szCs w:val="24"/>
-                <w:rtl w:val="0"/>
-              </w:rPr>
-              <w:t xml:space="preserve">Disable date options earlier than the booking's current effective date in the reschedule date picker.</w:t>
-            </w:r>
-          </w:p>
-        </w:tc>
-        <w:tc>
-          <w:tcPr/>
-          <w:p>
-            <w:pPr>
-              <w:keepNext w:val="1"/>
-              <w:keepLines w:val="1"/>
-              <w:spacing w:line="240" w:lineRule="auto"/>
-              <w:rPr>
-                <w:rFonts w:ascii="Times" w:cs="Times" w:eastAsia="Times" w:hAnsi="Times"/>
-                <w:sz w:val="24"/>
-                <w:szCs w:val="24"/>
-              </w:rPr>
-            </w:pPr>
-            <w:sdt>
-              <w:sdtPr>
-                <w:alias w:val="Assignee"/>
-                <w:id w:val="-186762144"/>
-                <w:dropDownList w:lastValue="James">
-                  <w:listItem w:displayText="None" w:value="None"/>
-                  <w:listItem w:displayText="Alarie" w:value="Alarie"/>
-                  <w:listItem w:displayText="James" w:value="James"/>
-                  <w:listItem w:displayText="Matthew" w:value="Matthew"/>
-                </w:dropDownList>
-              </w:sdtPr>
-              <w:sdtContent>
-                <w:r>
-                  <w:rPr>
-                    <w:rFonts w:ascii="Times" w:cs="Times" w:eastAsia="Times" w:hAnsi="Times"/>
-                    <w:color w:val="473821"/>
-                    <w:sz w:val="24"/>
-                    <w:szCs w:val="24"/>
-                    <w:shd w:fill="ffe5a0" w:val="clear"/>
-                  </w:rPr>
-                  <w:t xml:space="preserve">James</w:t>
-                </w:r>
-              </w:sdtContent>
-            </w:sdt>
-            <w:r>
-              <w:rPr>
-                <w:rtl w:val="0"/>
-              </w:rPr>
-            </w:r>
-          </w:p>
-        </w:tc>
-      </w:tr>
-      <w:tr>
-        <w:trPr>
-          <w:cantSplit w:val="0"/>
-          <w:trHeight w:val="543" w:hRule="atLeast"/>
-          <w:tblHeader w:val="0"/>
-        </w:trPr>
-        <w:tc>
-          <w:tcPr/>
-          <w:p>
-            <w:pPr>
-              <w:keepNext w:val="1"/>
-              <w:keepLines w:val="1"/>
-              <w:spacing w:line="240" w:lineRule="auto"/>
-              <w:rPr>
-                <w:rFonts w:ascii="Times" w:cs="Times" w:eastAsia="Times" w:hAnsi="Times"/>
-                <w:sz w:val="24"/>
-                <w:szCs w:val="24"/>
-              </w:rPr>
-            </w:pPr>
-            <w:sdt>
-              <w:sdtPr>
-                <w:alias w:val="Project status"/>
-                <w:id w:val="1293074711"/>
+                <w:id w:val="-1473714219"/>
                 <w:dropDownList w:lastValue="In Progress">
                   <w:listItem w:displayText="Not Started" w:value="Not Started"/>
                   <w:listItem w:displayText="Blocked" w:value="Blocked"/>
@@ -923,7 +719,7 @@
               <w:keepLines w:val="1"/>
               <w:numPr>
                 <w:ilvl w:val="0"/>
-                <w:numId w:val="86"/>
+                <w:numId w:val="80"/>
               </w:numPr>
               <w:spacing w:after="0" w:afterAutospacing="0" w:before="240" w:lineRule="auto"/>
               <w:ind w:left="720" w:hanging="360"/>
@@ -940,7 +736,7 @@
                 <w:szCs w:val="24"/>
                 <w:rtl w:val="0"/>
               </w:rPr>
-              <w:t xml:space="preserve">Currently, the new bundled booking feature allows selection of the same staff (from staff picker) on the same date/time</w:t>
+              <w:t xml:space="preserve">Audit repo to change Resend to Brevo</w:t>
             </w:r>
           </w:p>
           <w:p>
@@ -949,7 +745,7 @@
               <w:keepLines w:val="1"/>
               <w:numPr>
                 <w:ilvl w:val="1"/>
-                <w:numId w:val="86"/>
+                <w:numId w:val="80"/>
               </w:numPr>
               <w:spacing w:after="0" w:afterAutospacing="0" w:before="0" w:beforeAutospacing="0" w:lineRule="auto"/>
               <w:ind w:left="1440" w:hanging="360"/>
@@ -966,7 +762,7 @@
                 <w:szCs w:val="24"/>
                 <w:rtl w:val="0"/>
               </w:rPr>
-              <w:t xml:space="preserve">Determine if staff assignment is 1 = 1 (e.g. 1 groomer = 1 pet only) or 1 = many (e.g. 1 groomer = 2 pets)</w:t>
+              <w:t xml:space="preserve">Optimize all email API features, perhaps there’s some bugs that drain the 300 email daily limit for Brevo</w:t>
             </w:r>
           </w:p>
           <w:p>
@@ -975,7 +771,159 @@
               <w:keepLines w:val="1"/>
               <w:numPr>
                 <w:ilvl w:val="1"/>
-                <w:numId w:val="86"/>
+                <w:numId w:val="80"/>
+              </w:numPr>
+              <w:spacing w:after="240" w:before="0" w:beforeAutospacing="0" w:lineRule="auto"/>
+              <w:ind w:left="1440" w:hanging="360"/>
+              <w:rPr>
+                <w:rFonts w:ascii="Times" w:cs="Times" w:eastAsia="Times" w:hAnsi="Times"/>
+                <w:sz w:val="24"/>
+                <w:szCs w:val="24"/>
+              </w:rPr>
+            </w:pPr>
+            <w:r>
+              <w:rPr>
+                <w:rFonts w:ascii="Times" w:cs="Times" w:eastAsia="Times" w:hAnsi="Times"/>
+                <w:sz w:val="24"/>
+                <w:szCs w:val="24"/>
+                <w:rtl w:val="0"/>
+              </w:rPr>
+              <w:t xml:space="preserve">Make sure to capture all email features and change it to Brevo</w:t>
+            </w:r>
+          </w:p>
+        </w:tc>
+        <w:tc>
+          <w:tcPr/>
+          <w:p>
+            <w:pPr>
+              <w:keepNext w:val="1"/>
+              <w:keepLines w:val="1"/>
+              <w:spacing w:line="240" w:lineRule="auto"/>
+              <w:rPr>
+                <w:rFonts w:ascii="Times" w:cs="Times" w:eastAsia="Times" w:hAnsi="Times"/>
+                <w:sz w:val="24"/>
+                <w:szCs w:val="24"/>
+              </w:rPr>
+            </w:pPr>
+            <w:sdt>
+              <w:sdtPr>
+                <w:alias w:val="Assignee"/>
+                <w:id w:val="848999053"/>
+                <w:dropDownList w:lastValue="Matthew">
+                  <w:listItem w:displayText="None" w:value="None"/>
+                  <w:listItem w:displayText="Alarie" w:value="Alarie"/>
+                  <w:listItem w:displayText="James" w:value="James"/>
+                  <w:listItem w:displayText="Matthew" w:value="Matthew"/>
+                </w:dropDownList>
+              </w:sdtPr>
+              <w:sdtContent>
+                <w:r>
+                  <w:rPr>
+                    <w:rFonts w:ascii="Times" w:cs="Times" w:eastAsia="Times" w:hAnsi="Times"/>
+                    <w:color w:val="11734b"/>
+                    <w:sz w:val="24"/>
+                    <w:szCs w:val="24"/>
+                    <w:shd w:fill="d4edbc" w:val="clear"/>
+                  </w:rPr>
+                  <w:t xml:space="preserve">Matthew</w:t>
+                </w:r>
+              </w:sdtContent>
+            </w:sdt>
+            <w:r>
+              <w:rPr>
+                <w:rtl w:val="0"/>
+              </w:rPr>
+            </w:r>
+          </w:p>
+        </w:tc>
+      </w:tr>
+      <w:tr>
+        <w:trPr>
+          <w:cantSplit w:val="0"/>
+          <w:trHeight w:val="543" w:hRule="atLeast"/>
+          <w:tblHeader w:val="0"/>
+        </w:trPr>
+        <w:tc>
+          <w:tcPr/>
+          <w:p>
+            <w:pPr>
+              <w:keepNext w:val="1"/>
+              <w:keepLines w:val="1"/>
+              <w:spacing w:line="240" w:lineRule="auto"/>
+              <w:rPr>
+                <w:rFonts w:ascii="Times" w:cs="Times" w:eastAsia="Times" w:hAnsi="Times"/>
+                <w:sz w:val="24"/>
+                <w:szCs w:val="24"/>
+              </w:rPr>
+            </w:pPr>
+            <w:sdt>
+              <w:sdtPr>
+                <w:alias w:val="Project status"/>
+                <w:id w:val="1438358205"/>
+                <w:dropDownList w:lastValue="Merged">
+                  <w:listItem w:displayText="Not Started" w:value="Not Started"/>
+                  <w:listItem w:displayText="Blocked" w:value="Blocked"/>
+                  <w:listItem w:displayText="In Progress" w:value="In Progress"/>
+                  <w:listItem w:displayText="Completed" w:value="Completed"/>
+                  <w:listItem w:displayText="Reviewing" w:value="Reviewing"/>
+                  <w:listItem w:displayText="Merged" w:value="Merged"/>
+                </w:dropDownList>
+              </w:sdtPr>
+              <w:sdtContent>
+                <w:r>
+                  <w:rPr>
+                    <w:rFonts w:ascii="Times" w:cs="Times" w:eastAsia="Times" w:hAnsi="Times"/>
+                    <w:color w:val="5a3286"/>
+                    <w:sz w:val="24"/>
+                    <w:szCs w:val="24"/>
+                    <w:shd w:fill="e6cff2" w:val="clear"/>
+                  </w:rPr>
+                  <w:t xml:space="preserve">Merged</w:t>
+                </w:r>
+              </w:sdtContent>
+            </w:sdt>
+            <w:r>
+              <w:rPr>
+                <w:rtl w:val="0"/>
+              </w:rPr>
+            </w:r>
+          </w:p>
+        </w:tc>
+        <w:tc>
+          <w:tcPr/>
+          <w:p>
+            <w:pPr>
+              <w:keepNext w:val="1"/>
+              <w:keepLines w:val="1"/>
+              <w:numPr>
+                <w:ilvl w:val="0"/>
+                <w:numId w:val="88"/>
+              </w:numPr>
+              <w:spacing w:after="0" w:afterAutospacing="0" w:before="240" w:lineRule="auto"/>
+              <w:ind w:left="720" w:hanging="360"/>
+              <w:rPr>
+                <w:rFonts w:ascii="Times" w:cs="Times" w:eastAsia="Times" w:hAnsi="Times"/>
+                <w:sz w:val="24"/>
+                <w:szCs w:val="24"/>
+              </w:rPr>
+            </w:pPr>
+            <w:r>
+              <w:rPr>
+                <w:rFonts w:ascii="Times" w:cs="Times" w:eastAsia="Times" w:hAnsi="Times"/>
+                <w:sz w:val="24"/>
+                <w:szCs w:val="24"/>
+                <w:rtl w:val="0"/>
+              </w:rPr>
+              <w:t xml:space="preserve">Currently, the new bundled booking feature allows selection of the same staff (from staff picker) on the same date/time</w:t>
+            </w:r>
+          </w:p>
+          <w:p>
+            <w:pPr>
+              <w:keepNext w:val="1"/>
+              <w:keepLines w:val="1"/>
+              <w:numPr>
+                <w:ilvl w:val="1"/>
+                <w:numId w:val="88"/>
               </w:numPr>
               <w:spacing w:after="0" w:afterAutospacing="0" w:before="0" w:beforeAutospacing="0" w:lineRule="auto"/>
               <w:ind w:left="1440" w:hanging="360"/>
@@ -992,7 +940,7 @@
                 <w:szCs w:val="24"/>
                 <w:rtl w:val="0"/>
               </w:rPr>
-              <w:t xml:space="preserve">Sample booking chose groomer 1 for both Luna and Cooper on same date 11 AM</w:t>
+              <w:t xml:space="preserve">Determine if staff assignment is 1 = 1 (e.g. 1 groomer = 1 pet only) or 1 = many (e.g. 1 groomer = 2 pets)</w:t>
             </w:r>
           </w:p>
           <w:p>
@@ -1001,7 +949,33 @@
               <w:keepLines w:val="1"/>
               <w:numPr>
                 <w:ilvl w:val="1"/>
-                <w:numId w:val="86"/>
+                <w:numId w:val="88"/>
+              </w:numPr>
+              <w:spacing w:after="0" w:afterAutospacing="0" w:before="0" w:beforeAutospacing="0" w:lineRule="auto"/>
+              <w:ind w:left="1440" w:hanging="360"/>
+              <w:rPr>
+                <w:rFonts w:ascii="Times" w:cs="Times" w:eastAsia="Times" w:hAnsi="Times"/>
+                <w:sz w:val="24"/>
+                <w:szCs w:val="24"/>
+              </w:rPr>
+            </w:pPr>
+            <w:r>
+              <w:rPr>
+                <w:rFonts w:ascii="Times" w:cs="Times" w:eastAsia="Times" w:hAnsi="Times"/>
+                <w:sz w:val="24"/>
+                <w:szCs w:val="24"/>
+                <w:rtl w:val="0"/>
+              </w:rPr>
+              <w:t xml:space="preserve">Sample booking chose groomer 1 for both Luna and Cooper on same date 11 AM</w:t>
+            </w:r>
+          </w:p>
+          <w:p>
+            <w:pPr>
+              <w:keepNext w:val="1"/>
+              <w:keepLines w:val="1"/>
+              <w:numPr>
+                <w:ilvl w:val="1"/>
+                <w:numId w:val="88"/>
               </w:numPr>
               <w:spacing w:after="0" w:afterAutospacing="0" w:before="0" w:beforeAutospacing="0" w:lineRule="auto"/>
               <w:ind w:left="1440" w:hanging="360"/>
@@ -1021,12 +995,12 @@
                 <wp:inline distB="114300" distT="114300" distL="114300" distR="114300">
                   <wp:extent cx="3592766" cy="1752746"/>
                   <wp:effectExtent b="0" l="0" r="0" t="0"/>
-                  <wp:docPr id="14" name="image14.png"/>
+                  <wp:docPr id="15" name="image15.png"/>
                   <a:graphic>
                     <a:graphicData uri="http://schemas.openxmlformats.org/drawingml/2006/picture">
                       <pic:pic>
                         <pic:nvPicPr>
-                          <pic:cNvPr id="0" name="image14.png"/>
+                          <pic:cNvPr id="0" name="image15.png"/>
                           <pic:cNvPicPr preferRelativeResize="0"/>
                         </pic:nvPicPr>
                         <pic:blipFill>
@@ -1062,7 +1036,7 @@
               <w:keepLines w:val="1"/>
               <w:numPr>
                 <w:ilvl w:val="1"/>
-                <w:numId w:val="86"/>
+                <w:numId w:val="88"/>
               </w:numPr>
               <w:spacing w:after="240" w:before="0" w:beforeAutospacing="0" w:lineRule="auto"/>
               <w:ind w:left="1440" w:hanging="360"/>
@@ -1099,7 +1073,7 @@
             <w:sdt>
               <w:sdtPr>
                 <w:alias w:val="Assignee"/>
-                <w:id w:val="2145644319"/>
+                <w:id w:val="-746373759"/>
                 <w:dropDownList w:lastValue="Matthew">
                   <w:listItem w:displayText="None" w:value="None"/>
                   <w:listItem w:displayText="Alarie" w:value="Alarie"/>
@@ -1150,8 +1124,8 @@
             <w:sdt>
               <w:sdtPr>
                 <w:alias w:val="Project status"/>
-                <w:id w:val="-444781305"/>
-                <w:dropDownList w:lastValue="In Progress">
+                <w:id w:val="-1398563844"/>
+                <w:dropDownList w:lastValue="Merged">
                   <w:listItem w:displayText="Not Started" w:value="Not Started"/>
                   <w:listItem w:displayText="Blocked" w:value="Blocked"/>
                   <w:listItem w:displayText="In Progress" w:value="In Progress"/>
@@ -1164,12 +1138,12 @@
                 <w:r>
                   <w:rPr>
                     <w:rFonts w:ascii="Times" w:cs="Times" w:eastAsia="Times" w:hAnsi="Times"/>
-                    <w:color w:val="473821"/>
+                    <w:color w:val="5a3286"/>
                     <w:sz w:val="24"/>
                     <w:szCs w:val="24"/>
-                    <w:shd w:fill="ffe5a0" w:val="clear"/>
+                    <w:shd w:fill="e6cff2" w:val="clear"/>
                   </w:rPr>
-                  <w:t xml:space="preserve">In Progress</w:t>
+                  <w:t xml:space="preserve">Merged</w:t>
                 </w:r>
               </w:sdtContent>
             </w:sdt>
@@ -1286,12 +1260,12 @@
                 <wp:inline distB="114300" distT="114300" distL="114300" distR="114300">
                   <wp:extent cx="3738812" cy="3714896"/>
                   <wp:effectExtent b="0" l="0" r="0" t="0"/>
-                  <wp:docPr id="16" name="image8.png"/>
+                  <wp:docPr id="10" name="image10.png"/>
                   <a:graphic>
                     <a:graphicData uri="http://schemas.openxmlformats.org/drawingml/2006/picture">
                       <pic:pic>
                         <pic:nvPicPr>
-                          <pic:cNvPr id="0" name="image8.png"/>
+                          <pic:cNvPr id="0" name="image10.png"/>
                           <pic:cNvPicPr preferRelativeResize="0"/>
                         </pic:nvPicPr>
                         <pic:blipFill>
@@ -1416,7 +1390,7 @@
             <w:sdt>
               <w:sdtPr>
                 <w:alias w:val="Assignee"/>
-                <w:id w:val="-35423677"/>
+                <w:id w:val="784685816"/>
                 <w:dropDownList w:lastValue="Matthew">
                   <w:listItem w:displayText="None" w:value="None"/>
                   <w:listItem w:displayText="Alarie" w:value="Alarie"/>
@@ -1467,7 +1441,7 @@
             <w:sdt>
               <w:sdtPr>
                 <w:alias w:val="Project status"/>
-                <w:id w:val="1191719512"/>
+                <w:id w:val="-513151375"/>
                 <w:dropDownList w:lastValue="Merged">
                   <w:listItem w:displayText="Not Started" w:value="Not Started"/>
                   <w:listItem w:displayText="Blocked" w:value="Blocked"/>
@@ -1603,12 +1577,12 @@
                 <wp:inline distB="114300" distT="114300" distL="114300" distR="114300">
                   <wp:extent cx="3805238" cy="1344437"/>
                   <wp:effectExtent b="0" l="0" r="0" t="0"/>
-                  <wp:docPr id="11" name="image10.png"/>
+                  <wp:docPr id="12" name="image14.png"/>
                   <a:graphic>
                     <a:graphicData uri="http://schemas.openxmlformats.org/drawingml/2006/picture">
                       <pic:pic>
                         <pic:nvPicPr>
-                          <pic:cNvPr id="0" name="image10.png"/>
+                          <pic:cNvPr id="0" name="image14.png"/>
                           <pic:cNvPicPr preferRelativeResize="0"/>
                         </pic:nvPicPr>
                         <pic:blipFill>
@@ -1681,7 +1655,7 @@
             <w:sdt>
               <w:sdtPr>
                 <w:alias w:val="Assignee"/>
-                <w:id w:val="-1432022929"/>
+                <w:id w:val="987606394"/>
                 <w:dropDownList w:lastValue="Matthew">
                   <w:listItem w:displayText="None" w:value="None"/>
                   <w:listItem w:displayText="Alarie" w:value="Alarie"/>
@@ -1732,7 +1706,7 @@
             <w:sdt>
               <w:sdtPr>
                 <w:alias w:val="Project status"/>
-                <w:id w:val="-1521931985"/>
+                <w:id w:val="990373767"/>
                 <w:dropDownList w:lastValue="Merged">
                   <w:listItem w:displayText="Not Started" w:value="Not Started"/>
                   <w:listItem w:displayText="Blocked" w:value="Blocked"/>
@@ -1770,7 +1744,7 @@
               <w:keepLines w:val="1"/>
               <w:numPr>
                 <w:ilvl w:val="0"/>
-                <w:numId w:val="80"/>
+                <w:numId w:val="82"/>
               </w:numPr>
               <w:spacing w:after="0" w:afterAutospacing="0" w:before="240" w:lineRule="auto"/>
               <w:ind w:left="720" w:hanging="360"/>
@@ -1796,7 +1770,7 @@
               <w:keepLines w:val="1"/>
               <w:numPr>
                 <w:ilvl w:val="1"/>
-                <w:numId w:val="80"/>
+                <w:numId w:val="82"/>
               </w:numPr>
               <w:spacing w:after="240" w:before="0" w:beforeAutospacing="0" w:lineRule="auto"/>
               <w:ind w:left="1440" w:hanging="360"/>
@@ -1816,12 +1790,12 @@
                 <wp:inline distB="114300" distT="114300" distL="114300" distR="114300">
                   <wp:extent cx="3760413" cy="1187499"/>
                   <wp:effectExtent b="0" l="0" r="0" t="0"/>
-                  <wp:docPr id="5" name="image5.png"/>
+                  <wp:docPr id="8" name="image7.png"/>
                   <a:graphic>
                     <a:graphicData uri="http://schemas.openxmlformats.org/drawingml/2006/picture">
                       <pic:pic>
                         <pic:nvPicPr>
-                          <pic:cNvPr id="0" name="image5.png"/>
+                          <pic:cNvPr id="0" name="image7.png"/>
                           <pic:cNvPicPr preferRelativeResize="0"/>
                         </pic:nvPicPr>
                         <pic:blipFill>
@@ -1868,7 +1842,7 @@
             <w:sdt>
               <w:sdtPr>
                 <w:alias w:val="Assignee"/>
-                <w:id w:val="-253588358"/>
+                <w:id w:val="-913060106"/>
                 <w:dropDownList w:lastValue="Matthew">
                   <w:listItem w:displayText="None" w:value="None"/>
                   <w:listItem w:displayText="Alarie" w:value="Alarie"/>
@@ -1951,7 +1925,7 @@
           <w:pgNumType w:start="1"/>
         </w:sectPr>
       </w:pPr>
-      <w:bookmarkStart w:colFirst="0" w:colLast="0" w:name="_kun5rp65rfpd" w:id="2"/>
+      <w:bookmarkStart w:colFirst="0" w:colLast="0" w:name="_jlu1zhdrhl1b" w:id="2"/>
       <w:bookmarkEnd w:id="2"/>
       <w:r>
         <w:rPr>
@@ -2623,7 +2597,7 @@
             <w:sdt>
               <w:sdtPr>
                 <w:alias w:val="Assignee"/>
-                <w:id w:val="-1001323271"/>
+                <w:id w:val="-668761815"/>
                 <w:dropDownList w:lastValue="Matthew">
                   <w:listItem w:displayText="None" w:value="None"/>
                   <w:listItem w:displayText="Alarie" w:value="Alarie"/>
@@ -2666,7 +2640,7 @@
               <w:keepLines w:val="1"/>
               <w:numPr>
                 <w:ilvl w:val="0"/>
-                <w:numId w:val="87"/>
+                <w:numId w:val="89"/>
               </w:numPr>
               <w:spacing w:after="0" w:afterAutospacing="0" w:before="240" w:line="240" w:lineRule="auto"/>
               <w:ind w:left="720" w:hanging="360"/>
@@ -2692,7 +2666,7 @@
               <w:keepLines w:val="1"/>
               <w:numPr>
                 <w:ilvl w:val="0"/>
-                <w:numId w:val="87"/>
+                <w:numId w:val="89"/>
               </w:numPr>
               <w:spacing w:after="0" w:afterAutospacing="0" w:before="0" w:beforeAutospacing="0" w:line="240" w:lineRule="auto"/>
               <w:ind w:left="720" w:hanging="360"/>
@@ -2718,7 +2692,7 @@
               <w:keepLines w:val="1"/>
               <w:numPr>
                 <w:ilvl w:val="1"/>
-                <w:numId w:val="87"/>
+                <w:numId w:val="89"/>
               </w:numPr>
               <w:spacing w:after="0" w:afterAutospacing="0" w:before="0" w:beforeAutospacing="0" w:line="240" w:lineRule="auto"/>
               <w:ind w:left="1440" w:hanging="360"/>
@@ -2744,7 +2718,7 @@
               <w:keepLines w:val="1"/>
               <w:numPr>
                 <w:ilvl w:val="0"/>
-                <w:numId w:val="87"/>
+                <w:numId w:val="89"/>
               </w:numPr>
               <w:spacing w:after="240" w:before="0" w:beforeAutospacing="0" w:line="240" w:lineRule="auto"/>
               <w:ind w:left="720" w:hanging="360"/>
@@ -2781,7 +2755,7 @@
             <w:sdt>
               <w:sdtPr>
                 <w:alias w:val="Assignee"/>
-                <w:id w:val="1341096784"/>
+                <w:id w:val="-1415329124"/>
                 <w:dropDownList w:lastValue="Matthew">
                   <w:listItem w:displayText="None" w:value="None"/>
                   <w:listItem w:displayText="Alarie" w:value="Alarie"/>
@@ -2870,7 +2844,7 @@
                 <wp:inline distB="114300" distT="114300" distL="114300" distR="114300">
                   <wp:extent cx="3355311" cy="2120187"/>
                   <wp:effectExtent b="0" l="0" r="0" t="0"/>
-                  <wp:docPr id="17" name="image13.png"/>
+                  <wp:docPr id="14" name="image13.png"/>
                   <a:graphic>
                     <a:graphicData uri="http://schemas.openxmlformats.org/drawingml/2006/picture">
                       <pic:pic>
@@ -2922,7 +2896,7 @@
             <w:sdt>
               <w:sdtPr>
                 <w:alias w:val="Assignee"/>
-                <w:id w:val="-1502016254"/>
+                <w:id w:val="858641602"/>
                 <w:dropDownList w:lastValue="Matthew">
                   <w:listItem w:displayText="None" w:value="None"/>
                   <w:listItem w:displayText="Alarie" w:value="Alarie"/>
@@ -3054,7 +3028,7 @@
             <w:sdt>
               <w:sdtPr>
                 <w:alias w:val="Assignee"/>
-                <w:id w:val="-889044653"/>
+                <w:id w:val="1232500210"/>
                 <w:dropDownList w:lastValue="Matthew">
                   <w:listItem w:displayText="None" w:value="None"/>
                   <w:listItem w:displayText="Alarie" w:value="Alarie"/>
@@ -3097,7 +3071,7 @@
               <w:keepLines w:val="1"/>
               <w:numPr>
                 <w:ilvl w:val="0"/>
-                <w:numId w:val="91"/>
+                <w:numId w:val="93"/>
               </w:numPr>
               <w:spacing w:after="0" w:afterAutospacing="0" w:line="240" w:lineRule="auto"/>
               <w:ind w:left="720" w:hanging="360"/>
@@ -3123,7 +3097,7 @@
               <w:keepLines w:val="1"/>
               <w:numPr>
                 <w:ilvl w:val="1"/>
-                <w:numId w:val="91"/>
+                <w:numId w:val="93"/>
               </w:numPr>
               <w:spacing w:after="0" w:afterAutospacing="0" w:line="240" w:lineRule="auto"/>
               <w:ind w:left="1440" w:hanging="360"/>
@@ -3149,7 +3123,7 @@
               <w:keepLines w:val="1"/>
               <w:numPr>
                 <w:ilvl w:val="1"/>
-                <w:numId w:val="91"/>
+                <w:numId w:val="93"/>
               </w:numPr>
               <w:spacing w:after="0" w:afterAutospacing="0" w:line="240" w:lineRule="auto"/>
               <w:ind w:left="1440" w:hanging="360"/>
@@ -3175,7 +3149,7 @@
               <w:keepLines w:val="1"/>
               <w:numPr>
                 <w:ilvl w:val="1"/>
-                <w:numId w:val="91"/>
+                <w:numId w:val="93"/>
               </w:numPr>
               <w:spacing w:after="0" w:afterAutospacing="0" w:line="240" w:lineRule="auto"/>
               <w:ind w:left="1440" w:hanging="360"/>
@@ -3201,7 +3175,7 @@
               <w:keepLines w:val="1"/>
               <w:numPr>
                 <w:ilvl w:val="1"/>
-                <w:numId w:val="91"/>
+                <w:numId w:val="93"/>
               </w:numPr>
               <w:spacing w:after="0" w:afterAutospacing="0" w:line="240" w:lineRule="auto"/>
               <w:ind w:left="1440" w:hanging="360"/>
@@ -3227,7 +3201,7 @@
               <w:keepLines w:val="1"/>
               <w:numPr>
                 <w:ilvl w:val="1"/>
-                <w:numId w:val="91"/>
+                <w:numId w:val="93"/>
               </w:numPr>
               <w:spacing w:after="0" w:afterAutospacing="0" w:line="240" w:lineRule="auto"/>
               <w:ind w:left="1440" w:hanging="360"/>
@@ -3247,12 +3221,12 @@
                 <wp:inline distB="114300" distT="114300" distL="114300" distR="114300">
                   <wp:extent cx="2676582" cy="1445703"/>
                   <wp:effectExtent b="0" l="0" r="0" t="0"/>
-                  <wp:docPr id="10" name="image7.png"/>
+                  <wp:docPr id="3" name="image3.png"/>
                   <a:graphic>
                     <a:graphicData uri="http://schemas.openxmlformats.org/drawingml/2006/picture">
                       <pic:pic>
                         <pic:nvPicPr>
-                          <pic:cNvPr id="0" name="image7.png"/>
+                          <pic:cNvPr id="0" name="image3.png"/>
                           <pic:cNvPicPr preferRelativeResize="0"/>
                         </pic:nvPicPr>
                         <pic:blipFill>
@@ -3288,7 +3262,7 @@
               <w:keepLines w:val="1"/>
               <w:numPr>
                 <w:ilvl w:val="1"/>
-                <w:numId w:val="91"/>
+                <w:numId w:val="93"/>
               </w:numPr>
               <w:spacing w:after="0" w:afterAutospacing="0" w:line="240" w:lineRule="auto"/>
               <w:ind w:left="1440" w:hanging="360"/>
@@ -3314,7 +3288,7 @@
               <w:keepLines w:val="1"/>
               <w:numPr>
                 <w:ilvl w:val="1"/>
-                <w:numId w:val="91"/>
+                <w:numId w:val="93"/>
               </w:numPr>
               <w:spacing w:after="60" w:line="240" w:lineRule="auto"/>
               <w:ind w:left="1440" w:hanging="360"/>
@@ -3334,12 +3308,12 @@
                 <wp:inline distB="114300" distT="114300" distL="114300" distR="114300">
                   <wp:extent cx="3228375" cy="2408571"/>
                   <wp:effectExtent b="0" l="0" r="0" t="0"/>
-                  <wp:docPr id="13" name="image2.png"/>
+                  <wp:docPr id="6" name="image5.png"/>
                   <a:graphic>
                     <a:graphicData uri="http://schemas.openxmlformats.org/drawingml/2006/picture">
                       <pic:pic>
                         <pic:nvPicPr>
-                          <pic:cNvPr id="0" name="image2.png"/>
+                          <pic:cNvPr id="0" name="image5.png"/>
                           <pic:cNvPicPr preferRelativeResize="0"/>
                         </pic:nvPicPr>
                         <pic:blipFill>
@@ -3386,7 +3360,7 @@
             <w:sdt>
               <w:sdtPr>
                 <w:alias w:val="Assignee"/>
-                <w:id w:val="-1570983188"/>
+                <w:id w:val="1509567866"/>
                 <w:dropDownList w:lastValue="Matthew">
                   <w:listItem w:displayText="None" w:value="None"/>
                   <w:listItem w:displayText="Alarie" w:value="Alarie"/>
@@ -3596,7 +3570,7 @@
             <w:sdt>
               <w:sdtPr>
                 <w:alias w:val="Assignee"/>
-                <w:id w:val="1343482475"/>
+                <w:id w:val="-73461917"/>
                 <w:dropDownList w:lastValue="Matthew">
                   <w:listItem w:displayText="None" w:value="None"/>
                   <w:listItem w:displayText="Alarie" w:value="Alarie"/>
@@ -3806,7 +3780,7 @@
             <w:sdt>
               <w:sdtPr>
                 <w:alias w:val="Assignee"/>
-                <w:id w:val="1251519122"/>
+                <w:id w:val="-1887308044"/>
                 <w:dropDownList w:lastValue="Alarie">
                   <w:listItem w:displayText="None" w:value="None"/>
                   <w:listItem w:displayText="Alarie" w:value="Alarie"/>
@@ -3973,12 +3947,12 @@
                 <wp:inline distB="114300" distT="114300" distL="114300" distR="114300">
                   <wp:extent cx="2951586" cy="1507875"/>
                   <wp:effectExtent b="0" l="0" r="0" t="0"/>
-                  <wp:docPr id="15" name="image4.png"/>
+                  <wp:docPr id="2" name="image2.png"/>
                   <a:graphic>
                     <a:graphicData uri="http://schemas.openxmlformats.org/drawingml/2006/picture">
                       <pic:pic>
                         <pic:nvPicPr>
-                          <pic:cNvPr id="0" name="image4.png"/>
+                          <pic:cNvPr id="0" name="image2.png"/>
                           <pic:cNvPicPr preferRelativeResize="0"/>
                         </pic:nvPicPr>
                         <pic:blipFill>
@@ -4034,12 +4008,12 @@
                 <wp:inline distB="114300" distT="114300" distL="114300" distR="114300">
                   <wp:extent cx="3475403" cy="2394500"/>
                   <wp:effectExtent b="0" l="0" r="0" t="0"/>
-                  <wp:docPr id="8" name="image6.png"/>
+                  <wp:docPr id="11" name="image11.png"/>
                   <a:graphic>
                     <a:graphicData uri="http://schemas.openxmlformats.org/drawingml/2006/picture">
                       <pic:pic>
                         <pic:nvPicPr>
-                          <pic:cNvPr id="0" name="image6.png"/>
+                          <pic:cNvPr id="0" name="image11.png"/>
                           <pic:cNvPicPr preferRelativeResize="0"/>
                         </pic:nvPicPr>
                         <pic:blipFill>
@@ -4104,7 +4078,7 @@
             <w:sdt>
               <w:sdtPr>
                 <w:alias w:val="Assignee"/>
-                <w:id w:val="-379609606"/>
+                <w:id w:val="1169843030"/>
                 <w:dropDownList w:lastValue="Alarie">
                   <w:listItem w:displayText="None" w:value="None"/>
                   <w:listItem w:displayText="Alarie" w:value="Alarie"/>
@@ -4147,7 +4121,7 @@
               <w:keepLines w:val="1"/>
               <w:numPr>
                 <w:ilvl w:val="0"/>
-                <w:numId w:val="68"/>
+                <w:numId w:val="69"/>
               </w:numPr>
               <w:spacing w:after="0" w:afterAutospacing="0" w:line="240" w:lineRule="auto"/>
               <w:ind w:left="720" w:hanging="360"/>
@@ -4173,7 +4147,7 @@
               <w:keepLines w:val="1"/>
               <w:numPr>
                 <w:ilvl w:val="1"/>
-                <w:numId w:val="68"/>
+                <w:numId w:val="69"/>
               </w:numPr>
               <w:spacing w:after="0" w:afterAutospacing="0" w:line="240" w:lineRule="auto"/>
               <w:ind w:left="1440" w:hanging="360"/>
@@ -4199,7 +4173,7 @@
               <w:keepLines w:val="1"/>
               <w:numPr>
                 <w:ilvl w:val="1"/>
-                <w:numId w:val="68"/>
+                <w:numId w:val="69"/>
               </w:numPr>
               <w:spacing w:after="60" w:line="240" w:lineRule="auto"/>
               <w:ind w:left="1440" w:hanging="360"/>
@@ -4219,12 +4193,12 @@
                 <wp:inline distB="114300" distT="114300" distL="114300" distR="114300">
                   <wp:extent cx="3411649" cy="1858705"/>
                   <wp:effectExtent b="0" l="0" r="0" t="0"/>
-                  <wp:docPr id="12" name="image11.png"/>
+                  <wp:docPr id="4" name="image6.png"/>
                   <a:graphic>
                     <a:graphicData uri="http://schemas.openxmlformats.org/drawingml/2006/picture">
                       <pic:pic>
                         <pic:nvPicPr>
-                          <pic:cNvPr id="0" name="image11.png"/>
+                          <pic:cNvPr id="0" name="image6.png"/>
                           <pic:cNvPicPr preferRelativeResize="0"/>
                         </pic:nvPicPr>
                         <pic:blipFill>
@@ -4271,7 +4245,7 @@
             <w:sdt>
               <w:sdtPr>
                 <w:alias w:val="Assignee"/>
-                <w:id w:val="-1725690607"/>
+                <w:id w:val="1877371805"/>
                 <w:dropDownList w:lastValue="James">
                   <w:listItem w:displayText="None" w:value="None"/>
                   <w:listItem w:displayText="Alarie" w:value="Alarie"/>
@@ -4377,7 +4351,7 @@
             <w:sdt>
               <w:sdtPr>
                 <w:alias w:val="Assignee"/>
-                <w:id w:val="-531672205"/>
+                <w:id w:val="1192313021"/>
                 <w:dropDownList w:lastValue="Alarie">
                   <w:listItem w:displayText="None" w:value="None"/>
                   <w:listItem w:displayText="Alarie" w:value="Alarie"/>
@@ -4456,7 +4430,7 @@
             <w:sdt>
               <w:sdtPr>
                 <w:alias w:val="Assignee"/>
-                <w:id w:val="-1972883330"/>
+                <w:id w:val="-1123126373"/>
                 <w:dropDownList w:lastValue="Alarie">
                   <w:listItem w:displayText="None" w:value="None"/>
                   <w:listItem w:displayText="Alarie" w:value="Alarie"/>
@@ -4498,7 +4472,7 @@
               <w:keepLines w:val="1"/>
               <w:numPr>
                 <w:ilvl w:val="0"/>
-                <w:numId w:val="95"/>
+                <w:numId w:val="97"/>
               </w:numPr>
               <w:spacing w:after="60" w:line="240" w:lineRule="auto"/>
               <w:ind w:left="720" w:hanging="360"/>
@@ -4535,7 +4509,7 @@
             <w:sdt>
               <w:sdtPr>
                 <w:alias w:val="Assignee"/>
-                <w:id w:val="1494365451"/>
+                <w:id w:val="-549823104"/>
                 <w:dropDownList w:lastValue="Alarie">
                   <w:listItem w:displayText="None" w:value="None"/>
                   <w:listItem w:displayText="Alarie" w:value="Alarie"/>
@@ -4701,12 +4675,12 @@
                 <wp:inline distB="114300" distT="114300" distL="114300" distR="114300">
                   <wp:extent cx="2660984" cy="2592888"/>
                   <wp:effectExtent b="0" l="0" r="0" t="0"/>
-                  <wp:docPr id="3" name="image16.png"/>
+                  <wp:docPr id="9" name="image9.png"/>
                   <a:graphic>
                     <a:graphicData uri="http://schemas.openxmlformats.org/drawingml/2006/picture">
                       <pic:pic>
                         <pic:nvPicPr>
-                          <pic:cNvPr id="0" name="image16.png"/>
+                          <pic:cNvPr id="0" name="image9.png"/>
                           <pic:cNvPicPr preferRelativeResize="0"/>
                         </pic:nvPicPr>
                         <pic:blipFill>
@@ -4866,7 +4840,7 @@
             <w:sdt>
               <w:sdtPr>
                 <w:alias w:val="Assignee"/>
-                <w:id w:val="-1998722989"/>
+                <w:id w:val="-1860087090"/>
                 <w:dropDownList w:lastValue="Matthew">
                   <w:listItem w:displayText="None" w:value="None"/>
                   <w:listItem w:displayText="Alarie" w:value="Alarie"/>
@@ -4908,7 +4882,7 @@
               <w:keepLines w:val="1"/>
               <w:numPr>
                 <w:ilvl w:val="0"/>
-                <w:numId w:val="83"/>
+                <w:numId w:val="85"/>
               </w:numPr>
               <w:spacing w:after="0" w:afterAutospacing="0" w:before="240" w:line="240" w:lineRule="auto"/>
               <w:ind w:left="720" w:hanging="360"/>
@@ -4934,7 +4908,7 @@
               <w:keepLines w:val="1"/>
               <w:numPr>
                 <w:ilvl w:val="1"/>
-                <w:numId w:val="83"/>
+                <w:numId w:val="85"/>
               </w:numPr>
               <w:spacing w:after="0" w:afterAutospacing="0" w:before="0" w:beforeAutospacing="0" w:line="240" w:lineRule="auto"/>
               <w:ind w:left="1440" w:hanging="360"/>
@@ -4960,7 +4934,7 @@
               <w:keepLines w:val="1"/>
               <w:numPr>
                 <w:ilvl w:val="1"/>
-                <w:numId w:val="83"/>
+                <w:numId w:val="85"/>
               </w:numPr>
               <w:spacing w:after="0" w:afterAutospacing="0" w:before="0" w:beforeAutospacing="0" w:line="240" w:lineRule="auto"/>
               <w:ind w:left="1440" w:hanging="360"/>
@@ -4986,7 +4960,7 @@
               <w:keepLines w:val="1"/>
               <w:numPr>
                 <w:ilvl w:val="1"/>
-                <w:numId w:val="83"/>
+                <w:numId w:val="85"/>
               </w:numPr>
               <w:spacing w:after="0" w:afterAutospacing="0" w:before="0" w:beforeAutospacing="0" w:line="240" w:lineRule="auto"/>
               <w:ind w:left="1440" w:hanging="360"/>
@@ -5012,7 +4986,7 @@
               <w:keepLines w:val="1"/>
               <w:numPr>
                 <w:ilvl w:val="0"/>
-                <w:numId w:val="83"/>
+                <w:numId w:val="85"/>
               </w:numPr>
               <w:spacing w:after="0" w:afterAutospacing="0" w:before="0" w:beforeAutospacing="0" w:line="240" w:lineRule="auto"/>
               <w:ind w:left="720" w:hanging="360"/>
@@ -5038,7 +5012,7 @@
               <w:keepLines w:val="1"/>
               <w:numPr>
                 <w:ilvl w:val="1"/>
-                <w:numId w:val="83"/>
+                <w:numId w:val="85"/>
               </w:numPr>
               <w:spacing w:after="0" w:afterAutospacing="0" w:before="0" w:beforeAutospacing="0" w:line="240" w:lineRule="auto"/>
               <w:ind w:left="1440" w:hanging="360"/>
@@ -5064,7 +5038,7 @@
               <w:keepLines w:val="1"/>
               <w:numPr>
                 <w:ilvl w:val="1"/>
-                <w:numId w:val="83"/>
+                <w:numId w:val="85"/>
               </w:numPr>
               <w:spacing w:after="0" w:afterAutospacing="0" w:before="0" w:beforeAutospacing="0" w:line="240" w:lineRule="auto"/>
               <w:ind w:left="1440" w:hanging="360"/>
@@ -5090,7 +5064,7 @@
               <w:keepLines w:val="1"/>
               <w:numPr>
                 <w:ilvl w:val="1"/>
-                <w:numId w:val="83"/>
+                <w:numId w:val="85"/>
               </w:numPr>
               <w:spacing w:after="240" w:before="0" w:beforeAutospacing="0" w:line="240" w:lineRule="auto"/>
               <w:ind w:left="1440" w:hanging="360"/>
@@ -5127,7 +5101,7 @@
             <w:sdt>
               <w:sdtPr>
                 <w:alias w:val="Assignee"/>
-                <w:id w:val="402944035"/>
+                <w:id w:val="295299911"/>
                 <w:dropDownList w:lastValue="Matthew">
                   <w:listItem w:displayText="None" w:value="None"/>
                   <w:listItem w:displayText="Alarie" w:value="Alarie"/>
@@ -5362,7 +5336,7 @@
             <w:sdt>
               <w:sdtPr>
                 <w:alias w:val="Assignee"/>
-                <w:id w:val="1932657975"/>
+                <w:id w:val="-1420607286"/>
                 <w:dropDownList w:lastValue="Matthew">
                   <w:listItem w:displayText="None" w:value="None"/>
                   <w:listItem w:displayText="Alarie" w:value="Alarie"/>
@@ -5519,7 +5493,7 @@
             <w:sdt>
               <w:sdtPr>
                 <w:alias w:val="Assignee"/>
-                <w:id w:val="-1230538300"/>
+                <w:id w:val="2029159236"/>
                 <w:dropDownList w:lastValue="Matthew">
                   <w:listItem w:displayText="None" w:value="None"/>
                   <w:listItem w:displayText="Alarie" w:value="Alarie"/>
@@ -5728,7 +5702,7 @@
             <w:sdt>
               <w:sdtPr>
                 <w:alias w:val="Assignee"/>
-                <w:id w:val="-914240834"/>
+                <w:id w:val="-1646345100"/>
                 <w:dropDownList w:lastValue="Matthew">
                   <w:listItem w:displayText="None" w:value="None"/>
                   <w:listItem w:displayText="Alarie" w:value="Alarie"/>
@@ -5770,7 +5744,7 @@
               <w:keepLines w:val="1"/>
               <w:numPr>
                 <w:ilvl w:val="0"/>
-                <w:numId w:val="90"/>
+                <w:numId w:val="92"/>
               </w:numPr>
               <w:spacing w:after="0" w:afterAutospacing="0" w:before="240" w:line="240" w:lineRule="auto"/>
               <w:ind w:left="720" w:hanging="360"/>
@@ -5796,7 +5770,7 @@
               <w:keepLines w:val="1"/>
               <w:numPr>
                 <w:ilvl w:val="1"/>
-                <w:numId w:val="90"/>
+                <w:numId w:val="92"/>
               </w:numPr>
               <w:spacing w:after="0" w:afterAutospacing="0" w:before="0" w:beforeAutospacing="0" w:line="240" w:lineRule="auto"/>
               <w:ind w:left="1440" w:hanging="360"/>
@@ -5822,7 +5796,7 @@
               <w:keepLines w:val="1"/>
               <w:numPr>
                 <w:ilvl w:val="1"/>
-                <w:numId w:val="90"/>
+                <w:numId w:val="92"/>
               </w:numPr>
               <w:spacing w:after="0" w:afterAutospacing="0" w:before="0" w:beforeAutospacing="0" w:line="240" w:lineRule="auto"/>
               <w:ind w:left="1440" w:hanging="360"/>
@@ -5848,7 +5822,7 @@
               <w:keepLines w:val="1"/>
               <w:numPr>
                 <w:ilvl w:val="1"/>
-                <w:numId w:val="90"/>
+                <w:numId w:val="92"/>
               </w:numPr>
               <w:spacing w:after="240" w:before="0" w:beforeAutospacing="0" w:line="240" w:lineRule="auto"/>
               <w:ind w:left="1440" w:hanging="360"/>
@@ -5885,7 +5859,7 @@
             <w:sdt>
               <w:sdtPr>
                 <w:alias w:val="Assignee"/>
-                <w:id w:val="-1432723581"/>
+                <w:id w:val="499163695"/>
                 <w:dropDownList w:lastValue="Matthew">
                   <w:listItem w:displayText="None" w:value="None"/>
                   <w:listItem w:displayText="Alarie" w:value="Alarie"/>
@@ -5927,7 +5901,7 @@
               <w:keepLines w:val="1"/>
               <w:numPr>
                 <w:ilvl w:val="0"/>
-                <w:numId w:val="58"/>
+                <w:numId w:val="59"/>
               </w:numPr>
               <w:spacing w:after="0" w:afterAutospacing="0" w:line="240" w:lineRule="auto"/>
               <w:ind w:left="720" w:hanging="360"/>
@@ -5953,7 +5927,7 @@
               <w:keepLines w:val="1"/>
               <w:numPr>
                 <w:ilvl w:val="0"/>
-                <w:numId w:val="58"/>
+                <w:numId w:val="59"/>
               </w:numPr>
               <w:spacing w:after="0" w:afterAutospacing="0" w:line="240" w:lineRule="auto"/>
               <w:ind w:left="720" w:hanging="360"/>
@@ -5979,7 +5953,7 @@
               <w:keepLines w:val="1"/>
               <w:numPr>
                 <w:ilvl w:val="0"/>
-                <w:numId w:val="58"/>
+                <w:numId w:val="59"/>
               </w:numPr>
               <w:spacing w:after="0" w:afterAutospacing="0" w:line="240" w:lineRule="auto"/>
               <w:ind w:left="720" w:hanging="360"/>
@@ -6005,7 +5979,7 @@
               <w:keepLines w:val="1"/>
               <w:numPr>
                 <w:ilvl w:val="0"/>
-                <w:numId w:val="58"/>
+                <w:numId w:val="59"/>
               </w:numPr>
               <w:spacing w:after="0" w:afterAutospacing="0" w:line="240" w:lineRule="auto"/>
               <w:ind w:left="720" w:hanging="360"/>
@@ -6031,7 +6005,7 @@
               <w:keepLines w:val="1"/>
               <w:numPr>
                 <w:ilvl w:val="0"/>
-                <w:numId w:val="58"/>
+                <w:numId w:val="59"/>
               </w:numPr>
               <w:spacing w:after="0" w:afterAutospacing="0" w:line="240" w:lineRule="auto"/>
               <w:ind w:left="720" w:hanging="360"/>
@@ -6057,7 +6031,7 @@
               <w:keepLines w:val="1"/>
               <w:numPr>
                 <w:ilvl w:val="0"/>
-                <w:numId w:val="58"/>
+                <w:numId w:val="59"/>
               </w:numPr>
               <w:spacing w:after="60" w:line="240" w:lineRule="auto"/>
               <w:ind w:left="720" w:hanging="360"/>
@@ -6094,7 +6068,7 @@
             <w:sdt>
               <w:sdtPr>
                 <w:alias w:val="Assignee"/>
-                <w:id w:val="-1568362594"/>
+                <w:id w:val="-1710754170"/>
                 <w:dropDownList w:lastValue="Matthew">
                   <w:listItem w:displayText="None" w:value="None"/>
                   <w:listItem w:displayText="Alarie" w:value="Alarie"/>
@@ -6136,7 +6110,7 @@
               <w:keepLines w:val="1"/>
               <w:numPr>
                 <w:ilvl w:val="0"/>
-                <w:numId w:val="58"/>
+                <w:numId w:val="59"/>
               </w:numPr>
               <w:spacing w:after="0" w:afterAutospacing="0" w:line="240" w:lineRule="auto"/>
               <w:ind w:left="720" w:hanging="360"/>
@@ -6162,7 +6136,7 @@
               <w:keepLines w:val="1"/>
               <w:numPr>
                 <w:ilvl w:val="0"/>
-                <w:numId w:val="58"/>
+                <w:numId w:val="59"/>
               </w:numPr>
               <w:spacing w:after="0" w:afterAutospacing="0" w:line="240" w:lineRule="auto"/>
               <w:ind w:left="720" w:hanging="360"/>
@@ -6188,7 +6162,7 @@
               <w:keepLines w:val="1"/>
               <w:numPr>
                 <w:ilvl w:val="0"/>
-                <w:numId w:val="58"/>
+                <w:numId w:val="59"/>
               </w:numPr>
               <w:spacing w:after="0" w:afterAutospacing="0" w:line="240" w:lineRule="auto"/>
               <w:ind w:left="720" w:hanging="360"/>
@@ -6214,7 +6188,7 @@
               <w:keepLines w:val="1"/>
               <w:numPr>
                 <w:ilvl w:val="0"/>
-                <w:numId w:val="58"/>
+                <w:numId w:val="59"/>
               </w:numPr>
               <w:spacing w:after="0" w:afterAutospacing="0" w:line="240" w:lineRule="auto"/>
               <w:ind w:left="720" w:hanging="360"/>
@@ -6240,7 +6214,7 @@
               <w:keepLines w:val="1"/>
               <w:numPr>
                 <w:ilvl w:val="0"/>
-                <w:numId w:val="58"/>
+                <w:numId w:val="59"/>
               </w:numPr>
               <w:spacing w:after="0" w:afterAutospacing="0" w:line="240" w:lineRule="auto"/>
               <w:ind w:left="720" w:hanging="360"/>
@@ -6266,7 +6240,7 @@
               <w:keepLines w:val="1"/>
               <w:numPr>
                 <w:ilvl w:val="0"/>
-                <w:numId w:val="58"/>
+                <w:numId w:val="59"/>
               </w:numPr>
               <w:spacing w:after="0" w:afterAutospacing="0" w:line="240" w:lineRule="auto"/>
               <w:ind w:left="720" w:hanging="360"/>
@@ -6292,7 +6266,7 @@
               <w:keepLines w:val="1"/>
               <w:numPr>
                 <w:ilvl w:val="1"/>
-                <w:numId w:val="58"/>
+                <w:numId w:val="59"/>
               </w:numPr>
               <w:spacing w:after="0" w:afterAutospacing="0" w:line="240" w:lineRule="auto"/>
               <w:ind w:left="1440" w:hanging="360"/>
@@ -6318,7 +6292,7 @@
               <w:keepLines w:val="1"/>
               <w:numPr>
                 <w:ilvl w:val="1"/>
-                <w:numId w:val="58"/>
+                <w:numId w:val="59"/>
               </w:numPr>
               <w:spacing w:after="0" w:afterAutospacing="0" w:line="240" w:lineRule="auto"/>
               <w:ind w:left="1440" w:hanging="360"/>
@@ -6344,7 +6318,7 @@
               <w:keepLines w:val="1"/>
               <w:numPr>
                 <w:ilvl w:val="0"/>
-                <w:numId w:val="58"/>
+                <w:numId w:val="59"/>
               </w:numPr>
               <w:spacing w:after="60" w:line="240" w:lineRule="auto"/>
               <w:ind w:left="720" w:hanging="360"/>
@@ -6381,7 +6355,7 @@
             <w:sdt>
               <w:sdtPr>
                 <w:alias w:val="Assignee"/>
-                <w:id w:val="1366898657"/>
+                <w:id w:val="-1424316469"/>
                 <w:dropDownList w:lastValue="Matthew">
                   <w:listItem w:displayText="None" w:value="None"/>
                   <w:listItem w:displayText="Alarie" w:value="Alarie"/>
@@ -6486,7 +6460,7 @@
             <w:sdt>
               <w:sdtPr>
                 <w:alias w:val="Assignee"/>
-                <w:id w:val="1559525509"/>
+                <w:id w:val="-1016291895"/>
                 <w:dropDownList w:lastValue="Matthew">
                   <w:listItem w:displayText="None" w:value="None"/>
                   <w:listItem w:displayText="Alarie" w:value="Alarie"/>
@@ -6695,7 +6669,7 @@
             <w:sdt>
               <w:sdtPr>
                 <w:alias w:val="Assignee"/>
-                <w:id w:val="-1860269190"/>
+                <w:id w:val="557713913"/>
                 <w:dropDownList w:lastValue="Matthew">
                   <w:listItem w:displayText="None" w:value="None"/>
                   <w:listItem w:displayText="Alarie" w:value="Alarie"/>
@@ -6779,7 +6753,7 @@
             <w:sdt>
               <w:sdtPr>
                 <w:alias w:val="Assignee"/>
-                <w:id w:val="448491306"/>
+                <w:id w:val="-1089727390"/>
                 <w:dropDownList w:lastValue="Matthew">
                   <w:listItem w:displayText="None" w:value="None"/>
                   <w:listItem w:displayText="Alarie" w:value="Alarie"/>
@@ -6821,7 +6795,7 @@
               <w:keepLines w:val="1"/>
               <w:numPr>
                 <w:ilvl w:val="0"/>
-                <w:numId w:val="88"/>
+                <w:numId w:val="90"/>
               </w:numPr>
               <w:spacing w:after="0" w:afterAutospacing="0" w:before="240" w:line="240" w:lineRule="auto"/>
               <w:ind w:left="720" w:hanging="360"/>
@@ -6847,7 +6821,7 @@
               <w:keepLines w:val="1"/>
               <w:numPr>
                 <w:ilvl w:val="1"/>
-                <w:numId w:val="88"/>
+                <w:numId w:val="90"/>
               </w:numPr>
               <w:spacing w:after="0" w:afterAutospacing="0" w:before="0" w:beforeAutospacing="0" w:line="240" w:lineRule="auto"/>
               <w:ind w:left="1440" w:hanging="360"/>
@@ -6873,7 +6847,7 @@
               <w:keepLines w:val="1"/>
               <w:numPr>
                 <w:ilvl w:val="1"/>
-                <w:numId w:val="88"/>
+                <w:numId w:val="90"/>
               </w:numPr>
               <w:spacing w:after="240" w:before="0" w:beforeAutospacing="0" w:line="240" w:lineRule="auto"/>
               <w:ind w:left="1440" w:hanging="360"/>
@@ -6910,7 +6884,7 @@
             <w:sdt>
               <w:sdtPr>
                 <w:alias w:val="Assignee"/>
-                <w:id w:val="750236959"/>
+                <w:id w:val="1820394960"/>
                 <w:dropDownList w:lastValue="Matthew">
                   <w:listItem w:displayText="None" w:value="None"/>
                   <w:listItem w:displayText="Alarie" w:value="Alarie"/>
@@ -7023,7 +6997,7 @@
           <w:pgNumType w:start="1"/>
         </w:sectPr>
       </w:pPr>
-      <w:bookmarkStart w:colFirst="0" w:colLast="0" w:name="_virasran7eni" w:id="4"/>
+      <w:bookmarkStart w:colFirst="0" w:colLast="0" w:name="_mr7texu15mzg" w:id="4"/>
       <w:bookmarkEnd w:id="4"/>
       <w:r>
         <w:rPr>
@@ -7105,7 +7079,7 @@
           <w:pgNumType w:start="1"/>
         </w:sectPr>
       </w:pPr>
-      <w:bookmarkStart w:colFirst="0" w:colLast="0" w:name="_pm12j4a78791" w:id="5"/>
+      <w:bookmarkStart w:colFirst="0" w:colLast="0" w:name="_j78d275z3nah" w:id="5"/>
       <w:bookmarkEnd w:id="5"/>
       <w:r>
         <w:rPr>
@@ -7345,7 +7319,7 @@
             <w:sdt>
               <w:sdtPr>
                 <w:alias w:val="Configuration 1"/>
-                <w:id w:val="2108113070"/>
+                <w:id w:val="571839544"/>
                 <w:dropDownList w:lastValue="Medium">
                   <w:listItem w:displayText="Cakewalk" w:value="Cakewalk"/>
                   <w:listItem w:displayText="Easy" w:value="Easy"/>
@@ -7529,7 +7503,7 @@
             <w:sdt>
               <w:sdtPr>
                 <w:alias w:val="Configuration 1"/>
-                <w:id w:val="1334909729"/>
+                <w:id w:val="93610356"/>
                 <w:dropDownList w:lastValue="Medium">
                   <w:listItem w:displayText="Cakewalk" w:value="Cakewalk"/>
                   <w:listItem w:displayText="Easy" w:value="Easy"/>
@@ -7817,7 +7791,7 @@
             <w:sdt>
               <w:sdtPr>
                 <w:alias w:val="Configuration 1"/>
-                <w:id w:val="-966288273"/>
+                <w:id w:val="-294404257"/>
                 <w:dropDownList w:lastValue="Hard">
                   <w:listItem w:displayText="Cakewalk" w:value="Cakewalk"/>
                   <w:listItem w:displayText="Easy" w:value="Easy"/>
@@ -7975,7 +7949,7 @@
             <w:sdt>
               <w:sdtPr>
                 <w:alias w:val="Configuration 1"/>
-                <w:id w:val="783371057"/>
+                <w:id w:val="-2070708998"/>
                 <w:dropDownList w:lastValue="Medium">
                   <w:listItem w:displayText="Cakewalk" w:value="Cakewalk"/>
                   <w:listItem w:displayText="Easy" w:value="Easy"/>
@@ -8019,7 +7993,7 @@
               <w:keepLines w:val="1"/>
               <w:numPr>
                 <w:ilvl w:val="0"/>
-                <w:numId w:val="72"/>
+                <w:numId w:val="73"/>
               </w:numPr>
               <w:spacing w:after="0" w:afterAutospacing="0" w:before="240" w:lineRule="auto"/>
               <w:ind w:left="720" w:hanging="360"/>
@@ -8045,7 +8019,7 @@
               <w:keepLines w:val="1"/>
               <w:numPr>
                 <w:ilvl w:val="1"/>
-                <w:numId w:val="72"/>
+                <w:numId w:val="73"/>
               </w:numPr>
               <w:spacing w:after="0" w:afterAutospacing="0" w:before="0" w:beforeAutospacing="0" w:lineRule="auto"/>
               <w:ind w:left="1440" w:hanging="360"/>
@@ -8071,7 +8045,7 @@
               <w:keepLines w:val="1"/>
               <w:numPr>
                 <w:ilvl w:val="1"/>
-                <w:numId w:val="72"/>
+                <w:numId w:val="73"/>
               </w:numPr>
               <w:spacing w:after="240" w:before="0" w:beforeAutospacing="0" w:lineRule="auto"/>
               <w:ind w:left="1440" w:hanging="360"/>
@@ -8107,7 +8081,7 @@
             <w:sdt>
               <w:sdtPr>
                 <w:alias w:val="Configuration 1"/>
-                <w:id w:val="733317138"/>
+                <w:id w:val="-1678577220"/>
                 <w:dropDownList w:lastValue="Medium">
                   <w:listItem w:displayText="Cakewalk" w:value="Cakewalk"/>
                   <w:listItem w:displayText="Easy" w:value="Easy"/>
@@ -8291,7 +8265,7 @@
             <w:sdt>
               <w:sdtPr>
                 <w:alias w:val="Configuration 1"/>
-                <w:id w:val="-318749427"/>
+                <w:id w:val="-373754328"/>
                 <w:dropDownList w:lastValue="Medium">
                   <w:listItem w:displayText="Cakewalk" w:value="Cakewalk"/>
                   <w:listItem w:displayText="Easy" w:value="Easy"/>
@@ -8335,7 +8309,7 @@
               <w:keepLines w:val="1"/>
               <w:numPr>
                 <w:ilvl w:val="0"/>
-                <w:numId w:val="67"/>
+                <w:numId w:val="68"/>
               </w:numPr>
               <w:spacing w:after="0" w:afterAutospacing="0" w:before="240" w:lineRule="auto"/>
               <w:ind w:left="720" w:hanging="360"/>
@@ -8383,7 +8357,7 @@
               <w:keepLines w:val="1"/>
               <w:numPr>
                 <w:ilvl w:val="1"/>
-                <w:numId w:val="67"/>
+                <w:numId w:val="68"/>
               </w:numPr>
               <w:spacing w:after="0" w:afterAutospacing="0" w:before="0" w:beforeAutospacing="0" w:lineRule="auto"/>
               <w:ind w:left="1440" w:hanging="360"/>
@@ -8427,7 +8401,7 @@
               <w:keepLines w:val="1"/>
               <w:numPr>
                 <w:ilvl w:val="1"/>
-                <w:numId w:val="67"/>
+                <w:numId w:val="68"/>
               </w:numPr>
               <w:spacing w:after="0" w:afterAutospacing="0" w:before="0" w:beforeAutospacing="0" w:lineRule="auto"/>
               <w:ind w:left="1440" w:hanging="360"/>
@@ -8475,7 +8449,7 @@
               <w:keepLines w:val="1"/>
               <w:numPr>
                 <w:ilvl w:val="1"/>
-                <w:numId w:val="67"/>
+                <w:numId w:val="68"/>
               </w:numPr>
               <w:spacing w:after="0" w:afterAutospacing="0" w:before="0" w:beforeAutospacing="0" w:lineRule="auto"/>
               <w:ind w:left="1440" w:hanging="360"/>
@@ -8501,7 +8475,7 @@
               <w:keepLines w:val="1"/>
               <w:numPr>
                 <w:ilvl w:val="2"/>
-                <w:numId w:val="67"/>
+                <w:numId w:val="68"/>
               </w:numPr>
               <w:spacing w:after="240" w:before="0" w:beforeAutospacing="0" w:lineRule="auto"/>
               <w:ind w:left="2160" w:hanging="360"/>
@@ -8521,12 +8495,12 @@
                 <wp:inline distB="114300" distT="114300" distL="114300" distR="114300">
                   <wp:extent cx="3713979" cy="1994277"/>
                   <wp:effectExtent b="0" l="0" r="0" t="0"/>
-                  <wp:docPr id="9" name="image15.png"/>
+                  <wp:docPr id="18" name="image17.png"/>
                   <a:graphic>
                     <a:graphicData uri="http://schemas.openxmlformats.org/drawingml/2006/picture">
                       <pic:pic>
                         <pic:nvPicPr>
-                          <pic:cNvPr id="0" name="image15.png"/>
+                          <pic:cNvPr id="0" name="image17.png"/>
                           <pic:cNvPicPr preferRelativeResize="0"/>
                         </pic:nvPicPr>
                         <pic:blipFill>
@@ -8572,7 +8546,7 @@
             <w:sdt>
               <w:sdtPr>
                 <w:alias w:val="Configuration 1"/>
-                <w:id w:val="171933797"/>
+                <w:id w:val="-1186883605"/>
                 <w:dropDownList w:lastValue="Medium">
                   <w:listItem w:displayText="Cakewalk" w:value="Cakewalk"/>
                   <w:listItem w:displayText="Easy" w:value="Easy"/>
@@ -8616,7 +8590,7 @@
               <w:keepLines w:val="1"/>
               <w:numPr>
                 <w:ilvl w:val="0"/>
-                <w:numId w:val="67"/>
+                <w:numId w:val="68"/>
               </w:numPr>
               <w:spacing w:after="0" w:afterAutospacing="0" w:before="240" w:lineRule="auto"/>
               <w:ind w:left="720" w:hanging="360"/>
@@ -8664,7 +8638,7 @@
               <w:keepLines w:val="1"/>
               <w:numPr>
                 <w:ilvl w:val="1"/>
-                <w:numId w:val="67"/>
+                <w:numId w:val="68"/>
               </w:numPr>
               <w:spacing w:after="0" w:afterAutospacing="0" w:before="0" w:beforeAutospacing="0" w:lineRule="auto"/>
               <w:ind w:left="1440" w:hanging="360"/>
@@ -8690,7 +8664,7 @@
               <w:keepLines w:val="1"/>
               <w:numPr>
                 <w:ilvl w:val="1"/>
-                <w:numId w:val="67"/>
+                <w:numId w:val="68"/>
               </w:numPr>
               <w:spacing w:after="0" w:afterAutospacing="0" w:before="0" w:beforeAutospacing="0" w:lineRule="auto"/>
               <w:ind w:left="1440" w:hanging="360"/>
@@ -8716,7 +8690,7 @@
               <w:keepLines w:val="1"/>
               <w:numPr>
                 <w:ilvl w:val="1"/>
-                <w:numId w:val="67"/>
+                <w:numId w:val="68"/>
               </w:numPr>
               <w:spacing w:after="0" w:afterAutospacing="0" w:before="0" w:beforeAutospacing="0" w:lineRule="auto"/>
               <w:ind w:left="1440" w:hanging="360"/>
@@ -8742,7 +8716,7 @@
               <w:keepLines w:val="1"/>
               <w:numPr>
                 <w:ilvl w:val="1"/>
-                <w:numId w:val="67"/>
+                <w:numId w:val="68"/>
               </w:numPr>
               <w:spacing w:after="0" w:afterAutospacing="0" w:before="0" w:beforeAutospacing="0" w:lineRule="auto"/>
               <w:ind w:left="1440" w:hanging="360"/>
@@ -8768,7 +8742,7 @@
               <w:keepLines w:val="1"/>
               <w:numPr>
                 <w:ilvl w:val="1"/>
-                <w:numId w:val="67"/>
+                <w:numId w:val="68"/>
               </w:numPr>
               <w:spacing w:after="0" w:afterAutospacing="0" w:before="0" w:beforeAutospacing="0" w:lineRule="auto"/>
               <w:ind w:left="1440" w:hanging="360"/>
@@ -8816,7 +8790,7 @@
               <w:keepLines w:val="1"/>
               <w:numPr>
                 <w:ilvl w:val="1"/>
-                <w:numId w:val="67"/>
+                <w:numId w:val="68"/>
               </w:numPr>
               <w:spacing w:after="0" w:afterAutospacing="0" w:before="0" w:beforeAutospacing="0" w:lineRule="auto"/>
               <w:ind w:left="1440" w:hanging="360"/>
@@ -8842,7 +8816,7 @@
               <w:keepLines w:val="1"/>
               <w:numPr>
                 <w:ilvl w:val="1"/>
-                <w:numId w:val="67"/>
+                <w:numId w:val="68"/>
               </w:numPr>
               <w:spacing w:after="240" w:before="0" w:beforeAutospacing="0" w:lineRule="auto"/>
               <w:ind w:left="1440" w:hanging="360"/>
@@ -8862,12 +8836,12 @@
                 <wp:inline distB="114300" distT="114300" distL="114300" distR="114300">
                   <wp:extent cx="4510753" cy="2431328"/>
                   <wp:effectExtent b="0" l="0" r="0" t="0"/>
-                  <wp:docPr id="4" name="image1.png"/>
+                  <wp:docPr id="16" name="image16.png"/>
                   <a:graphic>
                     <a:graphicData uri="http://schemas.openxmlformats.org/drawingml/2006/picture">
                       <pic:pic>
                         <pic:nvPicPr>
-                          <pic:cNvPr id="0" name="image1.png"/>
+                          <pic:cNvPr id="0" name="image16.png"/>
                           <pic:cNvPicPr preferRelativeResize="0"/>
                         </pic:nvPicPr>
                         <pic:blipFill>
@@ -8931,7 +8905,7 @@
             <w:sdt>
               <w:sdtPr>
                 <w:alias w:val="Configuration 1"/>
-                <w:id w:val="-1475200707"/>
+                <w:id w:val="860758277"/>
                 <w:dropDownList w:lastValue="Medium">
                   <w:listItem w:displayText="Cakewalk" w:value="Cakewalk"/>
                   <w:listItem w:displayText="Easy" w:value="Easy"/>
@@ -8961,166 +8935,6 @@
           </w:p>
         </w:tc>
       </w:tr>
-      <w:tr>
-        <w:trPr>
-          <w:cantSplit w:val="0"/>
-          <w:trHeight w:val="543" w:hRule="atLeast"/>
-          <w:tblHeader w:val="0"/>
-        </w:trPr>
-        <w:tc>
-          <w:tcPr/>
-          <w:p>
-            <w:pPr>
-              <w:keepNext w:val="1"/>
-              <w:keepLines w:val="1"/>
-              <w:numPr>
-                <w:ilvl w:val="0"/>
-                <w:numId w:val="67"/>
-              </w:numPr>
-              <w:spacing w:after="240" w:before="240" w:lineRule="auto"/>
-              <w:ind w:left="720" w:hanging="360"/>
-              <w:rPr>
-                <w:rFonts w:ascii="Times" w:cs="Times" w:eastAsia="Times" w:hAnsi="Times"/>
-                <w:sz w:val="24"/>
-                <w:szCs w:val="24"/>
-              </w:rPr>
-            </w:pPr>
-            <w:r>
-              <w:rPr>
-                <w:rFonts w:ascii="Times" w:cs="Times" w:eastAsia="Times" w:hAnsi="Times"/>
-                <w:sz w:val="24"/>
-                <w:szCs w:val="24"/>
-                <w:rtl w:val="0"/>
-              </w:rPr>
-              <w:t xml:space="preserve">Determine what dependencies or number or files that will be touched when we overhaul booking queue status field to unconfirmed &gt; confirmed &gt; completed/cancelled/no-show</w:t>
-            </w:r>
-          </w:p>
-        </w:tc>
-        <w:tc>
-          <w:tcPr/>
-          <w:p>
-            <w:pPr>
-              <w:widowControl w:val="0"/>
-              <w:spacing w:line="240" w:lineRule="auto"/>
-              <w:rPr>
-                <w:rFonts w:ascii="Times" w:cs="Times" w:eastAsia="Times" w:hAnsi="Times"/>
-                <w:sz w:val="24"/>
-                <w:szCs w:val="24"/>
-              </w:rPr>
-            </w:pPr>
-            <w:sdt>
-              <w:sdtPr>
-                <w:alias w:val="Configuration 1"/>
-                <w:id w:val="1980453924"/>
-                <w:dropDownList w:lastValue="Unknown">
-                  <w:listItem w:displayText="Cakewalk" w:value="Cakewalk"/>
-                  <w:listItem w:displayText="Easy" w:value="Easy"/>
-                  <w:listItem w:displayText="Medium" w:value="Medium"/>
-                  <w:listItem w:displayText="Hard" w:value="Hard"/>
-                  <w:listItem w:displayText="Unknown" w:value="Unknown"/>
-                </w:dropDownList>
-              </w:sdtPr>
-              <w:sdtContent>
-                <w:r>
-                  <w:rPr>
-                    <w:rFonts w:ascii="Times" w:cs="Times" w:eastAsia="Times" w:hAnsi="Times"/>
-                    <w:color w:val="5a3286"/>
-                    <w:sz w:val="24"/>
-                    <w:szCs w:val="24"/>
-                    <w:shd w:fill="e6cff2" w:val="clear"/>
-                  </w:rPr>
-                  <w:t xml:space="preserve">Unknown</w:t>
-                </w:r>
-              </w:sdtContent>
-            </w:sdt>
-            <w:r>
-              <w:rPr>
-                <w:rtl w:val="0"/>
-              </w:rPr>
-            </w:r>
-          </w:p>
-        </w:tc>
-      </w:tr>
-      <w:tr>
-        <w:trPr>
-          <w:cantSplit w:val="0"/>
-          <w:trHeight w:val="543" w:hRule="atLeast"/>
-          <w:tblHeader w:val="0"/>
-        </w:trPr>
-        <w:tc>
-          <w:tcPr/>
-          <w:p>
-            <w:pPr>
-              <w:keepNext w:val="1"/>
-              <w:keepLines w:val="1"/>
-              <w:numPr>
-                <w:ilvl w:val="0"/>
-                <w:numId w:val="67"/>
-              </w:numPr>
-              <w:spacing w:after="240" w:before="240" w:lineRule="auto"/>
-              <w:ind w:left="720" w:hanging="360"/>
-              <w:rPr>
-                <w:rFonts w:ascii="Times" w:cs="Times" w:eastAsia="Times" w:hAnsi="Times"/>
-                <w:sz w:val="24"/>
-                <w:szCs w:val="24"/>
-              </w:rPr>
-            </w:pPr>
-            <w:r>
-              <w:rPr>
-                <w:rFonts w:ascii="Times" w:cs="Times" w:eastAsia="Times" w:hAnsi="Times"/>
-                <w:sz w:val="24"/>
-                <w:szCs w:val="24"/>
-                <w:rtl w:val="0"/>
-              </w:rPr>
-              <w:t xml:space="preserve">Confirm whether each payments queue row is linked to a transactions table, that is either downpayment, remaining balance payment or full payment</w:t>
-            </w:r>
-          </w:p>
-        </w:tc>
-        <w:tc>
-          <w:tcPr/>
-          <w:p>
-            <w:pPr>
-              <w:widowControl w:val="0"/>
-              <w:spacing w:line="240" w:lineRule="auto"/>
-              <w:rPr>
-                <w:rFonts w:ascii="Times" w:cs="Times" w:eastAsia="Times" w:hAnsi="Times"/>
-                <w:sz w:val="24"/>
-                <w:szCs w:val="24"/>
-              </w:rPr>
-            </w:pPr>
-            <w:sdt>
-              <w:sdtPr>
-                <w:alias w:val="Configuration 1"/>
-                <w:id w:val="-1707845510"/>
-                <w:dropDownList w:lastValue="Unknown">
-                  <w:listItem w:displayText="Cakewalk" w:value="Cakewalk"/>
-                  <w:listItem w:displayText="Easy" w:value="Easy"/>
-                  <w:listItem w:displayText="Medium" w:value="Medium"/>
-                  <w:listItem w:displayText="Hard" w:value="Hard"/>
-                  <w:listItem w:displayText="Unknown" w:value="Unknown"/>
-                </w:dropDownList>
-              </w:sdtPr>
-              <w:sdtContent>
-                <w:r>
-                  <w:rPr>
-                    <w:rFonts w:ascii="Times" w:cs="Times" w:eastAsia="Times" w:hAnsi="Times"/>
-                    <w:color w:val="5a3286"/>
-                    <w:sz w:val="24"/>
-                    <w:szCs w:val="24"/>
-                    <w:shd w:fill="e6cff2" w:val="clear"/>
-                  </w:rPr>
-                  <w:t xml:space="preserve">Unknown</w:t>
-                </w:r>
-              </w:sdtContent>
-            </w:sdt>
-            <w:r>
-              <w:rPr>
-                <w:rtl w:val="0"/>
-              </w:rPr>
-            </w:r>
-          </w:p>
-        </w:tc>
-      </w:tr>
     </w:tbl>
     <w:p>
       <w:pPr>
@@ -9175,7 +8989,7 @@
           <w:pgNumType w:start="1"/>
         </w:sectPr>
       </w:pPr>
-      <w:bookmarkStart w:colFirst="0" w:colLast="0" w:name="_6gqnragitzq7" w:id="6"/>
+      <w:bookmarkStart w:colFirst="0" w:colLast="0" w:name="_i194712llorz" w:id="6"/>
       <w:bookmarkEnd w:id="6"/>
       <w:r>
         <w:rPr>
@@ -10239,7 +10053,7 @@
       <w:pPr>
         <w:numPr>
           <w:ilvl w:val="0"/>
-          <w:numId w:val="74"/>
+          <w:numId w:val="75"/>
         </w:numPr>
         <w:spacing w:after="0" w:afterAutospacing="0" w:line="240" w:lineRule="auto"/>
         <w:ind w:left="720" w:hanging="360"/>
@@ -10260,7 +10074,7 @@
       <w:pPr>
         <w:numPr>
           <w:ilvl w:val="0"/>
-          <w:numId w:val="74"/>
+          <w:numId w:val="75"/>
         </w:numPr>
         <w:spacing w:after="60" w:line="240" w:lineRule="auto"/>
         <w:ind w:left="720" w:hanging="360"/>
@@ -10692,7 +10506,7 @@
           <w:pgNumType w:start="1"/>
         </w:sectPr>
       </w:pPr>
-      <w:bookmarkStart w:colFirst="0" w:colLast="0" w:name="_7o22spm9qpr" w:id="7"/>
+      <w:bookmarkStart w:colFirst="0" w:colLast="0" w:name="_xmioh4fqcxow" w:id="7"/>
       <w:bookmarkEnd w:id="7"/>
       <w:r>
         <w:rPr>
@@ -11047,7 +10861,7 @@
       <w:pPr>
         <w:numPr>
           <w:ilvl w:val="0"/>
-          <w:numId w:val="75"/>
+          <w:numId w:val="77"/>
         </w:numPr>
         <w:spacing w:after="0" w:afterAutospacing="0" w:before="240" w:lineRule="auto"/>
         <w:ind w:left="720" w:hanging="360"/>
@@ -11063,7 +10877,7 @@
       <w:pPr>
         <w:numPr>
           <w:ilvl w:val="0"/>
-          <w:numId w:val="75"/>
+          <w:numId w:val="77"/>
         </w:numPr>
         <w:spacing w:after="0" w:afterAutospacing="0" w:before="0" w:beforeAutospacing="0" w:lineRule="auto"/>
         <w:ind w:left="720" w:hanging="360"/>
@@ -11093,7 +10907,7 @@
       <w:pPr>
         <w:numPr>
           <w:ilvl w:val="0"/>
-          <w:numId w:val="75"/>
+          <w:numId w:val="77"/>
         </w:numPr>
         <w:spacing w:after="0" w:afterAutospacing="0" w:before="0" w:beforeAutospacing="0" w:lineRule="auto"/>
         <w:ind w:left="720" w:hanging="360"/>
@@ -11109,7 +10923,7 @@
       <w:pPr>
         <w:numPr>
           <w:ilvl w:val="1"/>
-          <w:numId w:val="75"/>
+          <w:numId w:val="77"/>
         </w:numPr>
         <w:spacing w:after="0" w:afterAutospacing="0" w:before="0" w:beforeAutospacing="0" w:lineRule="auto"/>
         <w:ind w:left="1440" w:hanging="360"/>
@@ -11133,7 +10947,7 @@
       <w:pPr>
         <w:numPr>
           <w:ilvl w:val="1"/>
-          <w:numId w:val="75"/>
+          <w:numId w:val="77"/>
         </w:numPr>
         <w:spacing w:after="0" w:afterAutospacing="0" w:before="0" w:beforeAutospacing="0" w:lineRule="auto"/>
         <w:ind w:left="1440" w:hanging="360"/>
@@ -11157,7 +10971,7 @@
       <w:pPr>
         <w:numPr>
           <w:ilvl w:val="1"/>
-          <w:numId w:val="75"/>
+          <w:numId w:val="77"/>
         </w:numPr>
         <w:spacing w:after="0" w:afterAutospacing="0" w:before="0" w:beforeAutospacing="0" w:lineRule="auto"/>
         <w:ind w:left="1440" w:hanging="360"/>
@@ -11181,7 +10995,7 @@
       <w:pPr>
         <w:numPr>
           <w:ilvl w:val="0"/>
-          <w:numId w:val="75"/>
+          <w:numId w:val="77"/>
         </w:numPr>
         <w:spacing w:after="240" w:before="0" w:beforeAutospacing="0" w:lineRule="auto"/>
         <w:ind w:left="720" w:hanging="360"/>
@@ -11579,7 +11393,7 @@
       <w:pPr>
         <w:numPr>
           <w:ilvl w:val="0"/>
-          <w:numId w:val="59"/>
+          <w:numId w:val="60"/>
         </w:numPr>
         <w:spacing w:after="0" w:afterAutospacing="0" w:before="240" w:lineRule="auto"/>
         <w:ind w:left="720" w:hanging="360"/>
@@ -11609,7 +11423,7 @@
       <w:pPr>
         <w:numPr>
           <w:ilvl w:val="0"/>
-          <w:numId w:val="59"/>
+          <w:numId w:val="60"/>
         </w:numPr>
         <w:spacing w:after="0" w:afterAutospacing="0" w:before="0" w:beforeAutospacing="0" w:lineRule="auto"/>
         <w:ind w:left="720" w:hanging="360"/>
@@ -11639,7 +11453,7 @@
       <w:pPr>
         <w:numPr>
           <w:ilvl w:val="0"/>
-          <w:numId w:val="59"/>
+          <w:numId w:val="60"/>
         </w:numPr>
         <w:spacing w:after="0" w:afterAutospacing="0" w:before="0" w:beforeAutospacing="0" w:lineRule="auto"/>
         <w:ind w:left="720" w:hanging="360"/>
@@ -11655,7 +11469,7 @@
       <w:pPr>
         <w:numPr>
           <w:ilvl w:val="1"/>
-          <w:numId w:val="59"/>
+          <w:numId w:val="60"/>
         </w:numPr>
         <w:spacing w:after="0" w:afterAutospacing="0" w:before="0" w:beforeAutospacing="0" w:lineRule="auto"/>
         <w:ind w:left="1440" w:hanging="360"/>
@@ -11671,7 +11485,7 @@
       <w:pPr>
         <w:numPr>
           <w:ilvl w:val="1"/>
-          <w:numId w:val="59"/>
+          <w:numId w:val="60"/>
         </w:numPr>
         <w:spacing w:after="0" w:afterAutospacing="0" w:before="0" w:beforeAutospacing="0" w:lineRule="auto"/>
         <w:ind w:left="1440" w:hanging="360"/>
@@ -11687,7 +11501,7 @@
       <w:pPr>
         <w:numPr>
           <w:ilvl w:val="1"/>
-          <w:numId w:val="59"/>
+          <w:numId w:val="60"/>
         </w:numPr>
         <w:spacing w:after="0" w:afterAutospacing="0" w:before="0" w:beforeAutospacing="0" w:lineRule="auto"/>
         <w:ind w:left="1440" w:hanging="360"/>
@@ -11705,7 +11519,7 @@
       <w:pPr>
         <w:numPr>
           <w:ilvl w:val="0"/>
-          <w:numId w:val="59"/>
+          <w:numId w:val="60"/>
         </w:numPr>
         <w:spacing w:after="240" w:before="0" w:beforeAutospacing="0" w:lineRule="auto"/>
         <w:ind w:left="720" w:hanging="360"/>
@@ -11880,7 +11694,7 @@
       <w:pPr>
         <w:numPr>
           <w:ilvl w:val="0"/>
-          <w:numId w:val="63"/>
+          <w:numId w:val="64"/>
         </w:numPr>
         <w:spacing w:after="0" w:afterAutospacing="0" w:before="240" w:lineRule="auto"/>
         <w:ind w:left="720" w:hanging="360"/>
@@ -11896,7 +11710,7 @@
       <w:pPr>
         <w:numPr>
           <w:ilvl w:val="0"/>
-          <w:numId w:val="63"/>
+          <w:numId w:val="64"/>
         </w:numPr>
         <w:spacing w:after="0" w:afterAutospacing="0" w:before="0" w:beforeAutospacing="0" w:lineRule="auto"/>
         <w:ind w:left="720" w:hanging="360"/>
@@ -11912,7 +11726,7 @@
       <w:pPr>
         <w:numPr>
           <w:ilvl w:val="0"/>
-          <w:numId w:val="63"/>
+          <w:numId w:val="64"/>
         </w:numPr>
         <w:spacing w:after="0" w:afterAutospacing="0" w:before="0" w:beforeAutospacing="0" w:lineRule="auto"/>
         <w:ind w:left="720" w:hanging="360"/>
@@ -11928,7 +11742,7 @@
       <w:pPr>
         <w:numPr>
           <w:ilvl w:val="0"/>
-          <w:numId w:val="63"/>
+          <w:numId w:val="64"/>
         </w:numPr>
         <w:spacing w:after="0" w:afterAutospacing="0" w:before="0" w:beforeAutospacing="0" w:lineRule="auto"/>
         <w:ind w:left="720" w:hanging="360"/>
@@ -11944,7 +11758,7 @@
       <w:pPr>
         <w:numPr>
           <w:ilvl w:val="0"/>
-          <w:numId w:val="63"/>
+          <w:numId w:val="64"/>
         </w:numPr>
         <w:spacing w:after="0" w:afterAutospacing="0" w:before="0" w:beforeAutospacing="0" w:lineRule="auto"/>
         <w:ind w:left="720" w:hanging="360"/>
@@ -11960,7 +11774,7 @@
       <w:pPr>
         <w:numPr>
           <w:ilvl w:val="0"/>
-          <w:numId w:val="63"/>
+          <w:numId w:val="64"/>
         </w:numPr>
         <w:spacing w:after="240" w:before="0" w:beforeAutospacing="0" w:lineRule="auto"/>
         <w:ind w:left="720" w:hanging="360"/>
@@ -12244,7 +12058,7 @@
       <w:pPr>
         <w:numPr>
           <w:ilvl w:val="0"/>
-          <w:numId w:val="94"/>
+          <w:numId w:val="96"/>
         </w:numPr>
         <w:spacing w:after="0" w:afterAutospacing="0" w:before="240" w:lineRule="auto"/>
         <w:ind w:left="720" w:hanging="360"/>
@@ -12274,7 +12088,7 @@
       <w:pPr>
         <w:numPr>
           <w:ilvl w:val="0"/>
-          <w:numId w:val="94"/>
+          <w:numId w:val="96"/>
         </w:numPr>
         <w:spacing w:after="0" w:afterAutospacing="0" w:before="0" w:beforeAutospacing="0" w:lineRule="auto"/>
         <w:ind w:left="720" w:hanging="360"/>
@@ -12290,7 +12104,7 @@
       <w:pPr>
         <w:numPr>
           <w:ilvl w:val="1"/>
-          <w:numId w:val="94"/>
+          <w:numId w:val="96"/>
         </w:numPr>
         <w:spacing w:after="0" w:afterAutospacing="0" w:before="0" w:beforeAutospacing="0" w:lineRule="auto"/>
         <w:ind w:left="1440" w:hanging="360"/>
@@ -12306,7 +12120,7 @@
       <w:pPr>
         <w:numPr>
           <w:ilvl w:val="1"/>
-          <w:numId w:val="94"/>
+          <w:numId w:val="96"/>
         </w:numPr>
         <w:spacing w:after="0" w:afterAutospacing="0" w:before="0" w:beforeAutospacing="0" w:lineRule="auto"/>
         <w:ind w:left="1440" w:hanging="360"/>
@@ -12322,7 +12136,7 @@
       <w:pPr>
         <w:numPr>
           <w:ilvl w:val="0"/>
-          <w:numId w:val="94"/>
+          <w:numId w:val="96"/>
         </w:numPr>
         <w:spacing w:after="240" w:before="0" w:beforeAutospacing="0" w:lineRule="auto"/>
         <w:ind w:left="720" w:hanging="360"/>
@@ -12630,7 +12444,7 @@
           <w:pgNumType w:start="1"/>
         </w:sectPr>
       </w:pPr>
-      <w:bookmarkStart w:colFirst="0" w:colLast="0" w:name="_cc6lriipooqp" w:id="20"/>
+      <w:bookmarkStart w:colFirst="0" w:colLast="0" w:name="_ihrbup47jwla" w:id="20"/>
       <w:bookmarkEnd w:id="20"/>
       <w:r>
         <w:rPr>
@@ -13920,7 +13734,7 @@
           <w:szCs w:val="32"/>
         </w:rPr>
       </w:pPr>
-      <w:bookmarkStart w:colFirst="0" w:colLast="0" w:name="_d3etffhqjipl" w:id="21"/>
+      <w:bookmarkStart w:colFirst="0" w:colLast="0" w:name="_q9k22aawgchg" w:id="21"/>
       <w:bookmarkEnd w:id="21"/>
       <w:r>
         <w:rPr>
@@ -14122,7 +13936,7 @@
       <w:pPr>
         <w:numPr>
           <w:ilvl w:val="0"/>
-          <w:numId w:val="84"/>
+          <w:numId w:val="86"/>
         </w:numPr>
         <w:spacing w:after="0" w:afterAutospacing="0" w:line="240" w:lineRule="auto"/>
         <w:ind w:left="720" w:hanging="360"/>
@@ -14143,7 +13957,7 @@
       <w:pPr>
         <w:numPr>
           <w:ilvl w:val="0"/>
-          <w:numId w:val="84"/>
+          <w:numId w:val="86"/>
         </w:numPr>
         <w:spacing w:after="60" w:line="240" w:lineRule="auto"/>
         <w:ind w:left="720" w:hanging="360"/>
@@ -14186,7 +14000,7 @@
       <w:pPr>
         <w:numPr>
           <w:ilvl w:val="0"/>
-          <w:numId w:val="71"/>
+          <w:numId w:val="72"/>
         </w:numPr>
         <w:spacing w:after="60" w:line="240" w:lineRule="auto"/>
         <w:ind w:left="720" w:hanging="360"/>
@@ -14228,7 +14042,7 @@
       <w:pPr>
         <w:numPr>
           <w:ilvl w:val="0"/>
-          <w:numId w:val="61"/>
+          <w:numId w:val="62"/>
         </w:numPr>
         <w:spacing w:after="60" w:line="240" w:lineRule="auto"/>
         <w:ind w:left="720" w:hanging="360"/>
@@ -14375,7 +14189,7 @@
       <w:pPr>
         <w:numPr>
           <w:ilvl w:val="0"/>
-          <w:numId w:val="57"/>
+          <w:numId w:val="58"/>
         </w:numPr>
         <w:spacing w:after="60" w:line="240" w:lineRule="auto"/>
         <w:ind w:left="720" w:hanging="360"/>
@@ -14417,7 +14231,7 @@
       <w:pPr>
         <w:numPr>
           <w:ilvl w:val="0"/>
-          <w:numId w:val="96"/>
+          <w:numId w:val="98"/>
         </w:numPr>
         <w:spacing w:after="0" w:afterAutospacing="0" w:line="240" w:lineRule="auto"/>
         <w:ind w:left="720" w:hanging="360"/>
@@ -14437,7 +14251,7 @@
       <w:pPr>
         <w:numPr>
           <w:ilvl w:val="0"/>
-          <w:numId w:val="96"/>
+          <w:numId w:val="98"/>
         </w:numPr>
         <w:spacing w:after="60" w:line="240" w:lineRule="auto"/>
         <w:ind w:left="720" w:hanging="360"/>
@@ -14521,7 +14335,7 @@
       <w:pPr>
         <w:numPr>
           <w:ilvl w:val="0"/>
-          <w:numId w:val="66"/>
+          <w:numId w:val="67"/>
         </w:numPr>
         <w:spacing w:after="60" w:line="240" w:lineRule="auto"/>
         <w:ind w:left="720" w:hanging="360"/>
@@ -14628,7 +14442,7 @@
       <w:pPr>
         <w:numPr>
           <w:ilvl w:val="0"/>
-          <w:numId w:val="76"/>
+          <w:numId w:val="78"/>
         </w:numPr>
         <w:spacing w:after="0" w:afterAutospacing="0" w:line="240" w:lineRule="auto"/>
         <w:ind w:left="720" w:hanging="360"/>
@@ -14649,7 +14463,7 @@
       <w:pPr>
         <w:numPr>
           <w:ilvl w:val="0"/>
-          <w:numId w:val="76"/>
+          <w:numId w:val="78"/>
         </w:numPr>
         <w:spacing w:after="60" w:line="240" w:lineRule="auto"/>
         <w:ind w:left="720" w:hanging="360"/>
@@ -14692,7 +14506,7 @@
       <w:pPr>
         <w:numPr>
           <w:ilvl w:val="0"/>
-          <w:numId w:val="82"/>
+          <w:numId w:val="84"/>
         </w:numPr>
         <w:spacing w:after="0" w:afterAutospacing="0" w:line="240" w:lineRule="auto"/>
         <w:ind w:left="720" w:hanging="360"/>
@@ -14713,7 +14527,7 @@
       <w:pPr>
         <w:numPr>
           <w:ilvl w:val="0"/>
-          <w:numId w:val="82"/>
+          <w:numId w:val="84"/>
         </w:numPr>
         <w:spacing w:after="60" w:line="240" w:lineRule="auto"/>
         <w:ind w:left="720" w:hanging="360"/>
@@ -14814,7 +14628,7 @@
           <w:pgNumType w:start="1"/>
         </w:sectPr>
       </w:pPr>
-      <w:bookmarkStart w:colFirst="0" w:colLast="0" w:name="_58rpdq6lhs5x" w:id="22"/>
+      <w:bookmarkStart w:colFirst="0" w:colLast="0" w:name="_7lsv8cxrdx8" w:id="22"/>
       <w:bookmarkEnd w:id="22"/>
       <w:r>
         <w:rPr>
@@ -14966,7 +14780,7 @@
               <w:keepLines w:val="1"/>
               <w:numPr>
                 <w:ilvl w:val="0"/>
-                <w:numId w:val="81"/>
+                <w:numId w:val="57"/>
               </w:numPr>
               <w:spacing w:after="0" w:afterAutospacing="0" w:before="240" w:lineRule="auto"/>
               <w:ind w:left="720" w:hanging="360"/>
@@ -14983,7 +14797,7 @@
                 <w:szCs w:val="24"/>
                 <w:rtl w:val="0"/>
               </w:rPr>
-              <w:t xml:space="preserve">Fix landing page always set to dark theme</w:t>
+              <w:t xml:space="preserve">Determine what is causing hotel type services to start at 1 PM, even though other services can start as early as 8 AM</w:t>
             </w:r>
           </w:p>
           <w:p>
@@ -14992,7 +14806,7 @@
               <w:keepLines w:val="1"/>
               <w:numPr>
                 <w:ilvl w:val="1"/>
-                <w:numId w:val="81"/>
+                <w:numId w:val="57"/>
               </w:numPr>
               <w:spacing w:after="0" w:afterAutospacing="0" w:before="0" w:beforeAutospacing="0" w:lineRule="auto"/>
               <w:ind w:left="1440" w:hanging="360"/>
@@ -15007,9 +14821,70 @@
                 <w:rFonts w:ascii="Times" w:cs="Times" w:eastAsia="Times" w:hAnsi="Times"/>
                 <w:sz w:val="24"/>
                 <w:szCs w:val="24"/>
-                <w:rtl w:val="0"/>
-              </w:rPr>
-              <w:t xml:space="preserve">Make it so that it adapts the theme of the system automatically, if light, light</w:t>
+              </w:rPr>
+              <w:drawing>
+                <wp:inline distB="114300" distT="114300" distL="114300" distR="114300">
+                  <wp:extent cx="4312133" cy="3372309"/>
+                  <wp:effectExtent b="0" l="0" r="0" t="0"/>
+                  <wp:docPr id="17" name="image18.png"/>
+                  <a:graphic>
+                    <a:graphicData uri="http://schemas.openxmlformats.org/drawingml/2006/picture">
+                      <pic:pic>
+                        <pic:nvPicPr>
+                          <pic:cNvPr id="0" name="image18.png"/>
+                          <pic:cNvPicPr preferRelativeResize="0"/>
+                        </pic:nvPicPr>
+                        <pic:blipFill>
+                          <a:blip r:embed="rId25"/>
+                          <a:srcRect b="0" l="0" r="0" t="0"/>
+                          <a:stretch>
+                            <a:fillRect/>
+                          </a:stretch>
+                        </pic:blipFill>
+                        <pic:spPr>
+                          <a:xfrm>
+                            <a:off x="0" y="0"/>
+                            <a:ext cx="4312133" cy="3372309"/>
+                          </a:xfrm>
+                          <a:prstGeom prst="rect"/>
+                          <a:ln/>
+                        </pic:spPr>
+                      </pic:pic>
+                    </a:graphicData>
+                  </a:graphic>
+                </wp:inline>
+              </w:drawing>
+            </w:r>
+            <w:r>
+              <w:rPr>
+                <w:rtl w:val="0"/>
+              </w:rPr>
+            </w:r>
+          </w:p>
+          <w:p>
+            <w:pPr>
+              <w:keepNext w:val="1"/>
+              <w:keepLines w:val="1"/>
+              <w:numPr>
+                <w:ilvl w:val="0"/>
+                <w:numId w:val="57"/>
+              </w:numPr>
+              <w:spacing w:after="0" w:afterAutospacing="0" w:before="0" w:beforeAutospacing="0" w:lineRule="auto"/>
+              <w:ind w:left="720" w:hanging="360"/>
+              <w:rPr>
+                <w:rFonts w:ascii="Times" w:cs="Times" w:eastAsia="Times" w:hAnsi="Times"/>
+                <w:sz w:val="24"/>
+                <w:szCs w:val="24"/>
+              </w:rPr>
+            </w:pPr>
+            <w:r>
+              <w:rPr>
+                <w:rFonts w:ascii="Times" w:cs="Times" w:eastAsia="Times" w:hAnsi="Times"/>
+                <w:sz w:val="24"/>
+                <w:szCs w:val="24"/>
+                <w:rtl w:val="0"/>
+              </w:rPr>
+              <w:t xml:space="preserve">Image context:</w:t>
             </w:r>
           </w:p>
           <w:p>
@@ -15018,7 +14893,59 @@
               <w:keepLines w:val="1"/>
               <w:numPr>
                 <w:ilvl w:val="1"/>
-                <w:numId w:val="81"/>
+                <w:numId w:val="57"/>
+              </w:numPr>
+              <w:spacing w:after="0" w:afterAutospacing="0" w:before="0" w:beforeAutospacing="0" w:lineRule="auto"/>
+              <w:ind w:left="1440" w:hanging="360"/>
+              <w:rPr>
+                <w:rFonts w:ascii="Times" w:cs="Times" w:eastAsia="Times" w:hAnsi="Times"/>
+                <w:sz w:val="24"/>
+                <w:szCs w:val="24"/>
+              </w:rPr>
+            </w:pPr>
+            <w:r>
+              <w:rPr>
+                <w:rFonts w:ascii="Times" w:cs="Times" w:eastAsia="Times" w:hAnsi="Times"/>
+                <w:sz w:val="24"/>
+                <w:szCs w:val="24"/>
+                <w:rtl w:val="0"/>
+              </w:rPr>
+              <w:t xml:space="preserve">It is a bundled booking</w:t>
+            </w:r>
+          </w:p>
+          <w:p>
+            <w:pPr>
+              <w:keepNext w:val="1"/>
+              <w:keepLines w:val="1"/>
+              <w:numPr>
+                <w:ilvl w:val="1"/>
+                <w:numId w:val="57"/>
+              </w:numPr>
+              <w:spacing w:after="0" w:afterAutospacing="0" w:before="0" w:beforeAutospacing="0" w:lineRule="auto"/>
+              <w:ind w:left="1440" w:hanging="360"/>
+              <w:rPr>
+                <w:rFonts w:ascii="Times" w:cs="Times" w:eastAsia="Times" w:hAnsi="Times"/>
+                <w:sz w:val="24"/>
+                <w:szCs w:val="24"/>
+              </w:rPr>
+            </w:pPr>
+            <w:r>
+              <w:rPr>
+                <w:rFonts w:ascii="Times" w:cs="Times" w:eastAsia="Times" w:hAnsi="Times"/>
+                <w:sz w:val="24"/>
+                <w:szCs w:val="24"/>
+                <w:rtl w:val="0"/>
+              </w:rPr>
+              <w:t xml:space="preserve">Initial booking at hotel type scheduled for 1 PM (couldn’t choose anything earlier)</w:t>
+            </w:r>
+          </w:p>
+          <w:p>
+            <w:pPr>
+              <w:keepNext w:val="1"/>
+              <w:keepLines w:val="1"/>
+              <w:numPr>
+                <w:ilvl w:val="1"/>
+                <w:numId w:val="57"/>
               </w:numPr>
               <w:spacing w:after="240" w:before="0" w:beforeAutospacing="0" w:lineRule="auto"/>
               <w:ind w:left="1440" w:hanging="360"/>
@@ -15035,7 +14962,7 @@
                 <w:szCs w:val="24"/>
                 <w:rtl w:val="0"/>
               </w:rPr>
-              <w:t xml:space="preserve">Add a basic light/dark theme switch at landing page navbar</w:t>
+              <w:t xml:space="preserve">This is the 2nd booking, can choose 9 AM</w:t>
             </w:r>
           </w:p>
         </w:tc>
@@ -15054,7 +14981,375 @@
             <w:sdt>
               <w:sdtPr>
                 <w:alias w:val="Configuration 1"/>
-                <w:id w:val="-383004340"/>
+                <w:id w:val="-1154658326"/>
+                <w:dropDownList w:lastValue="Unknown">
+                  <w:listItem w:displayText="Cakewalk" w:value="Cakewalk"/>
+                  <w:listItem w:displayText="Easy" w:value="Easy"/>
+                  <w:listItem w:displayText="Medium" w:value="Medium"/>
+                  <w:listItem w:displayText="Hard" w:value="Hard"/>
+                  <w:listItem w:displayText="Unknown" w:value="Unknown"/>
+                </w:dropDownList>
+              </w:sdtPr>
+              <w:sdtContent>
+                <w:r>
+                  <w:rPr>
+                    <w:rFonts w:ascii="Times" w:cs="Times" w:eastAsia="Times" w:hAnsi="Times"/>
+                    <w:color w:val="5a3286"/>
+                    <w:sz w:val="24"/>
+                    <w:szCs w:val="24"/>
+                    <w:shd w:fill="e6cff2" w:val="clear"/>
+                  </w:rPr>
+                  <w:t xml:space="preserve">Unknown</w:t>
+                </w:r>
+              </w:sdtContent>
+            </w:sdt>
+            <w:r>
+              <w:rPr>
+                <w:rtl w:val="0"/>
+              </w:rPr>
+            </w:r>
+          </w:p>
+        </w:tc>
+      </w:tr>
+      <w:tr>
+        <w:trPr>
+          <w:cantSplit w:val="0"/>
+          <w:trHeight w:val="543" w:hRule="atLeast"/>
+          <w:tblHeader w:val="0"/>
+        </w:trPr>
+        <w:tc>
+          <w:tcPr/>
+          <w:p>
+            <w:pPr>
+              <w:keepNext w:val="1"/>
+              <w:keepLines w:val="1"/>
+              <w:numPr>
+                <w:ilvl w:val="0"/>
+                <w:numId w:val="76"/>
+              </w:numPr>
+              <w:spacing w:after="0" w:afterAutospacing="0" w:before="240" w:lineRule="auto"/>
+              <w:ind w:left="720" w:hanging="360"/>
+              <w:rPr>
+                <w:rFonts w:ascii="Times" w:cs="Times" w:eastAsia="Times" w:hAnsi="Times"/>
+                <w:sz w:val="24"/>
+                <w:szCs w:val="24"/>
+              </w:rPr>
+            </w:pPr>
+            <w:r>
+              <w:rPr>
+                <w:rFonts w:ascii="Times" w:cs="Times" w:eastAsia="Times" w:hAnsi="Times"/>
+                <w:sz w:val="24"/>
+                <w:szCs w:val="24"/>
+                <w:rtl w:val="0"/>
+              </w:rPr>
+              <w:t xml:space="preserve">On new booking &gt; hotel type service &gt; feeding and med instructions:</w:t>
+            </w:r>
+          </w:p>
+          <w:p>
+            <w:pPr>
+              <w:keepNext w:val="1"/>
+              <w:keepLines w:val="1"/>
+              <w:numPr>
+                <w:ilvl w:val="1"/>
+                <w:numId w:val="76"/>
+              </w:numPr>
+              <w:spacing w:after="0" w:afterAutospacing="0" w:before="0" w:beforeAutospacing="0" w:lineRule="auto"/>
+              <w:ind w:left="1440" w:hanging="360"/>
+              <w:rPr>
+                <w:rFonts w:ascii="Times" w:cs="Times" w:eastAsia="Times" w:hAnsi="Times"/>
+                <w:sz w:val="24"/>
+                <w:szCs w:val="24"/>
+              </w:rPr>
+            </w:pPr>
+            <w:r>
+              <w:rPr>
+                <w:rFonts w:ascii="Times" w:cs="Times" w:eastAsia="Times" w:hAnsi="Times"/>
+                <w:sz w:val="24"/>
+                <w:szCs w:val="24"/>
+                <w:rtl w:val="0"/>
+              </w:rPr>
+              <w:t xml:space="preserve">Make it more specific</w:t>
+            </w:r>
+          </w:p>
+          <w:p>
+            <w:pPr>
+              <w:keepNext w:val="1"/>
+              <w:keepLines w:val="1"/>
+              <w:numPr>
+                <w:ilvl w:val="1"/>
+                <w:numId w:val="76"/>
+              </w:numPr>
+              <w:spacing w:after="0" w:afterAutospacing="0" w:before="0" w:beforeAutospacing="0" w:lineRule="auto"/>
+              <w:ind w:left="1440" w:hanging="360"/>
+              <w:rPr>
+                <w:rFonts w:ascii="Times" w:cs="Times" w:eastAsia="Times" w:hAnsi="Times"/>
+                <w:sz w:val="24"/>
+                <w:szCs w:val="24"/>
+              </w:rPr>
+            </w:pPr>
+            <w:r>
+              <w:rPr>
+                <w:rFonts w:ascii="Times" w:cs="Times" w:eastAsia="Times" w:hAnsi="Times"/>
+                <w:sz w:val="24"/>
+                <w:szCs w:val="24"/>
+                <w:rtl w:val="0"/>
+              </w:rPr>
+              <w:t xml:space="preserve">Add units of measurements</w:t>
+            </w:r>
+          </w:p>
+          <w:p>
+            <w:pPr>
+              <w:keepNext w:val="1"/>
+              <w:keepLines w:val="1"/>
+              <w:numPr>
+                <w:ilvl w:val="0"/>
+                <w:numId w:val="76"/>
+              </w:numPr>
+              <w:spacing w:after="0" w:afterAutospacing="0" w:before="0" w:beforeAutospacing="0" w:lineRule="auto"/>
+              <w:ind w:left="720" w:hanging="360"/>
+              <w:rPr>
+                <w:rFonts w:ascii="Times" w:cs="Times" w:eastAsia="Times" w:hAnsi="Times"/>
+                <w:sz w:val="24"/>
+                <w:szCs w:val="24"/>
+              </w:rPr>
+            </w:pPr>
+            <w:r>
+              <w:rPr>
+                <w:rFonts w:ascii="Times" w:cs="Times" w:eastAsia="Times" w:hAnsi="Times"/>
+                <w:sz w:val="24"/>
+                <w:szCs w:val="24"/>
+                <w:rtl w:val="0"/>
+              </w:rPr>
+              <w:t xml:space="preserve">Perhaps directly to the items, not during instructions</w:t>
+            </w:r>
+          </w:p>
+          <w:p>
+            <w:pPr>
+              <w:keepNext w:val="1"/>
+              <w:keepLines w:val="1"/>
+              <w:numPr>
+                <w:ilvl w:val="1"/>
+                <w:numId w:val="76"/>
+              </w:numPr>
+              <w:spacing w:after="0" w:afterAutospacing="0" w:before="0" w:beforeAutospacing="0" w:lineRule="auto"/>
+              <w:ind w:left="1440" w:hanging="360"/>
+              <w:rPr>
+                <w:rFonts w:ascii="Times" w:cs="Times" w:eastAsia="Times" w:hAnsi="Times"/>
+                <w:sz w:val="24"/>
+                <w:szCs w:val="24"/>
+              </w:rPr>
+            </w:pPr>
+            <w:r>
+              <w:rPr>
+                <w:rFonts w:ascii="Times" w:cs="Times" w:eastAsia="Times" w:hAnsi="Times"/>
+                <w:sz w:val="24"/>
+                <w:szCs w:val="24"/>
+                <w:rtl w:val="0"/>
+              </w:rPr>
+              <w:t xml:space="preserve">Like when adding a new feeding/med item as a customer, allow them to specify its unit of measurement</w:t>
+            </w:r>
+          </w:p>
+          <w:p>
+            <w:pPr>
+              <w:keepNext w:val="1"/>
+              <w:keepLines w:val="1"/>
+              <w:numPr>
+                <w:ilvl w:val="1"/>
+                <w:numId w:val="76"/>
+              </w:numPr>
+              <w:spacing w:after="0" w:afterAutospacing="0" w:before="0" w:beforeAutospacing="0" w:lineRule="auto"/>
+              <w:ind w:left="1440" w:hanging="360"/>
+              <w:rPr>
+                <w:rFonts w:ascii="Times" w:cs="Times" w:eastAsia="Times" w:hAnsi="Times"/>
+                <w:sz w:val="24"/>
+                <w:szCs w:val="24"/>
+              </w:rPr>
+            </w:pPr>
+            <w:r>
+              <w:rPr>
+                <w:rFonts w:ascii="Times" w:cs="Times" w:eastAsia="Times" w:hAnsi="Times"/>
+                <w:sz w:val="24"/>
+                <w:szCs w:val="24"/>
+                <w:rtl w:val="0"/>
+              </w:rPr>
+              <w:t xml:space="preserve">Like those you see in diet apps</w:t>
+            </w:r>
+          </w:p>
+          <w:p>
+            <w:pPr>
+              <w:keepNext w:val="1"/>
+              <w:keepLines w:val="1"/>
+              <w:numPr>
+                <w:ilvl w:val="1"/>
+                <w:numId w:val="76"/>
+              </w:numPr>
+              <w:spacing w:after="240" w:before="0" w:beforeAutospacing="0" w:lineRule="auto"/>
+              <w:ind w:left="1440" w:hanging="360"/>
+              <w:rPr>
+                <w:rFonts w:ascii="Times" w:cs="Times" w:eastAsia="Times" w:hAnsi="Times"/>
+                <w:sz w:val="24"/>
+                <w:szCs w:val="24"/>
+              </w:rPr>
+            </w:pPr>
+            <w:r>
+              <w:rPr>
+                <w:rFonts w:ascii="Times" w:cs="Times" w:eastAsia="Times" w:hAnsi="Times"/>
+                <w:sz w:val="24"/>
+                <w:szCs w:val="24"/>
+                <w:rtl w:val="0"/>
+              </w:rPr>
+              <w:t xml:space="preserve">Perhaps allow them to attach images to it too</w:t>
+            </w:r>
+          </w:p>
+        </w:tc>
+        <w:tc>
+          <w:tcPr/>
+          <w:p>
+            <w:pPr>
+              <w:widowControl w:val="0"/>
+              <w:spacing w:line="240" w:lineRule="auto"/>
+              <w:rPr>
+                <w:rFonts w:ascii="Times" w:cs="Times" w:eastAsia="Times" w:hAnsi="Times"/>
+                <w:sz w:val="24"/>
+                <w:szCs w:val="24"/>
+              </w:rPr>
+            </w:pPr>
+            <w:sdt>
+              <w:sdtPr>
+                <w:alias w:val="Configuration 1"/>
+                <w:id w:val="-1146974649"/>
+                <w:dropDownList w:lastValue="Medium">
+                  <w:listItem w:displayText="Cakewalk" w:value="Cakewalk"/>
+                  <w:listItem w:displayText="Easy" w:value="Easy"/>
+                  <w:listItem w:displayText="Medium" w:value="Medium"/>
+                  <w:listItem w:displayText="Hard" w:value="Hard"/>
+                  <w:listItem w:displayText="Unknown" w:value="Unknown"/>
+                </w:dropDownList>
+              </w:sdtPr>
+              <w:sdtContent>
+                <w:r>
+                  <w:rPr>
+                    <w:rFonts w:ascii="Times" w:cs="Times" w:eastAsia="Times" w:hAnsi="Times"/>
+                    <w:color w:val="473821"/>
+                    <w:sz w:val="24"/>
+                    <w:szCs w:val="24"/>
+                    <w:shd w:fill="ffe5a0" w:val="clear"/>
+                  </w:rPr>
+                  <w:t xml:space="preserve">Medium</w:t>
+                </w:r>
+              </w:sdtContent>
+            </w:sdt>
+            <w:r>
+              <w:rPr>
+                <w:rtl w:val="0"/>
+              </w:rPr>
+            </w:r>
+          </w:p>
+        </w:tc>
+      </w:tr>
+      <w:tr>
+        <w:trPr>
+          <w:cantSplit w:val="0"/>
+          <w:trHeight w:val="543" w:hRule="atLeast"/>
+          <w:tblHeader w:val="0"/>
+        </w:trPr>
+        <w:tc>
+          <w:tcPr/>
+          <w:p>
+            <w:pPr>
+              <w:keepNext w:val="1"/>
+              <w:keepLines w:val="1"/>
+              <w:numPr>
+                <w:ilvl w:val="0"/>
+                <w:numId w:val="83"/>
+              </w:numPr>
+              <w:spacing w:after="0" w:afterAutospacing="0" w:before="240" w:lineRule="auto"/>
+              <w:ind w:left="720" w:hanging="360"/>
+              <w:rPr>
+                <w:rFonts w:ascii="Times" w:cs="Times" w:eastAsia="Times" w:hAnsi="Times"/>
+                <w:sz w:val="24"/>
+                <w:szCs w:val="24"/>
+              </w:rPr>
+            </w:pPr>
+            <w:r>
+              <w:rPr>
+                <w:rFonts w:ascii="Times" w:cs="Times" w:eastAsia="Times" w:hAnsi="Times"/>
+                <w:sz w:val="24"/>
+                <w:szCs w:val="24"/>
+                <w:rtl w:val="0"/>
+              </w:rPr>
+              <w:t xml:space="preserve">Fix landing page always set to dark theme</w:t>
+            </w:r>
+          </w:p>
+          <w:p>
+            <w:pPr>
+              <w:keepNext w:val="1"/>
+              <w:keepLines w:val="1"/>
+              <w:numPr>
+                <w:ilvl w:val="1"/>
+                <w:numId w:val="83"/>
+              </w:numPr>
+              <w:spacing w:after="0" w:afterAutospacing="0" w:before="0" w:beforeAutospacing="0" w:lineRule="auto"/>
+              <w:ind w:left="1440" w:hanging="360"/>
+              <w:rPr>
+                <w:rFonts w:ascii="Times" w:cs="Times" w:eastAsia="Times" w:hAnsi="Times"/>
+                <w:sz w:val="24"/>
+                <w:szCs w:val="24"/>
+              </w:rPr>
+            </w:pPr>
+            <w:r>
+              <w:rPr>
+                <w:rFonts w:ascii="Times" w:cs="Times" w:eastAsia="Times" w:hAnsi="Times"/>
+                <w:sz w:val="24"/>
+                <w:szCs w:val="24"/>
+                <w:rtl w:val="0"/>
+              </w:rPr>
+              <w:t xml:space="preserve">Make it so that it adapts the theme of the system automatically, if light, light</w:t>
+            </w:r>
+          </w:p>
+          <w:p>
+            <w:pPr>
+              <w:keepNext w:val="1"/>
+              <w:keepLines w:val="1"/>
+              <w:numPr>
+                <w:ilvl w:val="1"/>
+                <w:numId w:val="83"/>
+              </w:numPr>
+              <w:spacing w:after="240" w:before="0" w:beforeAutospacing="0" w:lineRule="auto"/>
+              <w:ind w:left="1440" w:hanging="360"/>
+              <w:rPr>
+                <w:rFonts w:ascii="Times" w:cs="Times" w:eastAsia="Times" w:hAnsi="Times"/>
+                <w:sz w:val="24"/>
+                <w:szCs w:val="24"/>
+              </w:rPr>
+            </w:pPr>
+            <w:r>
+              <w:rPr>
+                <w:rFonts w:ascii="Times" w:cs="Times" w:eastAsia="Times" w:hAnsi="Times"/>
+                <w:sz w:val="24"/>
+                <w:szCs w:val="24"/>
+                <w:rtl w:val="0"/>
+              </w:rPr>
+              <w:t xml:space="preserve">Add a basic light/dark theme switch at landing page navbar</w:t>
+            </w:r>
+          </w:p>
+        </w:tc>
+        <w:tc>
+          <w:tcPr/>
+          <w:p>
+            <w:pPr>
+              <w:widowControl w:val="0"/>
+              <w:spacing w:line="240" w:lineRule="auto"/>
+              <w:rPr>
+                <w:rFonts w:ascii="Times" w:cs="Times" w:eastAsia="Times" w:hAnsi="Times"/>
+                <w:sz w:val="24"/>
+                <w:szCs w:val="24"/>
+              </w:rPr>
+            </w:pPr>
+            <w:sdt>
+              <w:sdtPr>
+                <w:alias w:val="Configuration 1"/>
+                <w:id w:val="-898161373"/>
                 <w:dropDownList w:lastValue="Cakewalk">
                   <w:listItem w:displayText="Cakewalk" w:value="Cakewalk"/>
                   <w:listItem w:displayText="Easy" w:value="Easy"/>
@@ -15186,7 +15481,7 @@
             <w:sdt>
               <w:sdtPr>
                 <w:alias w:val="Configuration 1"/>
-                <w:id w:val="1183860009"/>
+                <w:id w:val="-1460449364"/>
                 <w:dropDownList w:lastValue="Medium">
                   <w:listItem w:displayText="Cakewalk" w:value="Cakewalk"/>
                   <w:listItem w:displayText="Easy" w:value="Easy"/>
@@ -15230,7 +15525,7 @@
               <w:keepLines w:val="1"/>
               <w:numPr>
                 <w:ilvl w:val="0"/>
-                <w:numId w:val="70"/>
+                <w:numId w:val="71"/>
               </w:numPr>
               <w:spacing w:after="0" w:afterAutospacing="0" w:before="240" w:lineRule="auto"/>
               <w:ind w:left="720" w:hanging="360"/>
@@ -15256,7 +15551,7 @@
               <w:keepLines w:val="1"/>
               <w:numPr>
                 <w:ilvl w:val="1"/>
-                <w:numId w:val="70"/>
+                <w:numId w:val="71"/>
               </w:numPr>
               <w:spacing w:after="240" w:before="0" w:beforeAutospacing="0" w:lineRule="auto"/>
               <w:ind w:left="1440" w:hanging="360"/>
@@ -15292,7 +15587,7 @@
             <w:sdt>
               <w:sdtPr>
                 <w:alias w:val="Configuration 1"/>
-                <w:id w:val="1832414106"/>
+                <w:id w:val="-2081961214"/>
                 <w:dropDownList w:lastValue="Medium">
                   <w:listItem w:displayText="Cakewalk" w:value="Cakewalk"/>
                   <w:listItem w:displayText="Easy" w:value="Easy"/>
@@ -15372,7 +15667,7 @@
             <w:sdt>
               <w:sdtPr>
                 <w:alias w:val="Configuration 1"/>
-                <w:id w:val="257311350"/>
+                <w:id w:val="-1408231676"/>
                 <w:dropDownList w:lastValue="Medium">
                   <w:listItem w:displayText="Cakewalk" w:value="Cakewalk"/>
                   <w:listItem w:displayText="Easy" w:value="Easy"/>
@@ -15416,7 +15711,7 @@
               <w:keepLines w:val="1"/>
               <w:numPr>
                 <w:ilvl w:val="0"/>
-                <w:numId w:val="64"/>
+                <w:numId w:val="65"/>
               </w:numPr>
               <w:spacing w:after="0" w:afterAutospacing="0" w:before="240" w:lineRule="auto"/>
               <w:ind w:left="720" w:hanging="360"/>
@@ -15442,7 +15737,7 @@
               <w:keepLines w:val="1"/>
               <w:numPr>
                 <w:ilvl w:val="1"/>
-                <w:numId w:val="64"/>
+                <w:numId w:val="65"/>
               </w:numPr>
               <w:spacing w:after="0" w:afterAutospacing="0" w:before="0" w:beforeAutospacing="0" w:lineRule="auto"/>
               <w:ind w:left="1440" w:hanging="360"/>
@@ -15468,7 +15763,7 @@
               <w:keepLines w:val="1"/>
               <w:numPr>
                 <w:ilvl w:val="1"/>
-                <w:numId w:val="64"/>
+                <w:numId w:val="65"/>
               </w:numPr>
               <w:spacing w:after="0" w:afterAutospacing="0" w:before="0" w:beforeAutospacing="0" w:lineRule="auto"/>
               <w:ind w:left="1440" w:hanging="360"/>
@@ -15494,7 +15789,7 @@
               <w:keepLines w:val="1"/>
               <w:numPr>
                 <w:ilvl w:val="1"/>
-                <w:numId w:val="64"/>
+                <w:numId w:val="65"/>
               </w:numPr>
               <w:spacing w:after="240" w:before="0" w:beforeAutospacing="0" w:lineRule="auto"/>
               <w:ind w:left="1440" w:hanging="360"/>
@@ -15530,7 +15825,7 @@
             <w:sdt>
               <w:sdtPr>
                 <w:alias w:val="Configuration 1"/>
-                <w:id w:val="1526857226"/>
+                <w:id w:val="882633180"/>
                 <w:dropDownList w:lastValue="Easy">
                   <w:listItem w:displayText="Cakewalk" w:value="Cakewalk"/>
                   <w:listItem w:displayText="Easy" w:value="Easy"/>
@@ -15662,7 +15957,7 @@
             <w:sdt>
               <w:sdtPr>
                 <w:alias w:val="Configuration 1"/>
-                <w:id w:val="-1088929967"/>
+                <w:id w:val="926295194"/>
                 <w:dropDownList w:lastValue="Medium">
                   <w:listItem w:displayText="Cakewalk" w:value="Cakewalk"/>
                   <w:listItem w:displayText="Easy" w:value="Easy"/>
@@ -15976,7 +16271,7 @@
             <w:sdt>
               <w:sdtPr>
                 <w:alias w:val="Configuration 1"/>
-                <w:id w:val="691331413"/>
+                <w:id w:val="-1457997127"/>
                 <w:dropDownList w:lastValue="Hard">
                   <w:listItem w:displayText="Cakewalk" w:value="Cakewalk"/>
                   <w:listItem w:displayText="Easy" w:value="Easy"/>
@@ -16020,7 +16315,7 @@
               <w:keepLines w:val="1"/>
               <w:numPr>
                 <w:ilvl w:val="0"/>
-                <w:numId w:val="62"/>
+                <w:numId w:val="63"/>
               </w:numPr>
               <w:spacing w:after="0" w:afterAutospacing="0" w:before="240" w:lineRule="auto"/>
               <w:ind w:left="720" w:hanging="360"/>
@@ -16046,7 +16341,7 @@
               <w:keepLines w:val="1"/>
               <w:numPr>
                 <w:ilvl w:val="1"/>
-                <w:numId w:val="62"/>
+                <w:numId w:val="63"/>
               </w:numPr>
               <w:spacing w:after="240" w:before="0" w:beforeAutospacing="0" w:lineRule="auto"/>
               <w:ind w:left="1440" w:hanging="360"/>
@@ -16082,7 +16377,7 @@
             <w:sdt>
               <w:sdtPr>
                 <w:alias w:val="Configuration 1"/>
-                <w:id w:val="-698832579"/>
+                <w:id w:val="1701472235"/>
                 <w:dropDownList w:lastValue="Unknown">
                   <w:listItem w:displayText="Cakewalk" w:value="Cakewalk"/>
                   <w:listItem w:displayText="Easy" w:value="Easy"/>
@@ -16126,7 +16421,7 @@
               <w:keepLines w:val="1"/>
               <w:numPr>
                 <w:ilvl w:val="0"/>
-                <w:numId w:val="85"/>
+                <w:numId w:val="87"/>
               </w:numPr>
               <w:spacing w:after="0" w:afterAutospacing="0" w:before="240" w:lineRule="auto"/>
               <w:ind w:left="720" w:hanging="360"/>
@@ -16152,7 +16447,7 @@
               <w:keepLines w:val="1"/>
               <w:numPr>
                 <w:ilvl w:val="1"/>
-                <w:numId w:val="85"/>
+                <w:numId w:val="87"/>
               </w:numPr>
               <w:spacing w:after="0" w:afterAutospacing="0" w:before="0" w:beforeAutospacing="0" w:lineRule="auto"/>
               <w:ind w:left="1440" w:hanging="360"/>
@@ -16178,7 +16473,7 @@
               <w:keepLines w:val="1"/>
               <w:numPr>
                 <w:ilvl w:val="1"/>
-                <w:numId w:val="85"/>
+                <w:numId w:val="87"/>
               </w:numPr>
               <w:spacing w:after="0" w:afterAutospacing="0" w:before="0" w:beforeAutospacing="0" w:lineRule="auto"/>
               <w:ind w:left="1440" w:hanging="360"/>
@@ -16204,7 +16499,7 @@
               <w:keepLines w:val="1"/>
               <w:numPr>
                 <w:ilvl w:val="1"/>
-                <w:numId w:val="85"/>
+                <w:numId w:val="87"/>
               </w:numPr>
               <w:spacing w:after="0" w:afterAutospacing="0" w:before="0" w:beforeAutospacing="0" w:lineRule="auto"/>
               <w:ind w:left="1440" w:hanging="360"/>
@@ -16230,7 +16525,7 @@
               <w:keepLines w:val="1"/>
               <w:numPr>
                 <w:ilvl w:val="1"/>
-                <w:numId w:val="85"/>
+                <w:numId w:val="87"/>
               </w:numPr>
               <w:spacing w:after="240" w:before="0" w:beforeAutospacing="0" w:lineRule="auto"/>
               <w:ind w:left="1440" w:hanging="360"/>
@@ -16250,16 +16545,16 @@
                 <wp:inline distB="114300" distT="114300" distL="114300" distR="114300">
                   <wp:extent cx="4533179" cy="3087501"/>
                   <wp:effectExtent b="0" l="0" r="0" t="0"/>
-                  <wp:docPr id="6" name="image17.png"/>
+                  <wp:docPr id="1" name="image1.png"/>
                   <a:graphic>
                     <a:graphicData uri="http://schemas.openxmlformats.org/drawingml/2006/picture">
                       <pic:pic>
                         <pic:nvPicPr>
-                          <pic:cNvPr id="0" name="image17.png"/>
+                          <pic:cNvPr id="0" name="image1.png"/>
                           <pic:cNvPicPr preferRelativeResize="0"/>
                         </pic:nvPicPr>
                         <pic:blipFill>
-                          <a:blip r:embed="rId25"/>
+                          <a:blip r:embed="rId26"/>
                           <a:srcRect b="0" l="0" r="0" t="0"/>
                           <a:stretch>
                             <a:fillRect/>
@@ -16301,7 +16596,7 @@
             <w:sdt>
               <w:sdtPr>
                 <w:alias w:val="Configuration 1"/>
-                <w:id w:val="-1529560594"/>
+                <w:id w:val="-1260118415"/>
                 <w:dropDownList w:lastValue="Medium">
                   <w:listItem w:displayText="Cakewalk" w:value="Cakewalk"/>
                   <w:listItem w:displayText="Easy" w:value="Easy"/>
@@ -16407,7 +16702,7 @@
             <w:sdt>
               <w:sdtPr>
                 <w:alias w:val="Configuration 1"/>
-                <w:id w:val="-1907366939"/>
+                <w:id w:val="242937523"/>
                 <w:dropDownList w:lastValue="Easy">
                   <w:listItem w:displayText="Cakewalk" w:value="Cakewalk"/>
                   <w:listItem w:displayText="Easy" w:value="Easy"/>
@@ -16451,7 +16746,7 @@
               <w:keepLines w:val="1"/>
               <w:numPr>
                 <w:ilvl w:val="0"/>
-                <w:numId w:val="77"/>
+                <w:numId w:val="79"/>
               </w:numPr>
               <w:spacing w:after="0" w:afterAutospacing="0" w:before="240" w:lineRule="auto"/>
               <w:ind w:left="720" w:hanging="360"/>
@@ -16477,7 +16772,7 @@
               <w:keepLines w:val="1"/>
               <w:numPr>
                 <w:ilvl w:val="1"/>
-                <w:numId w:val="77"/>
+                <w:numId w:val="79"/>
               </w:numPr>
               <w:spacing w:after="240" w:before="0" w:beforeAutospacing="0" w:lineRule="auto"/>
               <w:ind w:left="1440" w:hanging="360"/>
@@ -16513,7 +16808,7 @@
             <w:sdt>
               <w:sdtPr>
                 <w:alias w:val="Configuration 1"/>
-                <w:id w:val="371179094"/>
+                <w:id w:val="882140056"/>
                 <w:dropDownList w:lastValue="Easy">
                   <w:listItem w:displayText="Cakewalk" w:value="Cakewalk"/>
                   <w:listItem w:displayText="Easy" w:value="Easy"/>
@@ -16557,7 +16852,7 @@
               <w:keepLines w:val="1"/>
               <w:numPr>
                 <w:ilvl w:val="0"/>
-                <w:numId w:val="89"/>
+                <w:numId w:val="91"/>
               </w:numPr>
               <w:spacing w:after="0" w:afterAutospacing="0" w:before="240" w:lineRule="auto"/>
               <w:ind w:left="720" w:hanging="360"/>
@@ -16583,7 +16878,7 @@
               <w:keepLines w:val="1"/>
               <w:numPr>
                 <w:ilvl w:val="1"/>
-                <w:numId w:val="89"/>
+                <w:numId w:val="91"/>
               </w:numPr>
               <w:spacing w:after="0" w:afterAutospacing="0" w:before="0" w:beforeAutospacing="0" w:lineRule="auto"/>
               <w:ind w:left="1440" w:hanging="360"/>
@@ -16609,7 +16904,7 @@
               <w:keepLines w:val="1"/>
               <w:numPr>
                 <w:ilvl w:val="1"/>
-                <w:numId w:val="89"/>
+                <w:numId w:val="91"/>
               </w:numPr>
               <w:spacing w:after="240" w:before="0" w:beforeAutospacing="0" w:lineRule="auto"/>
               <w:ind w:left="1440" w:hanging="360"/>
@@ -16645,7 +16940,7 @@
             <w:sdt>
               <w:sdtPr>
                 <w:alias w:val="Configuration 1"/>
-                <w:id w:val="639008898"/>
+                <w:id w:val="-334546395"/>
                 <w:dropDownList w:lastValue="Medium">
                   <w:listItem w:displayText="Cakewalk" w:value="Cakewalk"/>
                   <w:listItem w:displayText="Easy" w:value="Easy"/>
@@ -16689,7 +16984,7 @@
               <w:keepLines w:val="1"/>
               <w:numPr>
                 <w:ilvl w:val="0"/>
-                <w:numId w:val="73"/>
+                <w:numId w:val="74"/>
               </w:numPr>
               <w:spacing w:after="0" w:afterAutospacing="0" w:before="240" w:lineRule="auto"/>
               <w:ind w:left="720" w:hanging="360"/>
@@ -16715,7 +17010,7 @@
               <w:keepLines w:val="1"/>
               <w:numPr>
                 <w:ilvl w:val="1"/>
-                <w:numId w:val="73"/>
+                <w:numId w:val="74"/>
               </w:numPr>
               <w:spacing w:after="0" w:afterAutospacing="0" w:before="0" w:beforeAutospacing="0" w:lineRule="auto"/>
               <w:ind w:left="1440" w:hanging="360"/>
@@ -16741,7 +17036,7 @@
               <w:keepLines w:val="1"/>
               <w:numPr>
                 <w:ilvl w:val="1"/>
-                <w:numId w:val="73"/>
+                <w:numId w:val="74"/>
               </w:numPr>
               <w:spacing w:after="0" w:afterAutospacing="0" w:before="0" w:beforeAutospacing="0" w:lineRule="auto"/>
               <w:ind w:left="1440" w:hanging="360"/>
@@ -16767,7 +17062,7 @@
               <w:keepLines w:val="1"/>
               <w:numPr>
                 <w:ilvl w:val="1"/>
-                <w:numId w:val="73"/>
+                <w:numId w:val="74"/>
               </w:numPr>
               <w:spacing w:after="240" w:before="0" w:beforeAutospacing="0" w:lineRule="auto"/>
               <w:ind w:left="1440" w:hanging="360"/>
@@ -16803,7 +17098,7 @@
             <w:sdt>
               <w:sdtPr>
                 <w:alias w:val="Configuration 1"/>
-                <w:id w:val="1536122302"/>
+                <w:id w:val="-1412972349"/>
                 <w:dropDownList w:lastValue="Hard">
                   <w:listItem w:displayText="Cakewalk" w:value="Cakewalk"/>
                   <w:listItem w:displayText="Easy" w:value="Easy"/>
@@ -16919,16 +17214,16 @@
                 <wp:inline distB="114300" distT="114300" distL="114300" distR="114300">
                   <wp:extent cx="4480460" cy="2416428"/>
                   <wp:effectExtent b="0" l="0" r="0" t="0"/>
-                  <wp:docPr id="1" name="image3.png"/>
+                  <wp:docPr id="5" name="image4.png"/>
                   <a:graphic>
                     <a:graphicData uri="http://schemas.openxmlformats.org/drawingml/2006/picture">
                       <pic:pic>
                         <pic:nvPicPr>
-                          <pic:cNvPr id="0" name="image3.png"/>
+                          <pic:cNvPr id="0" name="image4.png"/>
                           <pic:cNvPicPr preferRelativeResize="0"/>
                         </pic:nvPicPr>
                         <pic:blipFill>
-                          <a:blip r:embed="rId26"/>
+                          <a:blip r:embed="rId27"/>
                           <a:srcRect b="0" l="0" r="0" t="0"/>
                           <a:stretch>
                             <a:fillRect/>
@@ -16970,7 +17265,7 @@
             <w:sdt>
               <w:sdtPr>
                 <w:alias w:val="Configuration 1"/>
-                <w:id w:val="1477521895"/>
+                <w:id w:val="1823093137"/>
                 <w:dropDownList w:lastValue="Easy">
                   <w:listItem w:displayText="Cakewalk" w:value="Cakewalk"/>
                   <w:listItem w:displayText="Easy" w:value="Easy"/>
@@ -17128,7 +17423,7 @@
             <w:sdt>
               <w:sdtPr>
                 <w:alias w:val="Configuration 1"/>
-                <w:id w:val="1013433740"/>
+                <w:id w:val="-708064799"/>
                 <w:dropDownList w:lastValue="Easy">
                   <w:listItem w:displayText="Cakewalk" w:value="Cakewalk"/>
                   <w:listItem w:displayText="Easy" w:value="Easy"/>
@@ -17260,7 +17555,7 @@
             <w:sdt>
               <w:sdtPr>
                 <w:alias w:val="Configuration 1"/>
-                <w:id w:val="1025081232"/>
+                <w:id w:val="154512475"/>
                 <w:dropDownList w:lastValue="Cakewalk">
                   <w:listItem w:displayText="Cakewalk" w:value="Cakewalk"/>
                   <w:listItem w:displayText="Easy" w:value="Easy"/>
@@ -17392,7 +17687,7 @@
             <w:sdt>
               <w:sdtPr>
                 <w:alias w:val="Configuration 1"/>
-                <w:id w:val="211664645"/>
+                <w:id w:val="114808713"/>
                 <w:dropDownList w:lastValue="Easy">
                   <w:listItem w:displayText="Cakewalk" w:value="Cakewalk"/>
                   <w:listItem w:displayText="Easy" w:value="Easy"/>
@@ -17436,7 +17731,7 @@
               <w:keepLines w:val="1"/>
               <w:numPr>
                 <w:ilvl w:val="0"/>
-                <w:numId w:val="60"/>
+                <w:numId w:val="61"/>
               </w:numPr>
               <w:spacing w:after="0" w:afterAutospacing="0" w:before="240" w:line="240" w:lineRule="auto"/>
               <w:ind w:left="720" w:hanging="360"/>
@@ -17462,7 +17757,7 @@
               <w:keepLines w:val="1"/>
               <w:numPr>
                 <w:ilvl w:val="1"/>
-                <w:numId w:val="60"/>
+                <w:numId w:val="61"/>
               </w:numPr>
               <w:spacing w:after="0" w:afterAutospacing="0" w:before="0" w:beforeAutospacing="0" w:line="240" w:lineRule="auto"/>
               <w:ind w:left="1440" w:hanging="360"/>
@@ -17488,7 +17783,7 @@
               <w:keepLines w:val="1"/>
               <w:numPr>
                 <w:ilvl w:val="1"/>
-                <w:numId w:val="60"/>
+                <w:numId w:val="61"/>
               </w:numPr>
               <w:spacing w:after="240" w:before="0" w:beforeAutospacing="0" w:line="240" w:lineRule="auto"/>
               <w:ind w:left="1440" w:hanging="360"/>
@@ -17524,7 +17819,7 @@
             <w:sdt>
               <w:sdtPr>
                 <w:alias w:val="Configuration 1"/>
-                <w:id w:val="-1760797865"/>
+                <w:id w:val="508940090"/>
                 <w:dropDownList w:lastValue="Cakewalk">
                   <w:listItem w:displayText="Cakewalk" w:value="Cakewalk"/>
                   <w:listItem w:displayText="Easy" w:value="Easy"/>
@@ -17568,7 +17863,7 @@
               <w:keepLines w:val="1"/>
               <w:numPr>
                 <w:ilvl w:val="0"/>
-                <w:numId w:val="69"/>
+                <w:numId w:val="70"/>
               </w:numPr>
               <w:spacing w:after="0" w:afterAutospacing="0" w:before="240" w:line="240" w:lineRule="auto"/>
               <w:ind w:left="720" w:hanging="360"/>
@@ -17594,7 +17889,7 @@
               <w:keepLines w:val="1"/>
               <w:numPr>
                 <w:ilvl w:val="1"/>
-                <w:numId w:val="69"/>
+                <w:numId w:val="70"/>
               </w:numPr>
               <w:spacing w:after="0" w:afterAutospacing="0" w:before="0" w:beforeAutospacing="0" w:line="240" w:lineRule="auto"/>
               <w:ind w:left="1440" w:hanging="360"/>
@@ -17620,7 +17915,7 @@
               <w:keepLines w:val="1"/>
               <w:numPr>
                 <w:ilvl w:val="1"/>
-                <w:numId w:val="69"/>
+                <w:numId w:val="70"/>
               </w:numPr>
               <w:spacing w:after="0" w:afterAutospacing="0" w:before="0" w:beforeAutospacing="0" w:line="240" w:lineRule="auto"/>
               <w:ind w:left="1440" w:hanging="360"/>
@@ -17646,7 +17941,7 @@
               <w:keepLines w:val="1"/>
               <w:numPr>
                 <w:ilvl w:val="1"/>
-                <w:numId w:val="69"/>
+                <w:numId w:val="70"/>
               </w:numPr>
               <w:spacing w:after="240" w:before="0" w:beforeAutospacing="0" w:line="240" w:lineRule="auto"/>
               <w:ind w:left="1440" w:hanging="360"/>
@@ -17682,7 +17977,7 @@
             <w:sdt>
               <w:sdtPr>
                 <w:alias w:val="Configuration 1"/>
-                <w:id w:val="-684281709"/>
+                <w:id w:val="550798276"/>
                 <w:dropDownList w:lastValue="Cakewalk">
                   <w:listItem w:displayText="Cakewalk" w:value="Cakewalk"/>
                   <w:listItem w:displayText="Easy" w:value="Easy"/>
@@ -17772,16 +18067,16 @@
                 <wp:inline distB="114300" distT="114300" distL="114300" distR="114300">
                   <wp:extent cx="3786188" cy="1765996"/>
                   <wp:effectExtent b="0" l="0" r="0" t="0"/>
-                  <wp:docPr id="2" name="image9.png"/>
+                  <wp:docPr id="13" name="image12.png"/>
                   <a:graphic>
                     <a:graphicData uri="http://schemas.openxmlformats.org/drawingml/2006/picture">
                       <pic:pic>
                         <pic:nvPicPr>
-                          <pic:cNvPr id="0" name="image9.png"/>
+                          <pic:cNvPr id="0" name="image12.png"/>
                           <pic:cNvPicPr preferRelativeResize="0"/>
                         </pic:nvPicPr>
                         <pic:blipFill>
-                          <a:blip r:embed="rId27"/>
+                          <a:blip r:embed="rId28"/>
                           <a:srcRect b="0" l="0" r="0" t="0"/>
                           <a:stretch>
                             <a:fillRect/>
@@ -17849,7 +18144,7 @@
             <w:sdt>
               <w:sdtPr>
                 <w:alias w:val="Configuration 1"/>
-                <w:id w:val="494765856"/>
+                <w:id w:val="615462268"/>
                 <w:dropDownList w:lastValue="Easy">
                   <w:listItem w:displayText="Cakewalk" w:value="Cakewalk"/>
                   <w:listItem w:displayText="Easy" w:value="Easy"/>
@@ -17893,7 +18188,7 @@
               <w:keepLines w:val="1"/>
               <w:numPr>
                 <w:ilvl w:val="0"/>
-                <w:numId w:val="65"/>
+                <w:numId w:val="66"/>
               </w:numPr>
               <w:spacing w:after="0" w:afterAutospacing="0" w:before="240" w:lineRule="auto"/>
               <w:ind w:left="720" w:hanging="360"/>
@@ -17919,7 +18214,7 @@
               <w:keepLines w:val="1"/>
               <w:numPr>
                 <w:ilvl w:val="1"/>
-                <w:numId w:val="65"/>
+                <w:numId w:val="66"/>
               </w:numPr>
               <w:spacing w:after="0" w:afterAutospacing="0" w:before="0" w:beforeAutospacing="0" w:lineRule="auto"/>
               <w:ind w:left="1440" w:hanging="360"/>
@@ -17945,7 +18240,7 @@
               <w:keepLines w:val="1"/>
               <w:numPr>
                 <w:ilvl w:val="1"/>
-                <w:numId w:val="65"/>
+                <w:numId w:val="66"/>
               </w:numPr>
               <w:spacing w:after="0" w:afterAutospacing="0" w:before="0" w:beforeAutospacing="0" w:lineRule="auto"/>
               <w:ind w:left="1440" w:hanging="360"/>
@@ -17971,7 +18266,7 @@
               <w:keepLines w:val="1"/>
               <w:numPr>
                 <w:ilvl w:val="1"/>
-                <w:numId w:val="65"/>
+                <w:numId w:val="66"/>
               </w:numPr>
               <w:spacing w:after="0" w:afterAutospacing="0" w:before="0" w:beforeAutospacing="0" w:lineRule="auto"/>
               <w:ind w:left="1440" w:hanging="360"/>
@@ -17997,7 +18292,7 @@
               <w:keepLines w:val="1"/>
               <w:numPr>
                 <w:ilvl w:val="1"/>
-                <w:numId w:val="65"/>
+                <w:numId w:val="66"/>
               </w:numPr>
               <w:spacing w:after="0" w:afterAutospacing="0" w:before="0" w:beforeAutospacing="0" w:lineRule="auto"/>
               <w:ind w:left="1440" w:hanging="360"/>
@@ -18023,7 +18318,7 @@
               <w:keepLines w:val="1"/>
               <w:numPr>
                 <w:ilvl w:val="1"/>
-                <w:numId w:val="65"/>
+                <w:numId w:val="66"/>
               </w:numPr>
               <w:spacing w:after="240" w:before="0" w:beforeAutospacing="0" w:lineRule="auto"/>
               <w:ind w:left="1440" w:hanging="360"/>
@@ -18059,7 +18354,7 @@
             <w:sdt>
               <w:sdtPr>
                 <w:alias w:val="Configuration 1"/>
-                <w:id w:val="2023810627"/>
+                <w:id w:val="-1260832851"/>
                 <w:dropDownList w:lastValue="Hard">
                   <w:listItem w:displayText="Cakewalk" w:value="Cakewalk"/>
                   <w:listItem w:displayText="Easy" w:value="Easy"/>
@@ -18103,7 +18398,7 @@
               <w:keepLines w:val="1"/>
               <w:numPr>
                 <w:ilvl w:val="0"/>
-                <w:numId w:val="65"/>
+                <w:numId w:val="66"/>
               </w:numPr>
               <w:spacing w:after="240" w:before="240" w:lineRule="auto"/>
               <w:ind w:left="720" w:hanging="360"/>
@@ -18139,7 +18434,7 @@
             <w:sdt>
               <w:sdtPr>
                 <w:alias w:val="Configuration 1"/>
-                <w:id w:val="2072745302"/>
+                <w:id w:val="-1695278089"/>
                 <w:dropDownList w:lastValue="Hard">
                   <w:listItem w:displayText="Cakewalk" w:value="Cakewalk"/>
                   <w:listItem w:displayText="Easy" w:value="Easy"/>
@@ -18183,7 +18478,7 @@
               <w:keepLines w:val="1"/>
               <w:numPr>
                 <w:ilvl w:val="0"/>
-                <w:numId w:val="65"/>
+                <w:numId w:val="66"/>
               </w:numPr>
               <w:spacing w:after="0" w:afterAutospacing="0" w:before="240" w:lineRule="auto"/>
               <w:ind w:left="720" w:hanging="360"/>
@@ -18209,7 +18504,7 @@
               <w:keepLines w:val="1"/>
               <w:numPr>
                 <w:ilvl w:val="1"/>
-                <w:numId w:val="65"/>
+                <w:numId w:val="66"/>
               </w:numPr>
               <w:spacing w:after="0" w:afterAutospacing="0" w:before="0" w:beforeAutospacing="0" w:lineRule="auto"/>
               <w:ind w:left="1440" w:hanging="360"/>
@@ -18235,7 +18530,7 @@
               <w:keepLines w:val="1"/>
               <w:numPr>
                 <w:ilvl w:val="1"/>
-                <w:numId w:val="65"/>
+                <w:numId w:val="66"/>
               </w:numPr>
               <w:spacing w:after="0" w:afterAutospacing="0" w:before="0" w:beforeAutospacing="0" w:lineRule="auto"/>
               <w:ind w:left="1440" w:hanging="360"/>
@@ -18261,7 +18556,7 @@
               <w:keepLines w:val="1"/>
               <w:numPr>
                 <w:ilvl w:val="1"/>
-                <w:numId w:val="65"/>
+                <w:numId w:val="66"/>
               </w:numPr>
               <w:spacing w:after="240" w:before="0" w:beforeAutospacing="0" w:lineRule="auto"/>
               <w:ind w:left="1440" w:hanging="360"/>
@@ -18297,7 +18592,7 @@
             <w:sdt>
               <w:sdtPr>
                 <w:alias w:val="Configuration 1"/>
-                <w:id w:val="-1586851023"/>
+                <w:id w:val="984395910"/>
                 <w:dropDownList w:lastValue="Medium">
                   <w:listItem w:displayText="Cakewalk" w:value="Cakewalk"/>
                   <w:listItem w:displayText="Easy" w:value="Easy"/>
@@ -18341,7 +18636,7 @@
               <w:keepLines w:val="1"/>
               <w:numPr>
                 <w:ilvl w:val="0"/>
-                <w:numId w:val="65"/>
+                <w:numId w:val="66"/>
               </w:numPr>
               <w:spacing w:after="0" w:afterAutospacing="0" w:before="240" w:lineRule="auto"/>
               <w:ind w:left="720" w:hanging="360"/>
@@ -18367,7 +18662,7 @@
               <w:keepLines w:val="1"/>
               <w:numPr>
                 <w:ilvl w:val="1"/>
-                <w:numId w:val="65"/>
+                <w:numId w:val="66"/>
               </w:numPr>
               <w:spacing w:after="0" w:afterAutospacing="0" w:before="0" w:beforeAutospacing="0" w:lineRule="auto"/>
               <w:ind w:left="1440" w:hanging="360"/>
@@ -18393,7 +18688,7 @@
               <w:keepLines w:val="1"/>
               <w:numPr>
                 <w:ilvl w:val="1"/>
-                <w:numId w:val="65"/>
+                <w:numId w:val="66"/>
               </w:numPr>
               <w:spacing w:after="0" w:afterAutospacing="0" w:before="0" w:beforeAutospacing="0" w:lineRule="auto"/>
               <w:ind w:left="1440" w:hanging="360"/>
@@ -18419,7 +18714,7 @@
               <w:keepLines w:val="1"/>
               <w:numPr>
                 <w:ilvl w:val="1"/>
-                <w:numId w:val="65"/>
+                <w:numId w:val="66"/>
               </w:numPr>
               <w:spacing w:after="240" w:before="0" w:beforeAutospacing="0" w:lineRule="auto"/>
               <w:ind w:left="1440" w:hanging="360"/>
@@ -18455,7 +18750,7 @@
             <w:sdt>
               <w:sdtPr>
                 <w:alias w:val="Configuration 1"/>
-                <w:id w:val="-108420327"/>
+                <w:id w:val="1804547822"/>
                 <w:dropDownList w:lastValue="Easy">
                   <w:listItem w:displayText="Cakewalk" w:value="Cakewalk"/>
                   <w:listItem w:displayText="Easy" w:value="Easy"/>
@@ -18499,7 +18794,7 @@
               <w:keepLines w:val="1"/>
               <w:numPr>
                 <w:ilvl w:val="0"/>
-                <w:numId w:val="65"/>
+                <w:numId w:val="66"/>
               </w:numPr>
               <w:spacing w:after="0" w:afterAutospacing="0" w:before="240" w:lineRule="auto"/>
               <w:ind w:left="720" w:hanging="360"/>
@@ -18525,7 +18820,7 @@
               <w:keepLines w:val="1"/>
               <w:numPr>
                 <w:ilvl w:val="1"/>
-                <w:numId w:val="65"/>
+                <w:numId w:val="66"/>
               </w:numPr>
               <w:spacing w:after="0" w:afterAutospacing="0" w:before="0" w:beforeAutospacing="0" w:lineRule="auto"/>
               <w:ind w:left="1440" w:hanging="360"/>
@@ -18551,7 +18846,7 @@
               <w:keepLines w:val="1"/>
               <w:numPr>
                 <w:ilvl w:val="1"/>
-                <w:numId w:val="65"/>
+                <w:numId w:val="66"/>
               </w:numPr>
               <w:spacing w:after="0" w:afterAutospacing="0" w:before="0" w:beforeAutospacing="0" w:lineRule="auto"/>
               <w:ind w:left="1440" w:hanging="360"/>
@@ -18577,7 +18872,7 @@
               <w:keepLines w:val="1"/>
               <w:numPr>
                 <w:ilvl w:val="1"/>
-                <w:numId w:val="65"/>
+                <w:numId w:val="66"/>
               </w:numPr>
               <w:spacing w:after="240" w:before="0" w:beforeAutospacing="0" w:lineRule="auto"/>
               <w:ind w:left="1440" w:hanging="360"/>
@@ -18613,7 +18908,7 @@
             <w:sdt>
               <w:sdtPr>
                 <w:alias w:val="Configuration 1"/>
-                <w:id w:val="1701654909"/>
+                <w:id w:val="544027191"/>
                 <w:dropDownList w:lastValue="Medium">
                   <w:listItem w:displayText="Cakewalk" w:value="Cakewalk"/>
                   <w:listItem w:displayText="Easy" w:value="Easy"/>
@@ -18657,7 +18952,7 @@
               <w:keepLines w:val="1"/>
               <w:numPr>
                 <w:ilvl w:val="0"/>
-                <w:numId w:val="65"/>
+                <w:numId w:val="66"/>
               </w:numPr>
               <w:spacing w:after="240" w:before="240" w:lineRule="auto"/>
               <w:ind w:left="720" w:hanging="360"/>
@@ -18693,7 +18988,7 @@
             <w:sdt>
               <w:sdtPr>
                 <w:alias w:val="Configuration 1"/>
-                <w:id w:val="285963314"/>
+                <w:id w:val="-112900824"/>
                 <w:dropDownList w:lastValue="Easy">
                   <w:listItem w:displayText="Cakewalk" w:value="Cakewalk"/>
                   <w:listItem w:displayText="Easy" w:value="Easy"/>
@@ -18737,7 +19032,7 @@
               <w:keepLines w:val="1"/>
               <w:numPr>
                 <w:ilvl w:val="0"/>
-                <w:numId w:val="65"/>
+                <w:numId w:val="66"/>
               </w:numPr>
               <w:spacing w:after="240" w:before="240" w:lineRule="auto"/>
               <w:ind w:left="720" w:hanging="360"/>
@@ -18773,7 +19068,7 @@
             <w:sdt>
               <w:sdtPr>
                 <w:alias w:val="Configuration 1"/>
-                <w:id w:val="-1846235920"/>
+                <w:id w:val="-271138581"/>
                 <w:dropDownList w:lastValue="Cakewalk">
                   <w:listItem w:displayText="Cakewalk" w:value="Cakewalk"/>
                   <w:listItem w:displayText="Easy" w:value="Easy"/>
@@ -18817,7 +19112,7 @@
               <w:keepLines w:val="1"/>
               <w:numPr>
                 <w:ilvl w:val="0"/>
-                <w:numId w:val="65"/>
+                <w:numId w:val="66"/>
               </w:numPr>
               <w:spacing w:after="240" w:before="240" w:lineRule="auto"/>
               <w:ind w:left="720" w:hanging="360"/>
@@ -18853,7 +19148,7 @@
             <w:sdt>
               <w:sdtPr>
                 <w:alias w:val="Configuration 1"/>
-                <w:id w:val="1482661051"/>
+                <w:id w:val="652075034"/>
                 <w:dropDownList w:lastValue="Unknown">
                   <w:listItem w:displayText="Cakewalk" w:value="Cakewalk"/>
                   <w:listItem w:displayText="Easy" w:value="Easy"/>
@@ -18895,7 +19190,7 @@
             <w:pPr>
               <w:numPr>
                 <w:ilvl w:val="0"/>
-                <w:numId w:val="65"/>
+                <w:numId w:val="66"/>
               </w:numPr>
               <w:spacing w:after="60" w:line="240" w:lineRule="auto"/>
               <w:ind w:left="720" w:hanging="360"/>
@@ -18931,7 +19226,7 @@
             <w:sdt>
               <w:sdtPr>
                 <w:alias w:val="Configuration 1"/>
-                <w:id w:val="-2071180589"/>
+                <w:id w:val="-1575447872"/>
                 <w:dropDownList w:lastValue="Medium">
                   <w:listItem w:displayText="Cakewalk" w:value="Cakewalk"/>
                   <w:listItem w:displayText="Easy" w:value="Easy"/>
@@ -18973,7 +19268,7 @@
             <w:pPr>
               <w:numPr>
                 <w:ilvl w:val="0"/>
-                <w:numId w:val="93"/>
+                <w:numId w:val="95"/>
               </w:numPr>
               <w:spacing w:after="60" w:line="240" w:lineRule="auto"/>
               <w:ind w:left="720" w:hanging="360"/>
@@ -19009,7 +19304,7 @@
             <w:sdt>
               <w:sdtPr>
                 <w:alias w:val="Configuration 1"/>
-                <w:id w:val="-390746144"/>
+                <w:id w:val="265258309"/>
                 <w:dropDownList w:lastValue="Hard">
                   <w:listItem w:displayText="Cakewalk" w:value="Cakewalk"/>
                   <w:listItem w:displayText="Easy" w:value="Easy"/>
@@ -19167,7 +19462,7 @@
             <w:sdt>
               <w:sdtPr>
                 <w:alias w:val="Configuration 1"/>
-                <w:id w:val="-1667333702"/>
+                <w:id w:val="-200559794"/>
                 <w:dropDownList w:lastValue="Easy">
                   <w:listItem w:displayText="Cakewalk" w:value="Cakewalk"/>
                   <w:listItem w:displayText="Easy" w:value="Easy"/>
@@ -25403,7 +25698,7 @@
     <w:lvl w:ilvl="1">
       <w:start w:val="1"/>
       <w:numFmt w:val="bullet"/>
-      <w:lvlText w:val="●"/>
+      <w:lvlText w:val="○"/>
       <w:lvlJc w:val="left"/>
       <w:pPr>
         <w:ind w:left="1440" w:hanging="360"/>
@@ -25415,7 +25710,7 @@
     <w:lvl w:ilvl="2">
       <w:start w:val="1"/>
       <w:numFmt w:val="bullet"/>
-      <w:lvlText w:val="●"/>
+      <w:lvlText w:val="■"/>
       <w:lvlJc w:val="left"/>
       <w:pPr>
         <w:ind w:left="2160" w:hanging="360"/>
@@ -25439,7 +25734,7 @@
     <w:lvl w:ilvl="4">
       <w:start w:val="1"/>
       <w:numFmt w:val="bullet"/>
-      <w:lvlText w:val="●"/>
+      <w:lvlText w:val="○"/>
       <w:lvlJc w:val="left"/>
       <w:pPr>
         <w:ind w:left="3600" w:hanging="360"/>
@@ -25451,7 +25746,7 @@
     <w:lvl w:ilvl="5">
       <w:start w:val="1"/>
       <w:numFmt w:val="bullet"/>
-      <w:lvlText w:val="●"/>
+      <w:lvlText w:val="■"/>
       <w:lvlJc w:val="left"/>
       <w:pPr>
         <w:ind w:left="4320" w:hanging="360"/>
@@ -25475,7 +25770,7 @@
     <w:lvl w:ilvl="7">
       <w:start w:val="1"/>
       <w:numFmt w:val="bullet"/>
-      <w:lvlText w:val="●"/>
+      <w:lvlText w:val="○"/>
       <w:lvlJc w:val="left"/>
       <w:pPr>
         <w:ind w:left="5760" w:hanging="360"/>
@@ -25487,7 +25782,7 @@
     <w:lvl w:ilvl="8">
       <w:start w:val="1"/>
       <w:numFmt w:val="bullet"/>
-      <w:lvlText w:val="●"/>
+      <w:lvlText w:val="■"/>
       <w:lvlJc w:val="left"/>
       <w:pPr>
         <w:ind w:left="6480" w:hanging="360"/>
@@ -25513,7 +25808,7 @@
     <w:lvl w:ilvl="1">
       <w:start w:val="1"/>
       <w:numFmt w:val="bullet"/>
-      <w:lvlText w:val="○"/>
+      <w:lvlText w:val="●"/>
       <w:lvlJc w:val="left"/>
       <w:pPr>
         <w:ind w:left="1440" w:hanging="360"/>
@@ -25525,7 +25820,7 @@
     <w:lvl w:ilvl="2">
       <w:start w:val="1"/>
       <w:numFmt w:val="bullet"/>
-      <w:lvlText w:val="■"/>
+      <w:lvlText w:val="●"/>
       <w:lvlJc w:val="left"/>
       <w:pPr>
         <w:ind w:left="2160" w:hanging="360"/>
@@ -25549,7 +25844,7 @@
     <w:lvl w:ilvl="4">
       <w:start w:val="1"/>
       <w:numFmt w:val="bullet"/>
-      <w:lvlText w:val="○"/>
+      <w:lvlText w:val="●"/>
       <w:lvlJc w:val="left"/>
       <w:pPr>
         <w:ind w:left="3600" w:hanging="360"/>
@@ -25561,7 +25856,7 @@
     <w:lvl w:ilvl="5">
       <w:start w:val="1"/>
       <w:numFmt w:val="bullet"/>
-      <w:lvlText w:val="■"/>
+      <w:lvlText w:val="●"/>
       <w:lvlJc w:val="left"/>
       <w:pPr>
         <w:ind w:left="4320" w:hanging="360"/>
@@ -25585,7 +25880,7 @@
     <w:lvl w:ilvl="7">
       <w:start w:val="1"/>
       <w:numFmt w:val="bullet"/>
-      <w:lvlText w:val="○"/>
+      <w:lvlText w:val="●"/>
       <w:lvlJc w:val="left"/>
       <w:pPr>
         <w:ind w:left="5760" w:hanging="360"/>
@@ -25597,7 +25892,7 @@
     <w:lvl w:ilvl="8">
       <w:start w:val="1"/>
       <w:numFmt w:val="bullet"/>
-      <w:lvlText w:val="■"/>
+      <w:lvlText w:val="●"/>
       <w:lvlJc w:val="left"/>
       <w:pPr>
         <w:ind w:left="6480" w:hanging="360"/>
@@ -25843,7 +26138,7 @@
     <w:lvl w:ilvl="1">
       <w:start w:val="1"/>
       <w:numFmt w:val="bullet"/>
-      <w:lvlText w:val="●"/>
+      <w:lvlText w:val="○"/>
       <w:lvlJc w:val="left"/>
       <w:pPr>
         <w:ind w:left="1440" w:hanging="360"/>
@@ -25855,7 +26150,7 @@
     <w:lvl w:ilvl="2">
       <w:start w:val="1"/>
       <w:numFmt w:val="bullet"/>
-      <w:lvlText w:val="●"/>
+      <w:lvlText w:val="■"/>
       <w:lvlJc w:val="left"/>
       <w:pPr>
         <w:ind w:left="2160" w:hanging="360"/>
@@ -25879,7 +26174,7 @@
     <w:lvl w:ilvl="4">
       <w:start w:val="1"/>
       <w:numFmt w:val="bullet"/>
-      <w:lvlText w:val="●"/>
+      <w:lvlText w:val="○"/>
       <w:lvlJc w:val="left"/>
       <w:pPr>
         <w:ind w:left="3600" w:hanging="360"/>
@@ -25891,7 +26186,7 @@
     <w:lvl w:ilvl="5">
       <w:start w:val="1"/>
       <w:numFmt w:val="bullet"/>
-      <w:lvlText w:val="●"/>
+      <w:lvlText w:val="■"/>
       <w:lvlJc w:val="left"/>
       <w:pPr>
         <w:ind w:left="4320" w:hanging="360"/>
@@ -25915,7 +26210,7 @@
     <w:lvl w:ilvl="7">
       <w:start w:val="1"/>
       <w:numFmt w:val="bullet"/>
-      <w:lvlText w:val="●"/>
+      <w:lvlText w:val="○"/>
       <w:lvlJc w:val="left"/>
       <w:pPr>
         <w:ind w:left="5760" w:hanging="360"/>
@@ -25927,7 +26222,7 @@
     <w:lvl w:ilvl="8">
       <w:start w:val="1"/>
       <w:numFmt w:val="bullet"/>
-      <w:lvlText w:val="●"/>
+      <w:lvlText w:val="■"/>
       <w:lvlJc w:val="left"/>
       <w:pPr>
         <w:ind w:left="6480" w:hanging="360"/>
@@ -25953,7 +26248,7 @@
     <w:lvl w:ilvl="1">
       <w:start w:val="1"/>
       <w:numFmt w:val="bullet"/>
-      <w:lvlText w:val="○"/>
+      <w:lvlText w:val="●"/>
       <w:lvlJc w:val="left"/>
       <w:pPr>
         <w:ind w:left="1440" w:hanging="360"/>
@@ -25965,7 +26260,7 @@
     <w:lvl w:ilvl="2">
       <w:start w:val="1"/>
       <w:numFmt w:val="bullet"/>
-      <w:lvlText w:val="■"/>
+      <w:lvlText w:val="●"/>
       <w:lvlJc w:val="left"/>
       <w:pPr>
         <w:ind w:left="2160" w:hanging="360"/>
@@ -25989,7 +26284,7 @@
     <w:lvl w:ilvl="4">
       <w:start w:val="1"/>
       <w:numFmt w:val="bullet"/>
-      <w:lvlText w:val="○"/>
+      <w:lvlText w:val="●"/>
       <w:lvlJc w:val="left"/>
       <w:pPr>
         <w:ind w:left="3600" w:hanging="360"/>
@@ -26001,7 +26296,7 @@
     <w:lvl w:ilvl="5">
       <w:start w:val="1"/>
       <w:numFmt w:val="bullet"/>
-      <w:lvlText w:val="■"/>
+      <w:lvlText w:val="●"/>
       <w:lvlJc w:val="left"/>
       <w:pPr>
         <w:ind w:left="4320" w:hanging="360"/>
@@ -26025,7 +26320,7 @@
     <w:lvl w:ilvl="7">
       <w:start w:val="1"/>
       <w:numFmt w:val="bullet"/>
-      <w:lvlText w:val="○"/>
+      <w:lvlText w:val="●"/>
       <w:lvlJc w:val="left"/>
       <w:pPr>
         <w:ind w:left="5760" w:hanging="360"/>
@@ -26037,7 +26332,7 @@
     <w:lvl w:ilvl="8">
       <w:start w:val="1"/>
       <w:numFmt w:val="bullet"/>
-      <w:lvlText w:val="■"/>
+      <w:lvlText w:val="●"/>
       <w:lvlJc w:val="left"/>
       <w:pPr>
         <w:ind w:left="6480" w:hanging="360"/>
@@ -26393,7 +26688,7 @@
     <w:lvl w:ilvl="1">
       <w:start w:val="1"/>
       <w:numFmt w:val="bullet"/>
-      <w:lvlText w:val="●"/>
+      <w:lvlText w:val="○"/>
       <w:lvlJc w:val="left"/>
       <w:pPr>
         <w:ind w:left="1440" w:hanging="360"/>
@@ -26405,7 +26700,7 @@
     <w:lvl w:ilvl="2">
       <w:start w:val="1"/>
       <w:numFmt w:val="bullet"/>
-      <w:lvlText w:val="●"/>
+      <w:lvlText w:val="■"/>
       <w:lvlJc w:val="left"/>
       <w:pPr>
         <w:ind w:left="2160" w:hanging="360"/>
@@ -26429,7 +26724,7 @@
     <w:lvl w:ilvl="4">
       <w:start w:val="1"/>
       <w:numFmt w:val="bullet"/>
-      <w:lvlText w:val="●"/>
+      <w:lvlText w:val="○"/>
       <w:lvlJc w:val="left"/>
       <w:pPr>
         <w:ind w:left="3600" w:hanging="360"/>
@@ -26441,7 +26736,7 @@
     <w:lvl w:ilvl="5">
       <w:start w:val="1"/>
       <w:numFmt w:val="bullet"/>
-      <w:lvlText w:val="●"/>
+      <w:lvlText w:val="■"/>
       <w:lvlJc w:val="left"/>
       <w:pPr>
         <w:ind w:left="4320" w:hanging="360"/>
@@ -26465,7 +26760,7 @@
     <w:lvl w:ilvl="7">
       <w:start w:val="1"/>
       <w:numFmt w:val="bullet"/>
-      <w:lvlText w:val="●"/>
+      <w:lvlText w:val="○"/>
       <w:lvlJc w:val="left"/>
       <w:pPr>
         <w:ind w:left="5760" w:hanging="360"/>
@@ -26477,7 +26772,7 @@
     <w:lvl w:ilvl="8">
       <w:start w:val="1"/>
       <w:numFmt w:val="bullet"/>
-      <w:lvlText w:val="●"/>
+      <w:lvlText w:val="■"/>
       <w:lvlJc w:val="left"/>
       <w:pPr>
         <w:ind w:left="6480" w:hanging="360"/>
@@ -26503,7 +26798,7 @@
     <w:lvl w:ilvl="1">
       <w:start w:val="1"/>
       <w:numFmt w:val="bullet"/>
-      <w:lvlText w:val="○"/>
+      <w:lvlText w:val="●"/>
       <w:lvlJc w:val="left"/>
       <w:pPr>
         <w:ind w:left="1440" w:hanging="360"/>
@@ -26515,7 +26810,7 @@
     <w:lvl w:ilvl="2">
       <w:start w:val="1"/>
       <w:numFmt w:val="bullet"/>
-      <w:lvlText w:val="■"/>
+      <w:lvlText w:val="●"/>
       <w:lvlJc w:val="left"/>
       <w:pPr>
         <w:ind w:left="2160" w:hanging="360"/>
@@ -26539,7 +26834,7 @@
     <w:lvl w:ilvl="4">
       <w:start w:val="1"/>
       <w:numFmt w:val="bullet"/>
-      <w:lvlText w:val="○"/>
+      <w:lvlText w:val="●"/>
       <w:lvlJc w:val="left"/>
       <w:pPr>
         <w:ind w:left="3600" w:hanging="360"/>
@@ -26551,7 +26846,7 @@
     <w:lvl w:ilvl="5">
       <w:start w:val="1"/>
       <w:numFmt w:val="bullet"/>
-      <w:lvlText w:val="■"/>
+      <w:lvlText w:val="●"/>
       <w:lvlJc w:val="left"/>
       <w:pPr>
         <w:ind w:left="4320" w:hanging="360"/>
@@ -26575,7 +26870,7 @@
     <w:lvl w:ilvl="7">
       <w:start w:val="1"/>
       <w:numFmt w:val="bullet"/>
-      <w:lvlText w:val="○"/>
+      <w:lvlText w:val="●"/>
       <w:lvlJc w:val="left"/>
       <w:pPr>
         <w:ind w:left="5760" w:hanging="360"/>
@@ -26587,7 +26882,7 @@
     <w:lvl w:ilvl="8">
       <w:start w:val="1"/>
       <w:numFmt w:val="bullet"/>
-      <w:lvlText w:val="■"/>
+      <w:lvlText w:val="●"/>
       <w:lvlJc w:val="left"/>
       <w:pPr>
         <w:ind w:left="6480" w:hanging="360"/>
@@ -26943,7 +27238,7 @@
     <w:lvl w:ilvl="1">
       <w:start w:val="1"/>
       <w:numFmt w:val="bullet"/>
-      <w:lvlText w:val="●"/>
+      <w:lvlText w:val="○"/>
       <w:lvlJc w:val="left"/>
       <w:pPr>
         <w:ind w:left="1440" w:hanging="360"/>
@@ -26955,7 +27250,7 @@
     <w:lvl w:ilvl="2">
       <w:start w:val="1"/>
       <w:numFmt w:val="bullet"/>
-      <w:lvlText w:val="●"/>
+      <w:lvlText w:val="■"/>
       <w:lvlJc w:val="left"/>
       <w:pPr>
         <w:ind w:left="2160" w:hanging="360"/>
@@ -26979,7 +27274,7 @@
     <w:lvl w:ilvl="4">
       <w:start w:val="1"/>
       <w:numFmt w:val="bullet"/>
-      <w:lvlText w:val="●"/>
+      <w:lvlText w:val="○"/>
       <w:lvlJc w:val="left"/>
       <w:pPr>
         <w:ind w:left="3600" w:hanging="360"/>
@@ -26991,7 +27286,7 @@
     <w:lvl w:ilvl="5">
       <w:start w:val="1"/>
       <w:numFmt w:val="bullet"/>
-      <w:lvlText w:val="●"/>
+      <w:lvlText w:val="■"/>
       <w:lvlJc w:val="left"/>
       <w:pPr>
         <w:ind w:left="4320" w:hanging="360"/>
@@ -27015,7 +27310,7 @@
     <w:lvl w:ilvl="7">
       <w:start w:val="1"/>
       <w:numFmt w:val="bullet"/>
-      <w:lvlText w:val="●"/>
+      <w:lvlText w:val="○"/>
       <w:lvlJc w:val="left"/>
       <w:pPr>
         <w:ind w:left="5760" w:hanging="360"/>
@@ -27027,7 +27322,7 @@
     <w:lvl w:ilvl="8">
       <w:start w:val="1"/>
       <w:numFmt w:val="bullet"/>
-      <w:lvlText w:val="●"/>
+      <w:lvlText w:val="■"/>
       <w:lvlJc w:val="left"/>
       <w:pPr>
         <w:ind w:left="6480" w:hanging="360"/>
@@ -27053,7 +27348,7 @@
     <w:lvl w:ilvl="1">
       <w:start w:val="1"/>
       <w:numFmt w:val="bullet"/>
-      <w:lvlText w:val="○"/>
+      <w:lvlText w:val="●"/>
       <w:lvlJc w:val="left"/>
       <w:pPr>
         <w:ind w:left="1440" w:hanging="360"/>
@@ -27065,7 +27360,7 @@
     <w:lvl w:ilvl="2">
       <w:start w:val="1"/>
       <w:numFmt w:val="bullet"/>
-      <w:lvlText w:val="■"/>
+      <w:lvlText w:val="●"/>
       <w:lvlJc w:val="left"/>
       <w:pPr>
         <w:ind w:left="2160" w:hanging="360"/>
@@ -27089,7 +27384,7 @@
     <w:lvl w:ilvl="4">
       <w:start w:val="1"/>
       <w:numFmt w:val="bullet"/>
-      <w:lvlText w:val="○"/>
+      <w:lvlText w:val="●"/>
       <w:lvlJc w:val="left"/>
       <w:pPr>
         <w:ind w:left="3600" w:hanging="360"/>
@@ -27101,7 +27396,7 @@
     <w:lvl w:ilvl="5">
       <w:start w:val="1"/>
       <w:numFmt w:val="bullet"/>
-      <w:lvlText w:val="■"/>
+      <w:lvlText w:val="●"/>
       <w:lvlJc w:val="left"/>
       <w:pPr>
         <w:ind w:left="4320" w:hanging="360"/>
@@ -27125,7 +27420,7 @@
     <w:lvl w:ilvl="7">
       <w:start w:val="1"/>
       <w:numFmt w:val="bullet"/>
-      <w:lvlText w:val="○"/>
+      <w:lvlText w:val="●"/>
       <w:lvlJc w:val="left"/>
       <w:pPr>
         <w:ind w:left="5760" w:hanging="360"/>
@@ -27137,7 +27432,7 @@
     <w:lvl w:ilvl="8">
       <w:start w:val="1"/>
       <w:numFmt w:val="bullet"/>
-      <w:lvlText w:val="■"/>
+      <w:lvlText w:val="●"/>
       <w:lvlJc w:val="left"/>
       <w:pPr>
         <w:ind w:left="6480" w:hanging="360"/>
@@ -27273,7 +27568,7 @@
     <w:lvl w:ilvl="1">
       <w:start w:val="1"/>
       <w:numFmt w:val="bullet"/>
-      <w:lvlText w:val="●"/>
+      <w:lvlText w:val="○"/>
       <w:lvlJc w:val="left"/>
       <w:pPr>
         <w:ind w:left="1440" w:hanging="360"/>
@@ -27285,7 +27580,7 @@
     <w:lvl w:ilvl="2">
       <w:start w:val="1"/>
       <w:numFmt w:val="bullet"/>
-      <w:lvlText w:val="●"/>
+      <w:lvlText w:val="■"/>
       <w:lvlJc w:val="left"/>
       <w:pPr>
         <w:ind w:left="2160" w:hanging="360"/>
@@ -27309,7 +27604,7 @@
     <w:lvl w:ilvl="4">
       <w:start w:val="1"/>
       <w:numFmt w:val="bullet"/>
-      <w:lvlText w:val="●"/>
+      <w:lvlText w:val="○"/>
       <w:lvlJc w:val="left"/>
       <w:pPr>
         <w:ind w:left="3600" w:hanging="360"/>
@@ -27321,7 +27616,7 @@
     <w:lvl w:ilvl="5">
       <w:start w:val="1"/>
       <w:numFmt w:val="bullet"/>
-      <w:lvlText w:val="●"/>
+      <w:lvlText w:val="■"/>
       <w:lvlJc w:val="left"/>
       <w:pPr>
         <w:ind w:left="4320" w:hanging="360"/>
@@ -27345,7 +27640,7 @@
     <w:lvl w:ilvl="7">
       <w:start w:val="1"/>
       <w:numFmt w:val="bullet"/>
-      <w:lvlText w:val="●"/>
+      <w:lvlText w:val="○"/>
       <w:lvlJc w:val="left"/>
       <w:pPr>
         <w:ind w:left="5760" w:hanging="360"/>
@@ -27357,7 +27652,7 @@
     <w:lvl w:ilvl="8">
       <w:start w:val="1"/>
       <w:numFmt w:val="bullet"/>
-      <w:lvlText w:val="●"/>
+      <w:lvlText w:val="■"/>
       <w:lvlJc w:val="left"/>
       <w:pPr>
         <w:ind w:left="6480" w:hanging="360"/>
@@ -27383,7 +27678,7 @@
     <w:lvl w:ilvl="1">
       <w:start w:val="1"/>
       <w:numFmt w:val="bullet"/>
-      <w:lvlText w:val="○"/>
+      <w:lvlText w:val="●"/>
       <w:lvlJc w:val="left"/>
       <w:pPr>
         <w:ind w:left="1440" w:hanging="360"/>
@@ -27395,7 +27690,7 @@
     <w:lvl w:ilvl="2">
       <w:start w:val="1"/>
       <w:numFmt w:val="bullet"/>
-      <w:lvlText w:val="■"/>
+      <w:lvlText w:val="●"/>
       <w:lvlJc w:val="left"/>
       <w:pPr>
         <w:ind w:left="2160" w:hanging="360"/>
@@ -27419,7 +27714,7 @@
     <w:lvl w:ilvl="4">
       <w:start w:val="1"/>
       <w:numFmt w:val="bullet"/>
-      <w:lvlText w:val="○"/>
+      <w:lvlText w:val="●"/>
       <w:lvlJc w:val="left"/>
       <w:pPr>
         <w:ind w:left="3600" w:hanging="360"/>
@@ -27431,7 +27726,7 @@
     <w:lvl w:ilvl="5">
       <w:start w:val="1"/>
       <w:numFmt w:val="bullet"/>
-      <w:lvlText w:val="■"/>
+      <w:lvlText w:val="●"/>
       <w:lvlJc w:val="left"/>
       <w:pPr>
         <w:ind w:left="4320" w:hanging="360"/>
@@ -27455,7 +27750,7 @@
     <w:lvl w:ilvl="7">
       <w:start w:val="1"/>
       <w:numFmt w:val="bullet"/>
-      <w:lvlText w:val="○"/>
+      <w:lvlText w:val="●"/>
       <w:lvlJc w:val="left"/>
       <w:pPr>
         <w:ind w:left="5760" w:hanging="360"/>
@@ -27467,7 +27762,7 @@
     <w:lvl w:ilvl="8">
       <w:start w:val="1"/>
       <w:numFmt w:val="bullet"/>
-      <w:lvlText w:val="■"/>
+      <w:lvlText w:val="●"/>
       <w:lvlJc w:val="left"/>
       <w:pPr>
         <w:ind w:left="6480" w:hanging="360"/>
@@ -27493,7 +27788,7 @@
     <w:lvl w:ilvl="1">
       <w:start w:val="1"/>
       <w:numFmt w:val="bullet"/>
-      <w:lvlText w:val="●"/>
+      <w:lvlText w:val="○"/>
       <w:lvlJc w:val="left"/>
       <w:pPr>
         <w:ind w:left="1440" w:hanging="360"/>
@@ -27505,7 +27800,7 @@
     <w:lvl w:ilvl="2">
       <w:start w:val="1"/>
       <w:numFmt w:val="bullet"/>
-      <w:lvlText w:val="●"/>
+      <w:lvlText w:val="■"/>
       <w:lvlJc w:val="left"/>
       <w:pPr>
         <w:ind w:left="2160" w:hanging="360"/>
@@ -27529,7 +27824,7 @@
     <w:lvl w:ilvl="4">
       <w:start w:val="1"/>
       <w:numFmt w:val="bullet"/>
-      <w:lvlText w:val="●"/>
+      <w:lvlText w:val="○"/>
       <w:lvlJc w:val="left"/>
       <w:pPr>
         <w:ind w:left="3600" w:hanging="360"/>
@@ -27541,7 +27836,7 @@
     <w:lvl w:ilvl="5">
       <w:start w:val="1"/>
       <w:numFmt w:val="bullet"/>
-      <w:lvlText w:val="●"/>
+      <w:lvlText w:val="■"/>
       <w:lvlJc w:val="left"/>
       <w:pPr>
         <w:ind w:left="4320" w:hanging="360"/>
@@ -27565,7 +27860,7 @@
     <w:lvl w:ilvl="7">
       <w:start w:val="1"/>
       <w:numFmt w:val="bullet"/>
-      <w:lvlText w:val="●"/>
+      <w:lvlText w:val="○"/>
       <w:lvlJc w:val="left"/>
       <w:pPr>
         <w:ind w:left="5760" w:hanging="360"/>
@@ -27577,7 +27872,7 @@
     <w:lvl w:ilvl="8">
       <w:start w:val="1"/>
       <w:numFmt w:val="bullet"/>
-      <w:lvlText w:val="●"/>
+      <w:lvlText w:val="■"/>
       <w:lvlJc w:val="left"/>
       <w:pPr>
         <w:ind w:left="6480" w:hanging="360"/>
@@ -27713,7 +28008,7 @@
     <w:lvl w:ilvl="1">
       <w:start w:val="1"/>
       <w:numFmt w:val="bullet"/>
-      <w:lvlText w:val="○"/>
+      <w:lvlText w:val="●"/>
       <w:lvlJc w:val="left"/>
       <w:pPr>
         <w:ind w:left="1440" w:hanging="360"/>
@@ -27725,7 +28020,7 @@
     <w:lvl w:ilvl="2">
       <w:start w:val="1"/>
       <w:numFmt w:val="bullet"/>
-      <w:lvlText w:val="■"/>
+      <w:lvlText w:val="●"/>
       <w:lvlJc w:val="left"/>
       <w:pPr>
         <w:ind w:left="2160" w:hanging="360"/>
@@ -27749,7 +28044,7 @@
     <w:lvl w:ilvl="4">
       <w:start w:val="1"/>
       <w:numFmt w:val="bullet"/>
-      <w:lvlText w:val="○"/>
+      <w:lvlText w:val="●"/>
       <w:lvlJc w:val="left"/>
       <w:pPr>
         <w:ind w:left="3600" w:hanging="360"/>
@@ -27761,7 +28056,7 @@
     <w:lvl w:ilvl="5">
       <w:start w:val="1"/>
       <w:numFmt w:val="bullet"/>
-      <w:lvlText w:val="■"/>
+      <w:lvlText w:val="●"/>
       <w:lvlJc w:val="left"/>
       <w:pPr>
         <w:ind w:left="4320" w:hanging="360"/>
@@ -27785,7 +28080,7 @@
     <w:lvl w:ilvl="7">
       <w:start w:val="1"/>
       <w:numFmt w:val="bullet"/>
-      <w:lvlText w:val="○"/>
+      <w:lvlText w:val="●"/>
       <w:lvlJc w:val="left"/>
       <w:pPr>
         <w:ind w:left="5760" w:hanging="360"/>
@@ -27797,7 +28092,7 @@
     <w:lvl w:ilvl="8">
       <w:start w:val="1"/>
       <w:numFmt w:val="bullet"/>
-      <w:lvlText w:val="■"/>
+      <w:lvlText w:val="●"/>
       <w:lvlJc w:val="left"/>
       <w:pPr>
         <w:ind w:left="6480" w:hanging="360"/>
@@ -28153,7 +28448,7 @@
     <w:lvl w:ilvl="1">
       <w:start w:val="1"/>
       <w:numFmt w:val="bullet"/>
-      <w:lvlText w:val="●"/>
+      <w:lvlText w:val="○"/>
       <w:lvlJc w:val="left"/>
       <w:pPr>
         <w:ind w:left="1440" w:hanging="360"/>
@@ -28165,7 +28460,7 @@
     <w:lvl w:ilvl="2">
       <w:start w:val="1"/>
       <w:numFmt w:val="bullet"/>
-      <w:lvlText w:val="●"/>
+      <w:lvlText w:val="■"/>
       <w:lvlJc w:val="left"/>
       <w:pPr>
         <w:ind w:left="2160" w:hanging="360"/>
@@ -28189,7 +28484,7 @@
     <w:lvl w:ilvl="4">
       <w:start w:val="1"/>
       <w:numFmt w:val="bullet"/>
-      <w:lvlText w:val="●"/>
+      <w:lvlText w:val="○"/>
       <w:lvlJc w:val="left"/>
       <w:pPr>
         <w:ind w:left="3600" w:hanging="360"/>
@@ -28201,7 +28496,7 @@
     <w:lvl w:ilvl="5">
       <w:start w:val="1"/>
       <w:numFmt w:val="bullet"/>
-      <w:lvlText w:val="●"/>
+      <w:lvlText w:val="■"/>
       <w:lvlJc w:val="left"/>
       <w:pPr>
         <w:ind w:left="4320" w:hanging="360"/>
@@ -28225,7 +28520,7 @@
     <w:lvl w:ilvl="7">
       <w:start w:val="1"/>
       <w:numFmt w:val="bullet"/>
-      <w:lvlText w:val="●"/>
+      <w:lvlText w:val="○"/>
       <w:lvlJc w:val="left"/>
       <w:pPr>
         <w:ind w:left="5760" w:hanging="360"/>
@@ -28237,7 +28532,7 @@
     <w:lvl w:ilvl="8">
       <w:start w:val="1"/>
       <w:numFmt w:val="bullet"/>
-      <w:lvlText w:val="●"/>
+      <w:lvlText w:val="■"/>
       <w:lvlJc w:val="left"/>
       <w:pPr>
         <w:ind w:left="6480" w:hanging="360"/>
@@ -28593,7 +28888,7 @@
     <w:lvl w:ilvl="1">
       <w:start w:val="1"/>
       <w:numFmt w:val="bullet"/>
-      <w:lvlText w:val="○"/>
+      <w:lvlText w:val="●"/>
       <w:lvlJc w:val="left"/>
       <w:pPr>
         <w:ind w:left="1440" w:hanging="360"/>
@@ -28605,7 +28900,7 @@
     <w:lvl w:ilvl="2">
       <w:start w:val="1"/>
       <w:numFmt w:val="bullet"/>
-      <w:lvlText w:val="■"/>
+      <w:lvlText w:val="●"/>
       <w:lvlJc w:val="left"/>
       <w:pPr>
         <w:ind w:left="2160" w:hanging="360"/>
@@ -28629,7 +28924,7 @@
     <w:lvl w:ilvl="4">
       <w:start w:val="1"/>
       <w:numFmt w:val="bullet"/>
-      <w:lvlText w:val="○"/>
+      <w:lvlText w:val="●"/>
       <w:lvlJc w:val="left"/>
       <w:pPr>
         <w:ind w:left="3600" w:hanging="360"/>
@@ -28641,7 +28936,7 @@
     <w:lvl w:ilvl="5">
       <w:start w:val="1"/>
       <w:numFmt w:val="bullet"/>
-      <w:lvlText w:val="■"/>
+      <w:lvlText w:val="●"/>
       <w:lvlJc w:val="left"/>
       <w:pPr>
         <w:ind w:left="4320" w:hanging="360"/>
@@ -28665,7 +28960,7 @@
     <w:lvl w:ilvl="7">
       <w:start w:val="1"/>
       <w:numFmt w:val="bullet"/>
-      <w:lvlText w:val="○"/>
+      <w:lvlText w:val="●"/>
       <w:lvlJc w:val="left"/>
       <w:pPr>
         <w:ind w:left="5760" w:hanging="360"/>
@@ -28677,7 +28972,7 @@
     <w:lvl w:ilvl="8">
       <w:start w:val="1"/>
       <w:numFmt w:val="bullet"/>
-      <w:lvlText w:val="■"/>
+      <w:lvlText w:val="●"/>
       <w:lvlJc w:val="left"/>
       <w:pPr>
         <w:ind w:left="6480" w:hanging="360"/>
@@ -29678,6 +29973,226 @@
     </w:lvl>
   </w:abstractNum>
   <w:abstractNum w:abstractNumId="96">
+    <w:lvl w:ilvl="0">
+      <w:start w:val="1"/>
+      <w:numFmt w:val="bullet"/>
+      <w:lvlText w:val="●"/>
+      <w:lvlJc w:val="left"/>
+      <w:pPr>
+        <w:ind w:left="720" w:hanging="360"/>
+      </w:pPr>
+      <w:rPr>
+        <w:u w:val="none"/>
+      </w:rPr>
+    </w:lvl>
+    <w:lvl w:ilvl="1">
+      <w:start w:val="1"/>
+      <w:numFmt w:val="bullet"/>
+      <w:lvlText w:val="○"/>
+      <w:lvlJc w:val="left"/>
+      <w:pPr>
+        <w:ind w:left="1440" w:hanging="360"/>
+      </w:pPr>
+      <w:rPr>
+        <w:u w:val="none"/>
+      </w:rPr>
+    </w:lvl>
+    <w:lvl w:ilvl="2">
+      <w:start w:val="1"/>
+      <w:numFmt w:val="bullet"/>
+      <w:lvlText w:val="■"/>
+      <w:lvlJc w:val="left"/>
+      <w:pPr>
+        <w:ind w:left="2160" w:hanging="360"/>
+      </w:pPr>
+      <w:rPr>
+        <w:u w:val="none"/>
+      </w:rPr>
+    </w:lvl>
+    <w:lvl w:ilvl="3">
+      <w:start w:val="1"/>
+      <w:numFmt w:val="bullet"/>
+      <w:lvlText w:val="●"/>
+      <w:lvlJc w:val="left"/>
+      <w:pPr>
+        <w:ind w:left="2880" w:hanging="360"/>
+      </w:pPr>
+      <w:rPr>
+        <w:u w:val="none"/>
+      </w:rPr>
+    </w:lvl>
+    <w:lvl w:ilvl="4">
+      <w:start w:val="1"/>
+      <w:numFmt w:val="bullet"/>
+      <w:lvlText w:val="○"/>
+      <w:lvlJc w:val="left"/>
+      <w:pPr>
+        <w:ind w:left="3600" w:hanging="360"/>
+      </w:pPr>
+      <w:rPr>
+        <w:u w:val="none"/>
+      </w:rPr>
+    </w:lvl>
+    <w:lvl w:ilvl="5">
+      <w:start w:val="1"/>
+      <w:numFmt w:val="bullet"/>
+      <w:lvlText w:val="■"/>
+      <w:lvlJc w:val="left"/>
+      <w:pPr>
+        <w:ind w:left="4320" w:hanging="360"/>
+      </w:pPr>
+      <w:rPr>
+        <w:u w:val="none"/>
+      </w:rPr>
+    </w:lvl>
+    <w:lvl w:ilvl="6">
+      <w:start w:val="1"/>
+      <w:numFmt w:val="bullet"/>
+      <w:lvlText w:val="●"/>
+      <w:lvlJc w:val="left"/>
+      <w:pPr>
+        <w:ind w:left="5040" w:hanging="360"/>
+      </w:pPr>
+      <w:rPr>
+        <w:u w:val="none"/>
+      </w:rPr>
+    </w:lvl>
+    <w:lvl w:ilvl="7">
+      <w:start w:val="1"/>
+      <w:numFmt w:val="bullet"/>
+      <w:lvlText w:val="○"/>
+      <w:lvlJc w:val="left"/>
+      <w:pPr>
+        <w:ind w:left="5760" w:hanging="360"/>
+      </w:pPr>
+      <w:rPr>
+        <w:u w:val="none"/>
+      </w:rPr>
+    </w:lvl>
+    <w:lvl w:ilvl="8">
+      <w:start w:val="1"/>
+      <w:numFmt w:val="bullet"/>
+      <w:lvlText w:val="■"/>
+      <w:lvlJc w:val="left"/>
+      <w:pPr>
+        <w:ind w:left="6480" w:hanging="360"/>
+      </w:pPr>
+      <w:rPr>
+        <w:u w:val="none"/>
+      </w:rPr>
+    </w:lvl>
+  </w:abstractNum>
+  <w:abstractNum w:abstractNumId="97">
+    <w:lvl w:ilvl="0">
+      <w:start w:val="1"/>
+      <w:numFmt w:val="bullet"/>
+      <w:lvlText w:val="●"/>
+      <w:lvlJc w:val="left"/>
+      <w:pPr>
+        <w:ind w:left="720" w:hanging="360"/>
+      </w:pPr>
+      <w:rPr>
+        <w:u w:val="none"/>
+      </w:rPr>
+    </w:lvl>
+    <w:lvl w:ilvl="1">
+      <w:start w:val="1"/>
+      <w:numFmt w:val="bullet"/>
+      <w:lvlText w:val="○"/>
+      <w:lvlJc w:val="left"/>
+      <w:pPr>
+        <w:ind w:left="1440" w:hanging="360"/>
+      </w:pPr>
+      <w:rPr>
+        <w:u w:val="none"/>
+      </w:rPr>
+    </w:lvl>
+    <w:lvl w:ilvl="2">
+      <w:start w:val="1"/>
+      <w:numFmt w:val="bullet"/>
+      <w:lvlText w:val="■"/>
+      <w:lvlJc w:val="left"/>
+      <w:pPr>
+        <w:ind w:left="2160" w:hanging="360"/>
+      </w:pPr>
+      <w:rPr>
+        <w:u w:val="none"/>
+      </w:rPr>
+    </w:lvl>
+    <w:lvl w:ilvl="3">
+      <w:start w:val="1"/>
+      <w:numFmt w:val="bullet"/>
+      <w:lvlText w:val="●"/>
+      <w:lvlJc w:val="left"/>
+      <w:pPr>
+        <w:ind w:left="2880" w:hanging="360"/>
+      </w:pPr>
+      <w:rPr>
+        <w:u w:val="none"/>
+      </w:rPr>
+    </w:lvl>
+    <w:lvl w:ilvl="4">
+      <w:start w:val="1"/>
+      <w:numFmt w:val="bullet"/>
+      <w:lvlText w:val="○"/>
+      <w:lvlJc w:val="left"/>
+      <w:pPr>
+        <w:ind w:left="3600" w:hanging="360"/>
+      </w:pPr>
+      <w:rPr>
+        <w:u w:val="none"/>
+      </w:rPr>
+    </w:lvl>
+    <w:lvl w:ilvl="5">
+      <w:start w:val="1"/>
+      <w:numFmt w:val="bullet"/>
+      <w:lvlText w:val="■"/>
+      <w:lvlJc w:val="left"/>
+      <w:pPr>
+        <w:ind w:left="4320" w:hanging="360"/>
+      </w:pPr>
+      <w:rPr>
+        <w:u w:val="none"/>
+      </w:rPr>
+    </w:lvl>
+    <w:lvl w:ilvl="6">
+      <w:start w:val="1"/>
+      <w:numFmt w:val="bullet"/>
+      <w:lvlText w:val="●"/>
+      <w:lvlJc w:val="left"/>
+      <w:pPr>
+        <w:ind w:left="5040" w:hanging="360"/>
+      </w:pPr>
+      <w:rPr>
+        <w:u w:val="none"/>
+      </w:rPr>
+    </w:lvl>
+    <w:lvl w:ilvl="7">
+      <w:start w:val="1"/>
+      <w:numFmt w:val="bullet"/>
+      <w:lvlText w:val="○"/>
+      <w:lvlJc w:val="left"/>
+      <w:pPr>
+        <w:ind w:left="5760" w:hanging="360"/>
+      </w:pPr>
+      <w:rPr>
+        <w:u w:val="none"/>
+      </w:rPr>
+    </w:lvl>
+    <w:lvl w:ilvl="8">
+      <w:start w:val="1"/>
+      <w:numFmt w:val="bullet"/>
+      <w:lvlText w:val="■"/>
+      <w:lvlJc w:val="left"/>
+      <w:pPr>
+        <w:ind w:left="6480" w:hanging="360"/>
+      </w:pPr>
+      <w:rPr>
+        <w:u w:val="none"/>
+      </w:rPr>
+    </w:lvl>
+  </w:abstractNum>
+  <w:abstractNum w:abstractNumId="98">
     <w:lvl w:ilvl="0">
       <w:start w:val="1"/>
       <w:numFmt w:val="bullet"/>
@@ -30074,6 +30589,12 @@
   </w:num>
   <w:num w:numId="96">
     <w:abstractNumId w:val="96"/>
+  </w:num>
+  <w:num w:numId="97">
+    <w:abstractNumId w:val="97"/>
+  </w:num>
+  <w:num w:numId="98">
+    <w:abstractNumId w:val="98"/>
   </w:num>
 </w:numbering>
 </file>

</xml_diff>